<commit_message>
chore: save MIREA repository excluding generated large files
</commit_message>
<xml_diff>
--- a/4/ППОИС/ППОИС_2_АлбахтинИВ.docx
+++ b/4/ППОИС/ППОИС_2_АлбахтинИВ.docx
@@ -22,6 +22,7 @@
         <w:tc>
           <w:tcPr>
             <w:tcW w:w="5000" w:type="pct"/>
+            <w:shd w:val="nil"/>
             <w:hideMark/>
           </w:tcPr>
           <w:p>
@@ -124,6 +125,7 @@
         <w:tc>
           <w:tcPr>
             <w:tcW w:w="5000" w:type="pct"/>
+            <w:shd w:val="nil"/>
             <w:hideMark/>
           </w:tcPr>
           <w:p>
@@ -669,6 +671,7 @@
         <w:tc>
           <w:tcPr>
             <w:tcW w:w="2547" w:type="dxa"/>
+            <w:shd w:val="nil"/>
           </w:tcPr>
           <w:p>
             <w:pPr>
@@ -713,6 +716,7 @@
         <w:tc>
           <w:tcPr>
             <w:tcW w:w="4819" w:type="dxa"/>
+            <w:shd w:val="nil"/>
           </w:tcPr>
           <w:p>
             <w:pPr>
@@ -782,6 +786,7 @@
           <w:tcPr>
             <w:tcW w:w="1666" w:type="dxa"/>
             <w:gridSpan w:val="2"/>
+            <w:shd w:val="nil"/>
           </w:tcPr>
           <w:p>
             <w:pPr>
@@ -849,6 +854,7 @@
         <w:tc>
           <w:tcPr>
             <w:tcW w:w="2547" w:type="dxa"/>
+            <w:shd w:val="nil"/>
           </w:tcPr>
           <w:p>
             <w:pPr>
@@ -893,6 +899,7 @@
         <w:tc>
           <w:tcPr>
             <w:tcW w:w="4819" w:type="dxa"/>
+            <w:shd w:val="nil"/>
           </w:tcPr>
           <w:p>
             <w:pPr>
@@ -939,6 +946,7 @@
           <w:tcPr>
             <w:tcW w:w="1666" w:type="dxa"/>
             <w:gridSpan w:val="2"/>
+            <w:shd w:val="nil"/>
           </w:tcPr>
           <w:p>
             <w:pPr>
@@ -1020,6 +1028,7 @@
         <w:tc>
           <w:tcPr>
             <w:tcW w:w="2547" w:type="dxa"/>
+            <w:shd w:val="nil"/>
           </w:tcPr>
           <w:p>
             <w:pPr>
@@ -1041,6 +1050,7 @@
           <w:tcPr>
             <w:tcW w:w="5925" w:type="dxa"/>
             <w:gridSpan w:val="2"/>
+            <w:shd w:val="nil"/>
           </w:tcPr>
           <w:p>
             <w:pPr>
@@ -1062,6 +1072,7 @@
           <w:tcPr>
             <w:tcW w:w="1666" w:type="dxa"/>
             <w:gridSpan w:val="2"/>
+            <w:shd w:val="nil"/>
           </w:tcPr>
           <w:p>
             <w:pPr>
@@ -1222,10 +1233,14 @@
           <w:lang w:eastAsia="zh-CN" w:bidi="hi-IN"/>
         </w:rPr>
         <w:sectPr>
+          <w:headerReference w:type="default" r:id="rId19"/>
+          <w:footerReference w:type="default" r:id="rId20"/>
+          <w:footerReference w:type="first" r:id="rId21"/>
           <w:type w:val="continuous"/>
-          <w:pgSz w:w="11911" w:h="16841" w:code="9"/>
-          <w:pgMar w:top="1134" w:right="850" w:bottom="1134" w:left="1701" w:header="720" w:footer="720" w:gutter="0"/>
+          <w:pgSz w:w="11906" w:h="16838" w:code="9"/>
+          <w:pgMar w:top="1134" w:right="850" w:bottom="1134" w:left="1701" w:header="720" w:footer="567" w:gutter="0"/>
           <w:cols w:space="720"/>
+          <w:titlePg/>
           <w:docGrid w:linePitch="381"/>
         </w:sectPr>
       </w:pPr>
@@ -1491,6 +1506,7 @@
         <w:tc>
           <w:tcPr>
             <w:tcW w:type="dxa" w:w="624"/>
+            <w:shd w:val="nil"/>
             <w:vAlign w:val="center"/>
             <w:tcMar>
               <w:top w:w="80" w:type="dxa"/>
@@ -1520,6 +1536,7 @@
         <w:tc>
           <w:tcPr>
             <w:tcW w:type="dxa" w:w="4082"/>
+            <w:shd w:val="nil"/>
             <w:vAlign w:val="center"/>
             <w:tcMar>
               <w:top w:w="80" w:type="dxa"/>
@@ -1549,6 +1566,7 @@
         <w:tc>
           <w:tcPr>
             <w:tcW w:type="dxa" w:w="4649"/>
+            <w:shd w:val="nil"/>
             <w:vAlign w:val="center"/>
             <w:tcMar>
               <w:top w:w="80" w:type="dxa"/>
@@ -1583,6 +1601,7 @@
         <w:tc>
           <w:tcPr>
             <w:tcW w:type="dxa" w:w="624"/>
+            <w:shd w:val="nil"/>
             <w:vAlign w:val="center"/>
             <w:tcMar>
               <w:top w:w="80" w:type="dxa"/>
@@ -1612,6 +1631,7 @@
         <w:tc>
           <w:tcPr>
             <w:tcW w:type="dxa" w:w="4082"/>
+            <w:shd w:val="nil"/>
             <w:vAlign w:val="center"/>
             <w:tcMar>
               <w:top w:w="80" w:type="dxa"/>
@@ -1641,6 +1661,7 @@
         <w:tc>
           <w:tcPr>
             <w:tcW w:type="dxa" w:w="4649"/>
+            <w:shd w:val="nil"/>
             <w:vAlign w:val="center"/>
             <w:tcMar>
               <w:top w:w="80" w:type="dxa"/>
@@ -1675,6 +1696,7 @@
         <w:tc>
           <w:tcPr>
             <w:tcW w:type="dxa" w:w="624"/>
+            <w:shd w:val="nil"/>
             <w:vAlign w:val="center"/>
             <w:tcMar>
               <w:top w:w="80" w:type="dxa"/>
@@ -1704,6 +1726,7 @@
         <w:tc>
           <w:tcPr>
             <w:tcW w:type="dxa" w:w="4082"/>
+            <w:shd w:val="nil"/>
             <w:vAlign w:val="center"/>
             <w:tcMar>
               <w:top w:w="80" w:type="dxa"/>
@@ -1733,6 +1756,7 @@
         <w:tc>
           <w:tcPr>
             <w:tcW w:type="dxa" w:w="4649"/>
+            <w:shd w:val="nil"/>
             <w:vAlign w:val="center"/>
             <w:tcMar>
               <w:top w:w="80" w:type="dxa"/>
@@ -1767,6 +1791,7 @@
         <w:tc>
           <w:tcPr>
             <w:tcW w:type="dxa" w:w="624"/>
+            <w:shd w:val="nil"/>
             <w:vAlign w:val="center"/>
             <w:tcMar>
               <w:top w:w="80" w:type="dxa"/>
@@ -1796,6 +1821,7 @@
         <w:tc>
           <w:tcPr>
             <w:tcW w:type="dxa" w:w="4082"/>
+            <w:shd w:val="nil"/>
             <w:vAlign w:val="center"/>
             <w:tcMar>
               <w:top w:w="80" w:type="dxa"/>
@@ -1825,6 +1851,7 @@
         <w:tc>
           <w:tcPr>
             <w:tcW w:type="dxa" w:w="4649"/>
+            <w:shd w:val="nil"/>
             <w:vAlign w:val="center"/>
             <w:tcMar>
               <w:top w:w="80" w:type="dxa"/>
@@ -1859,6 +1886,7 @@
         <w:tc>
           <w:tcPr>
             <w:tcW w:type="dxa" w:w="624"/>
+            <w:shd w:val="nil"/>
             <w:vAlign w:val="center"/>
             <w:tcMar>
               <w:top w:w="80" w:type="dxa"/>
@@ -1888,6 +1916,7 @@
         <w:tc>
           <w:tcPr>
             <w:tcW w:type="dxa" w:w="4082"/>
+            <w:shd w:val="nil"/>
             <w:vAlign w:val="center"/>
             <w:tcMar>
               <w:top w:w="80" w:type="dxa"/>
@@ -1917,6 +1946,7 @@
         <w:tc>
           <w:tcPr>
             <w:tcW w:type="dxa" w:w="4649"/>
+            <w:shd w:val="nil"/>
             <w:vAlign w:val="center"/>
             <w:tcMar>
               <w:top w:w="80" w:type="dxa"/>
@@ -1951,6 +1981,7 @@
         <w:tc>
           <w:tcPr>
             <w:tcW w:type="dxa" w:w="624"/>
+            <w:shd w:val="nil"/>
             <w:vAlign w:val="center"/>
             <w:tcMar>
               <w:top w:w="80" w:type="dxa"/>
@@ -1980,6 +2011,7 @@
         <w:tc>
           <w:tcPr>
             <w:tcW w:type="dxa" w:w="4082"/>
+            <w:shd w:val="nil"/>
             <w:vAlign w:val="center"/>
             <w:tcMar>
               <w:top w:w="80" w:type="dxa"/>
@@ -2009,6 +2041,7 @@
         <w:tc>
           <w:tcPr>
             <w:tcW w:type="dxa" w:w="4649"/>
+            <w:shd w:val="nil"/>
             <w:vAlign w:val="center"/>
             <w:tcMar>
               <w:top w:w="80" w:type="dxa"/>
@@ -2043,6 +2076,7 @@
         <w:tc>
           <w:tcPr>
             <w:tcW w:type="dxa" w:w="624"/>
+            <w:shd w:val="nil"/>
             <w:vAlign w:val="center"/>
             <w:tcMar>
               <w:top w:w="80" w:type="dxa"/>
@@ -2072,6 +2106,7 @@
         <w:tc>
           <w:tcPr>
             <w:tcW w:type="dxa" w:w="4082"/>
+            <w:shd w:val="nil"/>
             <w:vAlign w:val="center"/>
             <w:tcMar>
               <w:top w:w="80" w:type="dxa"/>
@@ -2101,6 +2136,7 @@
         <w:tc>
           <w:tcPr>
             <w:tcW w:type="dxa" w:w="4649"/>
+            <w:shd w:val="nil"/>
             <w:vAlign w:val="center"/>
             <w:tcMar>
               <w:top w:w="80" w:type="dxa"/>
@@ -2135,6 +2171,7 @@
         <w:tc>
           <w:tcPr>
             <w:tcW w:type="dxa" w:w="624"/>
+            <w:shd w:val="nil"/>
             <w:vAlign w:val="center"/>
             <w:tcMar>
               <w:top w:w="80" w:type="dxa"/>
@@ -2164,6 +2201,7 @@
         <w:tc>
           <w:tcPr>
             <w:tcW w:type="dxa" w:w="4082"/>
+            <w:shd w:val="nil"/>
             <w:vAlign w:val="center"/>
             <w:tcMar>
               <w:top w:w="80" w:type="dxa"/>
@@ -2193,6 +2231,7 @@
         <w:tc>
           <w:tcPr>
             <w:tcW w:type="dxa" w:w="4649"/>
+            <w:shd w:val="nil"/>
             <w:vAlign w:val="center"/>
             <w:tcMar>
               <w:top w:w="80" w:type="dxa"/>
@@ -2227,6 +2266,7 @@
         <w:tc>
           <w:tcPr>
             <w:tcW w:type="dxa" w:w="624"/>
+            <w:shd w:val="nil"/>
             <w:vAlign w:val="center"/>
             <w:tcMar>
               <w:top w:w="80" w:type="dxa"/>
@@ -2256,6 +2296,7 @@
         <w:tc>
           <w:tcPr>
             <w:tcW w:type="dxa" w:w="4082"/>
+            <w:shd w:val="nil"/>
             <w:vAlign w:val="center"/>
             <w:tcMar>
               <w:top w:w="80" w:type="dxa"/>
@@ -2285,6 +2326,7 @@
         <w:tc>
           <w:tcPr>
             <w:tcW w:type="dxa" w:w="4649"/>
+            <w:shd w:val="nil"/>
             <w:vAlign w:val="center"/>
             <w:tcMar>
               <w:top w:w="80" w:type="dxa"/>
@@ -2378,9 +2420,24 @@
     </w:p>
     <w:p>
       <w:pPr>
+        <w:sectPr>
+          <w:footerReference w:type="default" r:id="rId10"/>
+          <w:headerReference w:type="default" r:id="rId22"/>
+          <w:footerReference w:type="first" r:id="rId23"/>
+          <w:type w:val="continuous"/>
+          <w:pgSz w:w="11906" w:h="16838" w:code="9"/>
+          <w:pgMar w:top="1134" w:right="850" w:bottom="1134" w:left="1701" w:header="720" w:footer="567" w:gutter="0"/>
+          <w:cols w:space="720"/>
+          <w:docGrid w:linePitch="360"/>
+        </w:sectPr>
+      </w:pPr>
+    </w:p>
+    <w:p>
+      <w:pPr>
         <w:pStyle w:val="21"/>
         <w:keepNext/>
         <w:keepLines/>
+        <w:pageBreakBefore w:val="0"/>
         <w:spacing w:before="240" w:after="120" w:line="360" w:lineRule="auto"/>
         <w:ind w:left="0" w:right="0" w:firstLine="0"/>
         <w:jc w:val="left"/>
@@ -2397,7 +2454,7 @@
     <w:p>
       <w:pPr>
         <w:widowControl/>
-        <w:spacing w:before="0" w:after="0" w:line="360" w:lineRule="auto"/>
+        <w:spacing w:before="0" w:after="100" w:line="240" w:lineRule="auto"/>
         <w:ind w:left="0" w:right="0" w:firstLine="709"/>
         <w:jc w:val="both"/>
       </w:pPr>
@@ -2412,14 +2469,15 @@
     <w:p>
       <w:pPr>
         <w:keepNext/>
+        <w:spacing w:line="240" w:lineRule="auto"/>
         <w:ind w:firstLine="0"/>
         <w:jc w:val="center"/>
       </w:pPr>
       <w:r>
         <w:drawing>
           <wp:inline xmlns:a="http://schemas.openxmlformats.org/drawingml/2006/main" xmlns:pic="http://schemas.openxmlformats.org/drawingml/2006/picture">
-            <wp:extent cx="5940000" cy="4486233"/>
-            <wp:docPr id="298370852" name="Picture 298370852"/>
+            <wp:extent cx="8280000" cy="4545720"/>
+            <wp:docPr id="298370855" name="Picture 298370855"/>
             <wp:cNvGraphicFramePr>
               <a:graphicFrameLocks noChangeAspect="1"/>
             </wp:cNvGraphicFramePr>
@@ -2427,11 +2485,11 @@
               <a:graphicData uri="http://schemas.openxmlformats.org/drawingml/2006/picture">
                 <pic:pic>
                   <pic:nvPicPr>
-                    <pic:cNvPr id="0" name="idef0_context.png"/>
+                    <pic:cNvPr id="0" name="ПР2_IDEF0_A-0.png"/>
                     <pic:cNvPicPr/>
                   </pic:nvPicPr>
                   <pic:blipFill>
-                    <a:blip r:embed="rId13"/>
+                    <a:blip r:embed="rId16"/>
                     <a:stretch>
                       <a:fillRect/>
                     </a:stretch>
@@ -2439,7 +2497,7 @@
                   <pic:spPr>
                     <a:xfrm>
                       <a:off x="0" y="0"/>
-                      <a:ext cx="5940000" cy="4486233"/>
+                      <a:ext cx="8280000" cy="4545720"/>
                     </a:xfrm>
                     <a:prstGeom prst="rect"/>
                   </pic:spPr>
@@ -2452,6 +2510,7 @@
     </w:p>
     <w:p>
       <w:pPr>
+        <w:keepNext w:val="0"/>
         <w:keepLines/>
         <w:spacing w:line="240" w:lineRule="auto" w:before="60" w:after="120"/>
         <w:ind w:left="0" w:right="0" w:firstLine="0"/>
@@ -2472,6 +2531,7 @@
         <w:pStyle w:val="21"/>
         <w:keepNext/>
         <w:keepLines/>
+        <w:pageBreakBefore/>
         <w:spacing w:before="240" w:after="120" w:line="360" w:lineRule="auto"/>
         <w:ind w:left="0" w:right="0" w:firstLine="0"/>
         <w:jc w:val="left"/>
@@ -2488,7 +2548,7 @@
     <w:p>
       <w:pPr>
         <w:widowControl/>
-        <w:spacing w:before="0" w:after="0" w:line="360" w:lineRule="auto"/>
+        <w:spacing w:before="0" w:after="100" w:line="240" w:lineRule="auto"/>
         <w:ind w:left="0" w:right="0" w:firstLine="709"/>
         <w:jc w:val="both"/>
       </w:pPr>
@@ -2503,14 +2563,15 @@
     <w:p>
       <w:pPr>
         <w:keepNext/>
+        <w:spacing w:line="240" w:lineRule="auto"/>
         <w:ind w:firstLine="0"/>
         <w:jc w:val="center"/>
       </w:pPr>
       <w:r>
         <w:drawing>
           <wp:inline xmlns:a="http://schemas.openxmlformats.org/drawingml/2006/main" xmlns:pic="http://schemas.openxmlformats.org/drawingml/2006/picture">
-            <wp:extent cx="5940000" cy="3654672"/>
-            <wp:docPr id="298370853" name="Picture 298370853"/>
+            <wp:extent cx="8928000" cy="4464000"/>
+            <wp:docPr id="298370856" name="Picture 298370856"/>
             <wp:cNvGraphicFramePr>
               <a:graphicFrameLocks noChangeAspect="1"/>
             </wp:cNvGraphicFramePr>
@@ -2518,11 +2579,11 @@
               <a:graphicData uri="http://schemas.openxmlformats.org/drawingml/2006/picture">
                 <pic:pic>
                   <pic:nvPicPr>
-                    <pic:cNvPr id="0" name="idef0_a0.png"/>
+                    <pic:cNvPr id="0" name="ПР2_IDEF0_A0.png"/>
                     <pic:cNvPicPr/>
                   </pic:nvPicPr>
                   <pic:blipFill>
-                    <a:blip r:embed="rId14"/>
+                    <a:blip r:embed="rId17"/>
                     <a:stretch>
                       <a:fillRect/>
                     </a:stretch>
@@ -2530,7 +2591,7 @@
                   <pic:spPr>
                     <a:xfrm>
                       <a:off x="0" y="0"/>
-                      <a:ext cx="5940000" cy="3654672"/>
+                      <a:ext cx="8928000" cy="4464000"/>
                     </a:xfrm>
                     <a:prstGeom prst="rect"/>
                   </pic:spPr>
@@ -2543,6 +2604,7 @@
     </w:p>
     <w:p>
       <w:pPr>
+        <w:keepNext w:val="0"/>
         <w:keepLines/>
         <w:spacing w:line="240" w:lineRule="auto" w:before="60" w:after="120"/>
         <w:ind w:left="0" w:right="0" w:firstLine="0"/>
@@ -2563,6 +2625,7 @@
         <w:pStyle w:val="21"/>
         <w:keepNext/>
         <w:keepLines/>
+        <w:pageBreakBefore/>
         <w:spacing w:before="240" w:after="120" w:line="360" w:lineRule="auto"/>
         <w:ind w:left="0" w:right="0" w:firstLine="0"/>
         <w:jc w:val="left"/>
@@ -2579,7 +2642,7 @@
     <w:p>
       <w:pPr>
         <w:widowControl/>
-        <w:spacing w:before="0" w:after="0" w:line="360" w:lineRule="auto"/>
+        <w:spacing w:before="0" w:after="100" w:line="240" w:lineRule="auto"/>
         <w:ind w:left="0" w:right="0" w:firstLine="709"/>
         <w:jc w:val="both"/>
       </w:pPr>
@@ -2594,14 +2657,15 @@
     <w:p>
       <w:pPr>
         <w:keepNext/>
+        <w:spacing w:line="240" w:lineRule="auto"/>
         <w:ind w:firstLine="0"/>
         <w:jc w:val="center"/>
       </w:pPr>
       <w:r>
         <w:drawing>
           <wp:inline xmlns:a="http://schemas.openxmlformats.org/drawingml/2006/main" xmlns:pic="http://schemas.openxmlformats.org/drawingml/2006/picture">
-            <wp:extent cx="5940000" cy="3654672"/>
-            <wp:docPr id="298370854" name="Picture 298370854"/>
+            <wp:extent cx="8928000" cy="4464000"/>
+            <wp:docPr id="298370857" name="Picture 298370857"/>
             <wp:cNvGraphicFramePr>
               <a:graphicFrameLocks noChangeAspect="1"/>
             </wp:cNvGraphicFramePr>
@@ -2609,11 +2673,11 @@
               <a:graphicData uri="http://schemas.openxmlformats.org/drawingml/2006/picture">
                 <pic:pic>
                   <pic:nvPicPr>
-                    <pic:cNvPr id="0" name="idef0_a2.png"/>
+                    <pic:cNvPr id="0" name="ПР2_IDEF0_A2.png"/>
                     <pic:cNvPicPr/>
                   </pic:nvPicPr>
                   <pic:blipFill>
-                    <a:blip r:embed="rId15"/>
+                    <a:blip r:embed="rId18"/>
                     <a:stretch>
                       <a:fillRect/>
                     </a:stretch>
@@ -2621,7 +2685,7 @@
                   <pic:spPr>
                     <a:xfrm>
                       <a:off x="0" y="0"/>
-                      <a:ext cx="5940000" cy="3654672"/>
+                      <a:ext cx="8928000" cy="4464000"/>
                     </a:xfrm>
                     <a:prstGeom prst="rect"/>
                   </pic:spPr>
@@ -2634,6 +2698,7 @@
     </w:p>
     <w:p>
       <w:pPr>
+        <w:keepNext w:val="0"/>
         <w:keepLines/>
         <w:spacing w:line="240" w:lineRule="auto" w:before="60" w:after="120"/>
         <w:ind w:left="0" w:right="0" w:firstLine="0"/>
@@ -2653,11 +2718,12 @@
       <w:pPr>
         <w:sectPr>
           <w:footerReference w:type="default" r:id="rId10"/>
+          <w:headerReference w:type="default" r:id="rId24"/>
+          <w:footerReference w:type="first" r:id="rId25"/>
           <w:type w:val="continuous"/>
-          <w:pgSz w:w="11911" w:h="16841" w:code="9"/>
-          <w:pgMar w:top="1134" w:right="850" w:bottom="1134" w:left="1701" w:header="720" w:footer="720" w:gutter="0"/>
+          <w:pgSz w:w="16838" w:h="11906" w:code="9" w:orient="landscape"/>
+          <w:pgMar w:top="1134" w:right="850" w:bottom="1134" w:left="1701" w:header="720" w:footer="567" w:gutter="0"/>
           <w:cols w:space="720"/>
-          <w:titlePg/>
           <w:docGrid w:linePitch="360"/>
         </w:sectPr>
       </w:pPr>
@@ -2745,6 +2811,7 @@
         <w:tc>
           <w:tcPr>
             <w:tcW w:type="dxa" w:w="1247"/>
+            <w:shd w:val="nil"/>
             <w:vAlign w:val="center"/>
             <w:tcMar>
               <w:top w:w="80" w:type="dxa"/>
@@ -2774,6 +2841,7 @@
         <w:tc>
           <w:tcPr>
             <w:tcW w:type="dxa" w:w="1984"/>
+            <w:shd w:val="nil"/>
             <w:vAlign w:val="center"/>
             <w:tcMar>
               <w:top w:w="80" w:type="dxa"/>
@@ -2803,6 +2871,7 @@
         <w:tc>
           <w:tcPr>
             <w:tcW w:type="dxa" w:w="1928"/>
+            <w:shd w:val="nil"/>
             <w:vAlign w:val="center"/>
             <w:tcMar>
               <w:top w:w="80" w:type="dxa"/>
@@ -2832,6 +2901,7 @@
         <w:tc>
           <w:tcPr>
             <w:tcW w:type="dxa" w:w="1984"/>
+            <w:shd w:val="nil"/>
             <w:vAlign w:val="center"/>
             <w:tcMar>
               <w:top w:w="80" w:type="dxa"/>
@@ -2861,6 +2931,7 @@
         <w:tc>
           <w:tcPr>
             <w:tcW w:type="dxa" w:w="1701"/>
+            <w:shd w:val="nil"/>
             <w:vAlign w:val="center"/>
             <w:tcMar>
               <w:top w:w="80" w:type="dxa"/>
@@ -2890,6 +2961,7 @@
         <w:tc>
           <w:tcPr>
             <w:tcW w:type="dxa" w:w="2268"/>
+            <w:shd w:val="nil"/>
             <w:vAlign w:val="center"/>
             <w:tcMar>
               <w:top w:w="80" w:type="dxa"/>
@@ -2919,6 +2991,7 @@
         <w:tc>
           <w:tcPr>
             <w:tcW w:type="dxa" w:w="1814"/>
+            <w:shd w:val="nil"/>
             <w:vAlign w:val="center"/>
             <w:tcMar>
               <w:top w:w="80" w:type="dxa"/>
@@ -2948,6 +3021,7 @@
         <w:tc>
           <w:tcPr>
             <w:tcW w:type="dxa" w:w="1814"/>
+            <w:shd w:val="nil"/>
             <w:vAlign w:val="center"/>
             <w:tcMar>
               <w:top w:w="80" w:type="dxa"/>
@@ -2982,6 +3056,7 @@
         <w:tc>
           <w:tcPr>
             <w:tcW w:type="dxa" w:w="1247"/>
+            <w:shd w:val="nil"/>
             <w:vAlign w:val="center"/>
             <w:tcMar>
               <w:top w:w="80" w:type="dxa"/>
@@ -3011,6 +3086,7 @@
         <w:tc>
           <w:tcPr>
             <w:tcW w:type="dxa" w:w="1984"/>
+            <w:shd w:val="nil"/>
             <w:vAlign w:val="center"/>
             <w:tcMar>
               <w:top w:w="80" w:type="dxa"/>
@@ -3040,6 +3116,7 @@
         <w:tc>
           <w:tcPr>
             <w:tcW w:type="dxa" w:w="1928"/>
+            <w:shd w:val="nil"/>
             <w:vAlign w:val="center"/>
             <w:tcMar>
               <w:top w:w="80" w:type="dxa"/>
@@ -3069,6 +3146,7 @@
         <w:tc>
           <w:tcPr>
             <w:tcW w:type="dxa" w:w="1984"/>
+            <w:shd w:val="nil"/>
             <w:vAlign w:val="center"/>
             <w:tcMar>
               <w:top w:w="80" w:type="dxa"/>
@@ -3098,6 +3176,7 @@
         <w:tc>
           <w:tcPr>
             <w:tcW w:type="dxa" w:w="1701"/>
+            <w:shd w:val="nil"/>
             <w:vAlign w:val="center"/>
             <w:tcMar>
               <w:top w:w="80" w:type="dxa"/>
@@ -3127,6 +3206,7 @@
         <w:tc>
           <w:tcPr>
             <w:tcW w:type="dxa" w:w="2268"/>
+            <w:shd w:val="nil"/>
             <w:vAlign w:val="center"/>
             <w:tcMar>
               <w:top w:w="80" w:type="dxa"/>
@@ -3156,6 +3236,7 @@
         <w:tc>
           <w:tcPr>
             <w:tcW w:type="dxa" w:w="1814"/>
+            <w:shd w:val="nil"/>
             <w:vAlign w:val="center"/>
             <w:tcMar>
               <w:top w:w="80" w:type="dxa"/>
@@ -3185,6 +3266,7 @@
         <w:tc>
           <w:tcPr>
             <w:tcW w:type="dxa" w:w="1814"/>
+            <w:shd w:val="nil"/>
             <w:vAlign w:val="center"/>
             <w:tcMar>
               <w:top w:w="80" w:type="dxa"/>
@@ -3219,6 +3301,7 @@
         <w:tc>
           <w:tcPr>
             <w:tcW w:type="dxa" w:w="1247"/>
+            <w:shd w:val="nil"/>
             <w:vAlign w:val="center"/>
             <w:tcMar>
               <w:top w:w="80" w:type="dxa"/>
@@ -3248,6 +3331,7 @@
         <w:tc>
           <w:tcPr>
             <w:tcW w:type="dxa" w:w="1984"/>
+            <w:shd w:val="nil"/>
             <w:vAlign w:val="center"/>
             <w:tcMar>
               <w:top w:w="80" w:type="dxa"/>
@@ -3277,6 +3361,7 @@
         <w:tc>
           <w:tcPr>
             <w:tcW w:type="dxa" w:w="1928"/>
+            <w:shd w:val="nil"/>
             <w:vAlign w:val="center"/>
             <w:tcMar>
               <w:top w:w="80" w:type="dxa"/>
@@ -3306,6 +3391,7 @@
         <w:tc>
           <w:tcPr>
             <w:tcW w:type="dxa" w:w="1984"/>
+            <w:shd w:val="nil"/>
             <w:vAlign w:val="center"/>
             <w:tcMar>
               <w:top w:w="80" w:type="dxa"/>
@@ -3335,6 +3421,7 @@
         <w:tc>
           <w:tcPr>
             <w:tcW w:type="dxa" w:w="1701"/>
+            <w:shd w:val="nil"/>
             <w:vAlign w:val="center"/>
             <w:tcMar>
               <w:top w:w="80" w:type="dxa"/>
@@ -3364,6 +3451,7 @@
         <w:tc>
           <w:tcPr>
             <w:tcW w:type="dxa" w:w="2268"/>
+            <w:shd w:val="nil"/>
             <w:vAlign w:val="center"/>
             <w:tcMar>
               <w:top w:w="80" w:type="dxa"/>
@@ -3393,6 +3481,7 @@
         <w:tc>
           <w:tcPr>
             <w:tcW w:type="dxa" w:w="1814"/>
+            <w:shd w:val="nil"/>
             <w:vAlign w:val="center"/>
             <w:tcMar>
               <w:top w:w="80" w:type="dxa"/>
@@ -3422,6 +3511,7 @@
         <w:tc>
           <w:tcPr>
             <w:tcW w:type="dxa" w:w="1814"/>
+            <w:shd w:val="nil"/>
             <w:vAlign w:val="center"/>
             <w:tcMar>
               <w:top w:w="80" w:type="dxa"/>
@@ -3456,6 +3546,7 @@
         <w:tc>
           <w:tcPr>
             <w:tcW w:type="dxa" w:w="1247"/>
+            <w:shd w:val="nil"/>
             <w:vAlign w:val="center"/>
             <w:tcMar>
               <w:top w:w="80" w:type="dxa"/>
@@ -3485,6 +3576,7 @@
         <w:tc>
           <w:tcPr>
             <w:tcW w:type="dxa" w:w="1984"/>
+            <w:shd w:val="nil"/>
             <w:vAlign w:val="center"/>
             <w:tcMar>
               <w:top w:w="80" w:type="dxa"/>
@@ -3514,6 +3606,7 @@
         <w:tc>
           <w:tcPr>
             <w:tcW w:type="dxa" w:w="1928"/>
+            <w:shd w:val="nil"/>
             <w:vAlign w:val="center"/>
             <w:tcMar>
               <w:top w:w="80" w:type="dxa"/>
@@ -3543,6 +3636,7 @@
         <w:tc>
           <w:tcPr>
             <w:tcW w:type="dxa" w:w="1984"/>
+            <w:shd w:val="nil"/>
             <w:vAlign w:val="center"/>
             <w:tcMar>
               <w:top w:w="80" w:type="dxa"/>
@@ -3572,6 +3666,7 @@
         <w:tc>
           <w:tcPr>
             <w:tcW w:type="dxa" w:w="1701"/>
+            <w:shd w:val="nil"/>
             <w:vAlign w:val="center"/>
             <w:tcMar>
               <w:top w:w="80" w:type="dxa"/>
@@ -3601,6 +3696,7 @@
         <w:tc>
           <w:tcPr>
             <w:tcW w:type="dxa" w:w="2268"/>
+            <w:shd w:val="nil"/>
             <w:vAlign w:val="center"/>
             <w:tcMar>
               <w:top w:w="80" w:type="dxa"/>
@@ -3630,6 +3726,7 @@
         <w:tc>
           <w:tcPr>
             <w:tcW w:type="dxa" w:w="1814"/>
+            <w:shd w:val="nil"/>
             <w:vAlign w:val="center"/>
             <w:tcMar>
               <w:top w:w="80" w:type="dxa"/>
@@ -3659,6 +3756,7 @@
         <w:tc>
           <w:tcPr>
             <w:tcW w:type="dxa" w:w="1814"/>
+            <w:shd w:val="nil"/>
             <w:vAlign w:val="center"/>
             <w:tcMar>
               <w:top w:w="80" w:type="dxa"/>
@@ -3693,6 +3791,7 @@
         <w:tc>
           <w:tcPr>
             <w:tcW w:type="dxa" w:w="1247"/>
+            <w:shd w:val="nil"/>
             <w:vAlign w:val="center"/>
             <w:tcMar>
               <w:top w:w="80" w:type="dxa"/>
@@ -3722,6 +3821,7 @@
         <w:tc>
           <w:tcPr>
             <w:tcW w:type="dxa" w:w="1984"/>
+            <w:shd w:val="nil"/>
             <w:vAlign w:val="center"/>
             <w:tcMar>
               <w:top w:w="80" w:type="dxa"/>
@@ -3751,6 +3851,7 @@
         <w:tc>
           <w:tcPr>
             <w:tcW w:type="dxa" w:w="1928"/>
+            <w:shd w:val="nil"/>
             <w:vAlign w:val="center"/>
             <w:tcMar>
               <w:top w:w="80" w:type="dxa"/>
@@ -3780,6 +3881,7 @@
         <w:tc>
           <w:tcPr>
             <w:tcW w:type="dxa" w:w="1984"/>
+            <w:shd w:val="nil"/>
             <w:vAlign w:val="center"/>
             <w:tcMar>
               <w:top w:w="80" w:type="dxa"/>
@@ -3809,6 +3911,7 @@
         <w:tc>
           <w:tcPr>
             <w:tcW w:type="dxa" w:w="1701"/>
+            <w:shd w:val="nil"/>
             <w:vAlign w:val="center"/>
             <w:tcMar>
               <w:top w:w="80" w:type="dxa"/>
@@ -3838,6 +3941,7 @@
         <w:tc>
           <w:tcPr>
             <w:tcW w:type="dxa" w:w="2268"/>
+            <w:shd w:val="nil"/>
             <w:vAlign w:val="center"/>
             <w:tcMar>
               <w:top w:w="80" w:type="dxa"/>
@@ -3867,6 +3971,7 @@
         <w:tc>
           <w:tcPr>
             <w:tcW w:type="dxa" w:w="1814"/>
+            <w:shd w:val="nil"/>
             <w:vAlign w:val="center"/>
             <w:tcMar>
               <w:top w:w="80" w:type="dxa"/>
@@ -3896,6 +4001,7 @@
         <w:tc>
           <w:tcPr>
             <w:tcW w:type="dxa" w:w="1814"/>
+            <w:shd w:val="nil"/>
             <w:vAlign w:val="center"/>
             <w:tcMar>
               <w:top w:w="80" w:type="dxa"/>
@@ -3930,6 +4036,7 @@
         <w:tc>
           <w:tcPr>
             <w:tcW w:type="dxa" w:w="1247"/>
+            <w:shd w:val="nil"/>
             <w:vAlign w:val="center"/>
             <w:tcMar>
               <w:top w:w="80" w:type="dxa"/>
@@ -3959,6 +4066,7 @@
         <w:tc>
           <w:tcPr>
             <w:tcW w:type="dxa" w:w="1984"/>
+            <w:shd w:val="nil"/>
             <w:vAlign w:val="center"/>
             <w:tcMar>
               <w:top w:w="80" w:type="dxa"/>
@@ -3988,6 +4096,7 @@
         <w:tc>
           <w:tcPr>
             <w:tcW w:type="dxa" w:w="1928"/>
+            <w:shd w:val="nil"/>
             <w:vAlign w:val="center"/>
             <w:tcMar>
               <w:top w:w="80" w:type="dxa"/>
@@ -4017,6 +4126,7 @@
         <w:tc>
           <w:tcPr>
             <w:tcW w:type="dxa" w:w="1984"/>
+            <w:shd w:val="nil"/>
             <w:vAlign w:val="center"/>
             <w:tcMar>
               <w:top w:w="80" w:type="dxa"/>
@@ -4046,6 +4156,7 @@
         <w:tc>
           <w:tcPr>
             <w:tcW w:type="dxa" w:w="1701"/>
+            <w:shd w:val="nil"/>
             <w:vAlign w:val="center"/>
             <w:tcMar>
               <w:top w:w="80" w:type="dxa"/>
@@ -4075,6 +4186,7 @@
         <w:tc>
           <w:tcPr>
             <w:tcW w:type="dxa" w:w="2268"/>
+            <w:shd w:val="nil"/>
             <w:vAlign w:val="center"/>
             <w:tcMar>
               <w:top w:w="80" w:type="dxa"/>
@@ -4104,6 +4216,7 @@
         <w:tc>
           <w:tcPr>
             <w:tcW w:type="dxa" w:w="1814"/>
+            <w:shd w:val="nil"/>
             <w:vAlign w:val="center"/>
             <w:tcMar>
               <w:top w:w="80" w:type="dxa"/>
@@ -4133,6 +4246,7 @@
         <w:tc>
           <w:tcPr>
             <w:tcW w:type="dxa" w:w="1814"/>
+            <w:shd w:val="nil"/>
             <w:vAlign w:val="center"/>
             <w:tcMar>
               <w:top w:w="80" w:type="dxa"/>
@@ -4167,6 +4281,7 @@
         <w:tc>
           <w:tcPr>
             <w:tcW w:type="dxa" w:w="1247"/>
+            <w:shd w:val="nil"/>
             <w:vAlign w:val="center"/>
             <w:tcMar>
               <w:top w:w="80" w:type="dxa"/>
@@ -4196,6 +4311,7 @@
         <w:tc>
           <w:tcPr>
             <w:tcW w:type="dxa" w:w="1984"/>
+            <w:shd w:val="nil"/>
             <w:vAlign w:val="center"/>
             <w:tcMar>
               <w:top w:w="80" w:type="dxa"/>
@@ -4225,6 +4341,7 @@
         <w:tc>
           <w:tcPr>
             <w:tcW w:type="dxa" w:w="1928"/>
+            <w:shd w:val="nil"/>
             <w:vAlign w:val="center"/>
             <w:tcMar>
               <w:top w:w="80" w:type="dxa"/>
@@ -4254,6 +4371,7 @@
         <w:tc>
           <w:tcPr>
             <w:tcW w:type="dxa" w:w="1984"/>
+            <w:shd w:val="nil"/>
             <w:vAlign w:val="center"/>
             <w:tcMar>
               <w:top w:w="80" w:type="dxa"/>
@@ -4283,6 +4401,7 @@
         <w:tc>
           <w:tcPr>
             <w:tcW w:type="dxa" w:w="1701"/>
+            <w:shd w:val="nil"/>
             <w:vAlign w:val="center"/>
             <w:tcMar>
               <w:top w:w="80" w:type="dxa"/>
@@ -4312,6 +4431,7 @@
         <w:tc>
           <w:tcPr>
             <w:tcW w:type="dxa" w:w="2268"/>
+            <w:shd w:val="nil"/>
             <w:vAlign w:val="center"/>
             <w:tcMar>
               <w:top w:w="80" w:type="dxa"/>
@@ -4341,6 +4461,7 @@
         <w:tc>
           <w:tcPr>
             <w:tcW w:type="dxa" w:w="1814"/>
+            <w:shd w:val="nil"/>
             <w:vAlign w:val="center"/>
             <w:tcMar>
               <w:top w:w="80" w:type="dxa"/>
@@ -4370,6 +4491,7 @@
         <w:tc>
           <w:tcPr>
             <w:tcW w:type="dxa" w:w="1814"/>
+            <w:shd w:val="nil"/>
             <w:vAlign w:val="center"/>
             <w:tcMar>
               <w:top w:w="80" w:type="dxa"/>
@@ -4404,6 +4526,7 @@
         <w:tc>
           <w:tcPr>
             <w:tcW w:type="dxa" w:w="1247"/>
+            <w:shd w:val="nil"/>
             <w:vAlign w:val="center"/>
             <w:tcMar>
               <w:top w:w="80" w:type="dxa"/>
@@ -4433,6 +4556,7 @@
         <w:tc>
           <w:tcPr>
             <w:tcW w:type="dxa" w:w="1984"/>
+            <w:shd w:val="nil"/>
             <w:vAlign w:val="center"/>
             <w:tcMar>
               <w:top w:w="80" w:type="dxa"/>
@@ -4462,6 +4586,7 @@
         <w:tc>
           <w:tcPr>
             <w:tcW w:type="dxa" w:w="1928"/>
+            <w:shd w:val="nil"/>
             <w:vAlign w:val="center"/>
             <w:tcMar>
               <w:top w:w="80" w:type="dxa"/>
@@ -4491,6 +4616,7 @@
         <w:tc>
           <w:tcPr>
             <w:tcW w:type="dxa" w:w="1984"/>
+            <w:shd w:val="nil"/>
             <w:vAlign w:val="center"/>
             <w:tcMar>
               <w:top w:w="80" w:type="dxa"/>
@@ -4520,6 +4646,7 @@
         <w:tc>
           <w:tcPr>
             <w:tcW w:type="dxa" w:w="1701"/>
+            <w:shd w:val="nil"/>
             <w:vAlign w:val="center"/>
             <w:tcMar>
               <w:top w:w="80" w:type="dxa"/>
@@ -4549,6 +4676,7 @@
         <w:tc>
           <w:tcPr>
             <w:tcW w:type="dxa" w:w="2268"/>
+            <w:shd w:val="nil"/>
             <w:vAlign w:val="center"/>
             <w:tcMar>
               <w:top w:w="80" w:type="dxa"/>
@@ -4578,6 +4706,7 @@
         <w:tc>
           <w:tcPr>
             <w:tcW w:type="dxa" w:w="1814"/>
+            <w:shd w:val="nil"/>
             <w:vAlign w:val="center"/>
             <w:tcMar>
               <w:top w:w="80" w:type="dxa"/>
@@ -4607,6 +4736,7 @@
         <w:tc>
           <w:tcPr>
             <w:tcW w:type="dxa" w:w="1814"/>
+            <w:shd w:val="nil"/>
             <w:vAlign w:val="center"/>
             <w:tcMar>
               <w:top w:w="80" w:type="dxa"/>
@@ -4641,6 +4771,7 @@
         <w:tc>
           <w:tcPr>
             <w:tcW w:type="dxa" w:w="1247"/>
+            <w:shd w:val="nil"/>
             <w:vAlign w:val="center"/>
             <w:tcMar>
               <w:top w:w="80" w:type="dxa"/>
@@ -4670,6 +4801,7 @@
         <w:tc>
           <w:tcPr>
             <w:tcW w:type="dxa" w:w="1984"/>
+            <w:shd w:val="nil"/>
             <w:vAlign w:val="center"/>
             <w:tcMar>
               <w:top w:w="80" w:type="dxa"/>
@@ -4699,6 +4831,7 @@
         <w:tc>
           <w:tcPr>
             <w:tcW w:type="dxa" w:w="1928"/>
+            <w:shd w:val="nil"/>
             <w:vAlign w:val="center"/>
             <w:tcMar>
               <w:top w:w="80" w:type="dxa"/>
@@ -4728,6 +4861,7 @@
         <w:tc>
           <w:tcPr>
             <w:tcW w:type="dxa" w:w="1984"/>
+            <w:shd w:val="nil"/>
             <w:vAlign w:val="center"/>
             <w:tcMar>
               <w:top w:w="80" w:type="dxa"/>
@@ -4757,6 +4891,7 @@
         <w:tc>
           <w:tcPr>
             <w:tcW w:type="dxa" w:w="1701"/>
+            <w:shd w:val="nil"/>
             <w:vAlign w:val="center"/>
             <w:tcMar>
               <w:top w:w="80" w:type="dxa"/>
@@ -4786,6 +4921,7 @@
         <w:tc>
           <w:tcPr>
             <w:tcW w:type="dxa" w:w="2268"/>
+            <w:shd w:val="nil"/>
             <w:vAlign w:val="center"/>
             <w:tcMar>
               <w:top w:w="80" w:type="dxa"/>
@@ -4815,6 +4951,7 @@
         <w:tc>
           <w:tcPr>
             <w:tcW w:type="dxa" w:w="1814"/>
+            <w:shd w:val="nil"/>
             <w:vAlign w:val="center"/>
             <w:tcMar>
               <w:top w:w="80" w:type="dxa"/>
@@ -4844,6 +4981,7 @@
         <w:tc>
           <w:tcPr>
             <w:tcW w:type="dxa" w:w="1814"/>
+            <w:shd w:val="nil"/>
             <w:vAlign w:val="center"/>
             <w:tcMar>
               <w:top w:w="80" w:type="dxa"/>
@@ -4878,6 +5016,7 @@
         <w:tc>
           <w:tcPr>
             <w:tcW w:type="dxa" w:w="1247"/>
+            <w:shd w:val="nil"/>
             <w:vAlign w:val="center"/>
             <w:tcMar>
               <w:top w:w="80" w:type="dxa"/>
@@ -4907,6 +5046,7 @@
         <w:tc>
           <w:tcPr>
             <w:tcW w:type="dxa" w:w="1984"/>
+            <w:shd w:val="nil"/>
             <w:vAlign w:val="center"/>
             <w:tcMar>
               <w:top w:w="80" w:type="dxa"/>
@@ -4936,6 +5076,7 @@
         <w:tc>
           <w:tcPr>
             <w:tcW w:type="dxa" w:w="1928"/>
+            <w:shd w:val="nil"/>
             <w:vAlign w:val="center"/>
             <w:tcMar>
               <w:top w:w="80" w:type="dxa"/>
@@ -4965,6 +5106,7 @@
         <w:tc>
           <w:tcPr>
             <w:tcW w:type="dxa" w:w="1984"/>
+            <w:shd w:val="nil"/>
             <w:vAlign w:val="center"/>
             <w:tcMar>
               <w:top w:w="80" w:type="dxa"/>
@@ -4994,6 +5136,7 @@
         <w:tc>
           <w:tcPr>
             <w:tcW w:type="dxa" w:w="1701"/>
+            <w:shd w:val="nil"/>
             <w:vAlign w:val="center"/>
             <w:tcMar>
               <w:top w:w="80" w:type="dxa"/>
@@ -5023,6 +5166,7 @@
         <w:tc>
           <w:tcPr>
             <w:tcW w:type="dxa" w:w="2268"/>
+            <w:shd w:val="nil"/>
             <w:vAlign w:val="center"/>
             <w:tcMar>
               <w:top w:w="80" w:type="dxa"/>
@@ -5052,6 +5196,7 @@
         <w:tc>
           <w:tcPr>
             <w:tcW w:type="dxa" w:w="1814"/>
+            <w:shd w:val="nil"/>
             <w:vAlign w:val="center"/>
             <w:tcMar>
               <w:top w:w="80" w:type="dxa"/>
@@ -5081,6 +5226,7 @@
         <w:tc>
           <w:tcPr>
             <w:tcW w:type="dxa" w:w="1814"/>
+            <w:shd w:val="nil"/>
             <w:vAlign w:val="center"/>
             <w:tcMar>
               <w:top w:w="80" w:type="dxa"/>
@@ -5112,10 +5258,12 @@
     <w:p>
       <w:pPr>
         <w:sectPr>
+          <w:headerReference w:type="default" r:id="rId26"/>
+          <w:footerReference w:type="default" r:id="rId27"/>
+          <w:footerReference w:type="first" r:id="rId28"/>
           <w:pgSz w:w="16838" w:h="11906" w:code="9" w:orient="landscape"/>
-          <w:pgMar w:top="1134" w:right="850" w:bottom="1134" w:left="1701" w:header="720" w:footer="720" w:gutter="0"/>
+          <w:pgMar w:top="1134" w:right="850" w:bottom="1134" w:left="1701" w:header="720" w:footer="567" w:gutter="0"/>
           <w:cols w:space="720"/>
-          <w:titlePg/>
           <w:docGrid w:linePitch="360"/>
         </w:sectPr>
       </w:pPr>
@@ -5232,10 +5380,12 @@
       </w:r>
     </w:p>
     <w:sectPr>
+      <w:headerReference w:type="default" r:id="rId29"/>
+      <w:footerReference w:type="default" r:id="rId30"/>
+      <w:footerReference w:type="first" r:id="rId31"/>
       <w:pgSz w:w="11906" w:h="16838" w:code="9"/>
-      <w:pgMar w:top="1134" w:right="850" w:bottom="1134" w:left="1701" w:header="720" w:footer="720" w:gutter="0"/>
+      <w:pgMar w:top="1134" w:right="850" w:bottom="1134" w:left="1701" w:header="720" w:footer="567" w:gutter="0"/>
       <w:cols w:space="720"/>
-      <w:titlePg/>
       <w:docGrid w:linePitch="360"/>
     </w:sectPr>
   </w:body>
@@ -5272,29 +5422,135 @@
   <w:p>
     <w:pPr>
       <w:pStyle w:val="a7"/>
+      <w:spacing w:line="240" w:lineRule="auto"/>
+      <w:ind w:left="0" w:right="0" w:firstLine="0"/>
       <w:jc w:val="center"/>
     </w:pPr>
-    <w:r>
-      <w:fldChar w:fldCharType="begin"/>
-    </w:r>
-    <w:r>
-      <w:instrText>PAGE</w:instrText>
-    </w:r>
-    <w:r>
-      <w:fldChar w:fldCharType="separate"/>
-    </w:r>
-    <w:r>
-      <w:rPr>
-        <w:sz w:val="24"/>
-      </w:rPr>
-      <w:t>1</w:t>
-    </w:r>
-    <w:r>
-      <w:rPr>
-        <w:sz w:val="24"/>
-      </w:rPr>
-      <w:fldChar w:fldCharType="end"/>
-    </w:r>
+    <w:fldSimple w:instr="PAGE">
+      <w:r>
+        <w:rPr>
+          <w:rFonts w:ascii="Times New Roman" w:hAnsi="Times New Roman"/>
+          <w:sz w:val="24"/>
+        </w:rPr>
+        <w:t>2</w:t>
+      </w:r>
+    </w:fldSimple>
+  </w:p>
+</w:ftr>
+</file>
+
+<file path=word/footer2.xml><?xml version="1.0" encoding="utf-8"?>
+<w:ftr xmlns:m="http://schemas.openxmlformats.org/officeDocument/2006/math" xmlns:mc="http://schemas.openxmlformats.org/markup-compatibility/2006" xmlns:mo="http://schemas.microsoft.com/office/mac/office/2008/main" xmlns:mv="urn:schemas-microsoft-com:mac:vml" xmlns:o="urn:schemas-microsoft-com:office:office" xmlns:r="http://schemas.openxmlformats.org/officeDocument/2006/relationships" xmlns:v="urn:schemas-microsoft-com:vml" xmlns:w10="urn:schemas-microsoft-com:office:word" xmlns:w14="http://schemas.microsoft.com/office/word/2010/wordml" xmlns:w="http://schemas.openxmlformats.org/wordprocessingml/2006/main" xmlns:wne="http://schemas.microsoft.com/office/word/2006/wordml" xmlns:wp14="http://schemas.microsoft.com/office/word/2010/wordprocessingDrawing" xmlns:wp="http://schemas.openxmlformats.org/drawingml/2006/wordprocessingDrawing" xmlns:wpc="http://schemas.microsoft.com/office/word/2010/wordprocessingCanvas" xmlns:wpg="http://schemas.microsoft.com/office/word/2010/wordprocessingGroup" xmlns:wpi="http://schemas.microsoft.com/office/word/2010/wordprocessingInk" xmlns:wps="http://schemas.microsoft.com/office/word/2010/wordprocessingShape" mc:Ignorable="w14 wp14">
+  <w:p>
+    <w:pPr>
+      <w:pStyle w:val="Footer"/>
+      <w:spacing w:line="240" w:lineRule="auto"/>
+      <w:ind w:firstLine="0" w:left="0" w:right="0"/>
+      <w:jc w:val="center"/>
+    </w:pPr>
+    <w:fldSimple w:instr="PAGE">
+      <w:r>
+        <w:rPr>
+          <w:rFonts w:ascii="Times New Roman" w:hAnsi="Times New Roman"/>
+          <w:sz w:val="24"/>
+        </w:rPr>
+        <w:t>2</w:t>
+      </w:r>
+    </w:fldSimple>
+  </w:p>
+</w:ftr>
+</file>
+
+<file path=word/footer3.xml><?xml version="1.0" encoding="utf-8"?>
+<w:ftr xmlns:m="http://schemas.openxmlformats.org/officeDocument/2006/math" xmlns:mc="http://schemas.openxmlformats.org/markup-compatibility/2006" xmlns:mo="http://schemas.microsoft.com/office/mac/office/2008/main" xmlns:mv="urn:schemas-microsoft-com:mac:vml" xmlns:o="urn:schemas-microsoft-com:office:office" xmlns:r="http://schemas.openxmlformats.org/officeDocument/2006/relationships" xmlns:v="urn:schemas-microsoft-com:vml" xmlns:w10="urn:schemas-microsoft-com:office:word" xmlns:w14="http://schemas.microsoft.com/office/word/2010/wordml" xmlns:w="http://schemas.openxmlformats.org/wordprocessingml/2006/main" xmlns:wne="http://schemas.microsoft.com/office/word/2006/wordml" xmlns:wp14="http://schemas.microsoft.com/office/word/2010/wordprocessingDrawing" xmlns:wp="http://schemas.openxmlformats.org/drawingml/2006/wordprocessingDrawing" xmlns:wpc="http://schemas.microsoft.com/office/word/2010/wordprocessingCanvas" xmlns:wpg="http://schemas.microsoft.com/office/word/2010/wordprocessingGroup" xmlns:wpi="http://schemas.microsoft.com/office/word/2010/wordprocessingInk" xmlns:wps="http://schemas.microsoft.com/office/word/2010/wordprocessingShape" mc:Ignorable="w14 wp14">
+  <w:p>
+    <w:pPr>
+      <w:pStyle w:val="Footer"/>
+    </w:pPr>
+  </w:p>
+</w:ftr>
+</file>
+
+<file path=word/footer4.xml><?xml version="1.0" encoding="utf-8"?>
+<w:ftr xmlns:m="http://schemas.openxmlformats.org/officeDocument/2006/math" xmlns:mc="http://schemas.openxmlformats.org/markup-compatibility/2006" xmlns:mo="http://schemas.microsoft.com/office/mac/office/2008/main" xmlns:mv="urn:schemas-microsoft-com:mac:vml" xmlns:o="urn:schemas-microsoft-com:office:office" xmlns:r="http://schemas.openxmlformats.org/officeDocument/2006/relationships" xmlns:v="urn:schemas-microsoft-com:vml" xmlns:w10="urn:schemas-microsoft-com:office:word" xmlns:w14="http://schemas.microsoft.com/office/word/2010/wordml" xmlns:w="http://schemas.openxmlformats.org/wordprocessingml/2006/main" xmlns:wne="http://schemas.microsoft.com/office/word/2006/wordml" xmlns:wp14="http://schemas.microsoft.com/office/word/2010/wordprocessingDrawing" xmlns:wp="http://schemas.openxmlformats.org/drawingml/2006/wordprocessingDrawing" xmlns:wpc="http://schemas.microsoft.com/office/word/2010/wordprocessingCanvas" xmlns:wpg="http://schemas.microsoft.com/office/word/2010/wordprocessingGroup" xmlns:wpi="http://schemas.microsoft.com/office/word/2010/wordprocessingInk" xmlns:wps="http://schemas.microsoft.com/office/word/2010/wordprocessingShape" mc:Ignorable="w14 wp14">
+  <w:p>
+    <w:pPr>
+      <w:pStyle w:val="Footer"/>
+    </w:pPr>
+  </w:p>
+</w:ftr>
+</file>
+
+<file path=word/footer5.xml><?xml version="1.0" encoding="utf-8"?>
+<w:ftr xmlns:m="http://schemas.openxmlformats.org/officeDocument/2006/math" xmlns:mc="http://schemas.openxmlformats.org/markup-compatibility/2006" xmlns:mo="http://schemas.microsoft.com/office/mac/office/2008/main" xmlns:mv="urn:schemas-microsoft-com:mac:vml" xmlns:o="urn:schemas-microsoft-com:office:office" xmlns:r="http://schemas.openxmlformats.org/officeDocument/2006/relationships" xmlns:v="urn:schemas-microsoft-com:vml" xmlns:w10="urn:schemas-microsoft-com:office:word" xmlns:w14="http://schemas.microsoft.com/office/word/2010/wordml" xmlns:w="http://schemas.openxmlformats.org/wordprocessingml/2006/main" xmlns:wne="http://schemas.microsoft.com/office/word/2006/wordml" xmlns:wp14="http://schemas.microsoft.com/office/word/2010/wordprocessingDrawing" xmlns:wp="http://schemas.openxmlformats.org/drawingml/2006/wordprocessingDrawing" xmlns:wpc="http://schemas.microsoft.com/office/word/2010/wordprocessingCanvas" xmlns:wpg="http://schemas.microsoft.com/office/word/2010/wordprocessingGroup" xmlns:wpi="http://schemas.microsoft.com/office/word/2010/wordprocessingInk" xmlns:wps="http://schemas.microsoft.com/office/word/2010/wordprocessingShape" mc:Ignorable="w14 wp14">
+  <w:p>
+    <w:pPr>
+      <w:pStyle w:val="Footer"/>
+    </w:pPr>
+  </w:p>
+</w:ftr>
+</file>
+
+<file path=word/footer6.xml><?xml version="1.0" encoding="utf-8"?>
+<w:ftr xmlns:m="http://schemas.openxmlformats.org/officeDocument/2006/math" xmlns:mc="http://schemas.openxmlformats.org/markup-compatibility/2006" xmlns:mo="http://schemas.microsoft.com/office/mac/office/2008/main" xmlns:mv="urn:schemas-microsoft-com:mac:vml" xmlns:o="urn:schemas-microsoft-com:office:office" xmlns:r="http://schemas.openxmlformats.org/officeDocument/2006/relationships" xmlns:v="urn:schemas-microsoft-com:vml" xmlns:w10="urn:schemas-microsoft-com:office:word" xmlns:w14="http://schemas.microsoft.com/office/word/2010/wordml" xmlns:w="http://schemas.openxmlformats.org/wordprocessingml/2006/main" xmlns:wne="http://schemas.microsoft.com/office/word/2006/wordml" xmlns:wp14="http://schemas.microsoft.com/office/word/2010/wordprocessingDrawing" xmlns:wp="http://schemas.openxmlformats.org/drawingml/2006/wordprocessingDrawing" xmlns:wpc="http://schemas.microsoft.com/office/word/2010/wordprocessingCanvas" xmlns:wpg="http://schemas.microsoft.com/office/word/2010/wordprocessingGroup" xmlns:wpi="http://schemas.microsoft.com/office/word/2010/wordprocessingInk" xmlns:wps="http://schemas.microsoft.com/office/word/2010/wordprocessingShape" mc:Ignorable="w14 wp14">
+  <w:p>
+    <w:pPr>
+      <w:pStyle w:val="Footer"/>
+      <w:spacing w:line="240" w:lineRule="auto"/>
+      <w:ind w:firstLine="0" w:left="0" w:right="0"/>
+      <w:jc w:val="center"/>
+    </w:pPr>
+    <w:fldSimple w:instr="PAGE">
+      <w:r>
+        <w:rPr>
+          <w:rFonts w:ascii="Times New Roman" w:hAnsi="Times New Roman"/>
+          <w:sz w:val="24"/>
+        </w:rPr>
+        <w:t>2</w:t>
+      </w:r>
+    </w:fldSimple>
+  </w:p>
+</w:ftr>
+</file>
+
+<file path=word/footer7.xml><?xml version="1.0" encoding="utf-8"?>
+<w:ftr xmlns:m="http://schemas.openxmlformats.org/officeDocument/2006/math" xmlns:mc="http://schemas.openxmlformats.org/markup-compatibility/2006" xmlns:mo="http://schemas.microsoft.com/office/mac/office/2008/main" xmlns:mv="urn:schemas-microsoft-com:mac:vml" xmlns:o="urn:schemas-microsoft-com:office:office" xmlns:r="http://schemas.openxmlformats.org/officeDocument/2006/relationships" xmlns:v="urn:schemas-microsoft-com:vml" xmlns:w10="urn:schemas-microsoft-com:office:word" xmlns:w14="http://schemas.microsoft.com/office/word/2010/wordml" xmlns:w="http://schemas.openxmlformats.org/wordprocessingml/2006/main" xmlns:wne="http://schemas.microsoft.com/office/word/2006/wordml" xmlns:wp14="http://schemas.microsoft.com/office/word/2010/wordprocessingDrawing" xmlns:wp="http://schemas.openxmlformats.org/drawingml/2006/wordprocessingDrawing" xmlns:wpc="http://schemas.microsoft.com/office/word/2010/wordprocessingCanvas" xmlns:wpg="http://schemas.microsoft.com/office/word/2010/wordprocessingGroup" xmlns:wpi="http://schemas.microsoft.com/office/word/2010/wordprocessingInk" xmlns:wps="http://schemas.microsoft.com/office/word/2010/wordprocessingShape" mc:Ignorable="w14 wp14">
+  <w:p>
+    <w:pPr>
+      <w:pStyle w:val="Footer"/>
+    </w:pPr>
+  </w:p>
+</w:ftr>
+</file>
+
+<file path=word/footer8.xml><?xml version="1.0" encoding="utf-8"?>
+<w:ftr xmlns:m="http://schemas.openxmlformats.org/officeDocument/2006/math" xmlns:mc="http://schemas.openxmlformats.org/markup-compatibility/2006" xmlns:mo="http://schemas.microsoft.com/office/mac/office/2008/main" xmlns:mv="urn:schemas-microsoft-com:mac:vml" xmlns:o="urn:schemas-microsoft-com:office:office" xmlns:r="http://schemas.openxmlformats.org/officeDocument/2006/relationships" xmlns:v="urn:schemas-microsoft-com:vml" xmlns:w10="urn:schemas-microsoft-com:office:word" xmlns:w14="http://schemas.microsoft.com/office/word/2010/wordml" xmlns:w="http://schemas.openxmlformats.org/wordprocessingml/2006/main" xmlns:wne="http://schemas.microsoft.com/office/word/2006/wordml" xmlns:wp14="http://schemas.microsoft.com/office/word/2010/wordprocessingDrawing" xmlns:wp="http://schemas.openxmlformats.org/drawingml/2006/wordprocessingDrawing" xmlns:wpc="http://schemas.microsoft.com/office/word/2010/wordprocessingCanvas" xmlns:wpg="http://schemas.microsoft.com/office/word/2010/wordprocessingGroup" xmlns:wpi="http://schemas.microsoft.com/office/word/2010/wordprocessingInk" xmlns:wps="http://schemas.microsoft.com/office/word/2010/wordprocessingShape" mc:Ignorable="w14 wp14">
+  <w:p>
+    <w:pPr>
+      <w:pStyle w:val="Footer"/>
+      <w:spacing w:line="240" w:lineRule="auto"/>
+      <w:ind w:firstLine="0" w:left="0" w:right="0"/>
+      <w:jc w:val="center"/>
+    </w:pPr>
+    <w:fldSimple w:instr="PAGE">
+      <w:r>
+        <w:rPr>
+          <w:rFonts w:ascii="Times New Roman" w:hAnsi="Times New Roman"/>
+          <w:sz w:val="24"/>
+        </w:rPr>
+        <w:t>2</w:t>
+      </w:r>
+    </w:fldSimple>
+  </w:p>
+</w:ftr>
+</file>
+
+<file path=word/footer9.xml><?xml version="1.0" encoding="utf-8"?>
+<w:ftr xmlns:m="http://schemas.openxmlformats.org/officeDocument/2006/math" xmlns:mc="http://schemas.openxmlformats.org/markup-compatibility/2006" xmlns:mo="http://schemas.microsoft.com/office/mac/office/2008/main" xmlns:mv="urn:schemas-microsoft-com:mac:vml" xmlns:o="urn:schemas-microsoft-com:office:office" xmlns:r="http://schemas.openxmlformats.org/officeDocument/2006/relationships" xmlns:v="urn:schemas-microsoft-com:vml" xmlns:w10="urn:schemas-microsoft-com:office:word" xmlns:w14="http://schemas.microsoft.com/office/word/2010/wordml" xmlns:w="http://schemas.openxmlformats.org/wordprocessingml/2006/main" xmlns:wne="http://schemas.microsoft.com/office/word/2006/wordml" xmlns:wp14="http://schemas.microsoft.com/office/word/2010/wordprocessingDrawing" xmlns:wp="http://schemas.openxmlformats.org/drawingml/2006/wordprocessingDrawing" xmlns:wpc="http://schemas.microsoft.com/office/word/2010/wordprocessingCanvas" xmlns:wpg="http://schemas.microsoft.com/office/word/2010/wordprocessingGroup" xmlns:wpi="http://schemas.microsoft.com/office/word/2010/wordprocessingInk" xmlns:wps="http://schemas.microsoft.com/office/word/2010/wordprocessingShape" mc:Ignorable="w14 wp14">
+  <w:p>
+    <w:pPr>
+      <w:pStyle w:val="Footer"/>
+    </w:pPr>
   </w:p>
 </w:ftr>
 </file>
@@ -5322,6 +5578,56 @@
     </w:p>
   </w:footnote>
 </w:footnotes>
+</file>
+
+<file path=word/header1.xml><?xml version="1.0" encoding="utf-8"?>
+<w:hdr xmlns:m="http://schemas.openxmlformats.org/officeDocument/2006/math" xmlns:mc="http://schemas.openxmlformats.org/markup-compatibility/2006" xmlns:mo="http://schemas.microsoft.com/office/mac/office/2008/main" xmlns:mv="urn:schemas-microsoft-com:mac:vml" xmlns:o="urn:schemas-microsoft-com:office:office" xmlns:r="http://schemas.openxmlformats.org/officeDocument/2006/relationships" xmlns:v="urn:schemas-microsoft-com:vml" xmlns:w10="urn:schemas-microsoft-com:office:word" xmlns:w14="http://schemas.microsoft.com/office/word/2010/wordml" xmlns:w="http://schemas.openxmlformats.org/wordprocessingml/2006/main" xmlns:wne="http://schemas.microsoft.com/office/word/2006/wordml" xmlns:wp14="http://schemas.microsoft.com/office/word/2010/wordprocessingDrawing" xmlns:wp="http://schemas.openxmlformats.org/drawingml/2006/wordprocessingDrawing" xmlns:wpc="http://schemas.microsoft.com/office/word/2010/wordprocessingCanvas" xmlns:wpg="http://schemas.microsoft.com/office/word/2010/wordprocessingGroup" xmlns:wpi="http://schemas.microsoft.com/office/word/2010/wordprocessingInk" xmlns:wps="http://schemas.microsoft.com/office/word/2010/wordprocessingShape" mc:Ignorable="w14 wp14">
+  <w:p>
+    <w:pPr>
+      <w:pStyle w:val="Header"/>
+    </w:pPr>
+  </w:p>
+</w:hdr>
+</file>
+
+<file path=word/header2.xml><?xml version="1.0" encoding="utf-8"?>
+<w:hdr xmlns:m="http://schemas.openxmlformats.org/officeDocument/2006/math" xmlns:mc="http://schemas.openxmlformats.org/markup-compatibility/2006" xmlns:mo="http://schemas.microsoft.com/office/mac/office/2008/main" xmlns:mv="urn:schemas-microsoft-com:mac:vml" xmlns:o="urn:schemas-microsoft-com:office:office" xmlns:r="http://schemas.openxmlformats.org/officeDocument/2006/relationships" xmlns:v="urn:schemas-microsoft-com:vml" xmlns:w10="urn:schemas-microsoft-com:office:word" xmlns:w14="http://schemas.microsoft.com/office/word/2010/wordml" xmlns:w="http://schemas.openxmlformats.org/wordprocessingml/2006/main" xmlns:wne="http://schemas.microsoft.com/office/word/2006/wordml" xmlns:wp14="http://schemas.microsoft.com/office/word/2010/wordprocessingDrawing" xmlns:wp="http://schemas.openxmlformats.org/drawingml/2006/wordprocessingDrawing" xmlns:wpc="http://schemas.microsoft.com/office/word/2010/wordprocessingCanvas" xmlns:wpg="http://schemas.microsoft.com/office/word/2010/wordprocessingGroup" xmlns:wpi="http://schemas.microsoft.com/office/word/2010/wordprocessingInk" xmlns:wps="http://schemas.microsoft.com/office/word/2010/wordprocessingShape" mc:Ignorable="w14 wp14">
+  <w:p>
+    <w:pPr>
+      <w:pStyle w:val="Header"/>
+    </w:pPr>
+  </w:p>
+</w:hdr>
+</file>
+
+<file path=word/header3.xml><?xml version="1.0" encoding="utf-8"?>
+<w:hdr xmlns:m="http://schemas.openxmlformats.org/officeDocument/2006/math" xmlns:mc="http://schemas.openxmlformats.org/markup-compatibility/2006" xmlns:mo="http://schemas.microsoft.com/office/mac/office/2008/main" xmlns:mv="urn:schemas-microsoft-com:mac:vml" xmlns:o="urn:schemas-microsoft-com:office:office" xmlns:r="http://schemas.openxmlformats.org/officeDocument/2006/relationships" xmlns:v="urn:schemas-microsoft-com:vml" xmlns:w10="urn:schemas-microsoft-com:office:word" xmlns:w14="http://schemas.microsoft.com/office/word/2010/wordml" xmlns:w="http://schemas.openxmlformats.org/wordprocessingml/2006/main" xmlns:wne="http://schemas.microsoft.com/office/word/2006/wordml" xmlns:wp14="http://schemas.microsoft.com/office/word/2010/wordprocessingDrawing" xmlns:wp="http://schemas.openxmlformats.org/drawingml/2006/wordprocessingDrawing" xmlns:wpc="http://schemas.microsoft.com/office/word/2010/wordprocessingCanvas" xmlns:wpg="http://schemas.microsoft.com/office/word/2010/wordprocessingGroup" xmlns:wpi="http://schemas.microsoft.com/office/word/2010/wordprocessingInk" xmlns:wps="http://schemas.microsoft.com/office/word/2010/wordprocessingShape" mc:Ignorable="w14 wp14">
+  <w:p>
+    <w:pPr>
+      <w:pStyle w:val="Header"/>
+    </w:pPr>
+  </w:p>
+</w:hdr>
+</file>
+
+<file path=word/header4.xml><?xml version="1.0" encoding="utf-8"?>
+<w:hdr xmlns:m="http://schemas.openxmlformats.org/officeDocument/2006/math" xmlns:mc="http://schemas.openxmlformats.org/markup-compatibility/2006" xmlns:mo="http://schemas.microsoft.com/office/mac/office/2008/main" xmlns:mv="urn:schemas-microsoft-com:mac:vml" xmlns:o="urn:schemas-microsoft-com:office:office" xmlns:r="http://schemas.openxmlformats.org/officeDocument/2006/relationships" xmlns:v="urn:schemas-microsoft-com:vml" xmlns:w10="urn:schemas-microsoft-com:office:word" xmlns:w14="http://schemas.microsoft.com/office/word/2010/wordml" xmlns:w="http://schemas.openxmlformats.org/wordprocessingml/2006/main" xmlns:wne="http://schemas.microsoft.com/office/word/2006/wordml" xmlns:wp14="http://schemas.microsoft.com/office/word/2010/wordprocessingDrawing" xmlns:wp="http://schemas.openxmlformats.org/drawingml/2006/wordprocessingDrawing" xmlns:wpc="http://schemas.microsoft.com/office/word/2010/wordprocessingCanvas" xmlns:wpg="http://schemas.microsoft.com/office/word/2010/wordprocessingGroup" xmlns:wpi="http://schemas.microsoft.com/office/word/2010/wordprocessingInk" xmlns:wps="http://schemas.microsoft.com/office/word/2010/wordprocessingShape" mc:Ignorable="w14 wp14">
+  <w:p>
+    <w:pPr>
+      <w:pStyle w:val="Header"/>
+    </w:pPr>
+  </w:p>
+</w:hdr>
+</file>
+
+<file path=word/header5.xml><?xml version="1.0" encoding="utf-8"?>
+<w:hdr xmlns:m="http://schemas.openxmlformats.org/officeDocument/2006/math" xmlns:mc="http://schemas.openxmlformats.org/markup-compatibility/2006" xmlns:mo="http://schemas.microsoft.com/office/mac/office/2008/main" xmlns:mv="urn:schemas-microsoft-com:mac:vml" xmlns:o="urn:schemas-microsoft-com:office:office" xmlns:r="http://schemas.openxmlformats.org/officeDocument/2006/relationships" xmlns:v="urn:schemas-microsoft-com:vml" xmlns:w10="urn:schemas-microsoft-com:office:word" xmlns:w14="http://schemas.microsoft.com/office/word/2010/wordml" xmlns:w="http://schemas.openxmlformats.org/wordprocessingml/2006/main" xmlns:wne="http://schemas.microsoft.com/office/word/2006/wordml" xmlns:wp14="http://schemas.microsoft.com/office/word/2010/wordprocessingDrawing" xmlns:wp="http://schemas.openxmlformats.org/drawingml/2006/wordprocessingDrawing" xmlns:wpc="http://schemas.microsoft.com/office/word/2010/wordprocessingCanvas" xmlns:wpg="http://schemas.microsoft.com/office/word/2010/wordprocessingGroup" xmlns:wpi="http://schemas.microsoft.com/office/word/2010/wordprocessingInk" xmlns:wps="http://schemas.microsoft.com/office/word/2010/wordprocessingShape" mc:Ignorable="w14 wp14">
+  <w:p>
+    <w:pPr>
+      <w:pStyle w:val="Header"/>
+    </w:pPr>
+  </w:p>
+</w:hdr>
 </file>
 
 <file path=word/numbering.xml><?xml version="1.0" encoding="utf-8"?>

</xml_diff>

<commit_message>
fix: verify ROP IM and PPOIS reports and native diagrams
</commit_message>
<xml_diff>
--- a/4/ППОИС/ППОИС_2_АлбахтинИВ.docx
+++ b/4/ППОИС/ППОИС_2_АлбахтинИВ.docx
@@ -42,7 +42,7 @@
             </w:pPr>
             <w:r>
               <w:rPr>
-                <w:rFonts w:ascii="Liberation Serif" w:eastAsia="Droid Sans Fallback" w:hAnsi="Liberation Serif" w:cs="FreeSans"/>
+                <w:rFonts w:ascii="Times New Roman" w:eastAsia="Droid Sans Fallback" w:hAnsi="Times New Roman" w:cs="FreeSans"/>
                 <w:iCs/>
                 <w:noProof/>
                 <w:sz w:val="24"/>
@@ -136,7 +136,7 @@
               <w:ind w:firstLine="0"/>
               <w:jc w:val="center"/>
               <w:rPr>
-                <w:rFonts w:ascii="Liberation Serif" w:eastAsia="Droid Sans Fallback" w:hAnsi="Liberation Serif" w:cs="FreeSans"/>
+                <w:rFonts w:ascii="Times New Roman" w:eastAsia="Droid Sans Fallback" w:hAnsi="Times New Roman" w:cs="FreeSans"/>
                 <w:b/>
                 <w:i/>
                 <w:iCs/>
@@ -146,7 +146,7 @@
             </w:pPr>
             <w:r>
               <w:rPr>
-                <w:rFonts w:ascii="Liberation Serif" w:eastAsia="Droid Sans Fallback" w:hAnsi="Liberation Serif" w:cs="FreeSans"/>
+                <w:rFonts w:ascii="Times New Roman" w:eastAsia="Droid Sans Fallback" w:hAnsi="Times New Roman" w:cs="FreeSans"/>
                 <w:sz w:val="24"/>
                 <w:lang w:val="ru-RU" w:eastAsia="zh-CN" w:bidi="hi-IN"/>
               </w:rPr>
@@ -154,7 +154,7 @@
             </w:r>
             <w:r>
               <w:rPr>
-                <w:rFonts w:ascii="Liberation Serif" w:eastAsia="Droid Sans Fallback" w:hAnsi="Liberation Serif" w:cs="FreeSans"/>
+                <w:rFonts w:ascii="Times New Roman" w:eastAsia="Droid Sans Fallback" w:hAnsi="Times New Roman" w:cs="FreeSans"/>
                 <w:sz w:val="24"/>
                 <w:lang w:val="ru-RU" w:eastAsia="zh-CN" w:bidi="hi-IN"/>
               </w:rPr>
@@ -163,7 +163,7 @@
             </w:r>
             <w:r>
               <w:rPr>
-                <w:rFonts w:ascii="Liberation Serif" w:eastAsia="Droid Sans Fallback" w:hAnsi="Liberation Serif" w:cs="FreeSans"/>
+                <w:rFonts w:ascii="Times New Roman" w:eastAsia="Droid Sans Fallback" w:hAnsi="Times New Roman" w:cs="FreeSans"/>
                 <w:sz w:val="24"/>
                 <w:lang w:val="ru-RU" w:eastAsia="zh-CN" w:bidi="hi-IN"/>
               </w:rPr>
@@ -681,7 +681,7 @@
               <w:ind w:firstLine="0"/>
               <w:jc w:val="left"/>
               <w:rPr>
-                <w:rFonts w:ascii="Liberation Serif" w:eastAsia="Droid Sans Fallback" w:hAnsi="Liberation Serif"/>
+                <w:rFonts w:ascii="Times New Roman" w:eastAsia="Droid Sans Fallback" w:hAnsi="Times New Roman"/>
                 <w:sz w:val="24"/>
                 <w:szCs w:val="24"/>
                 <w:lang w:eastAsia="zh-CN" w:bidi="hi-IN"/>
@@ -689,7 +689,7 @@
             </w:pPr>
             <w:r>
               <w:rPr>
-                <w:rFonts w:ascii="Liberation Serif" w:eastAsia="Droid Sans Fallback" w:hAnsi="Liberation Serif"/>
+                <w:rFonts w:ascii="Times New Roman" w:eastAsia="Droid Sans Fallback" w:hAnsi="Times New Roman"/>
                 <w:sz w:val="24"/>
                 <w:szCs w:val="24"/>
                 <w:lang w:eastAsia="zh-CN" w:bidi="hi-IN"/>
@@ -705,7 +705,7 @@
               <w:ind w:firstLine="0"/>
               <w:jc w:val="left"/>
               <w:rPr>
-                <w:rFonts w:ascii="Liberation Serif" w:eastAsia="Droid Sans Fallback" w:hAnsi="Liberation Serif"/>
+                <w:rFonts w:ascii="Times New Roman" w:eastAsia="Droid Sans Fallback" w:hAnsi="Times New Roman"/>
                 <w:sz w:val="24"/>
                 <w:szCs w:val="24"/>
                 <w:lang w:eastAsia="zh-CN" w:bidi="hi-IN"/>
@@ -726,7 +726,7 @@
               <w:ind w:firstLine="0"/>
               <w:jc w:val="left"/>
               <w:rPr>
-                <w:rFonts w:ascii="Liberation Serif" w:eastAsia="Droid Sans Fallback" w:hAnsi="Liberation Serif"/>
+                <w:rFonts w:ascii="Times New Roman" w:eastAsia="Droid Sans Fallback" w:hAnsi="Times New Roman"/>
                 <w:iCs/>
                 <w:sz w:val="24"/>
                 <w:szCs w:val="24"/>
@@ -735,7 +735,7 @@
             </w:pPr>
             <w:r>
               <w:rPr>
-                <w:rFonts w:ascii="Liberation Serif" w:eastAsia="Droid Sans Fallback" w:hAnsi="Liberation Serif"/>
+                <w:rFonts w:ascii="Times New Roman" w:eastAsia="Droid Sans Fallback" w:hAnsi="Times New Roman"/>
                 <w:sz w:val="24"/>
                 <w:szCs w:val="24"/>
                 <w:lang w:eastAsia="zh-CN" w:bidi="hi-IN"/>
@@ -745,7 +745,7 @@
             <w:proofErr w:type="spellStart"/>
             <w:r>
               <w:rPr>
-                <w:rFonts w:ascii="Liberation Serif" w:eastAsia="Droid Sans Fallback" w:hAnsi="Liberation Serif"/>
+                <w:rFonts w:ascii="Times New Roman" w:eastAsia="Droid Sans Fallback" w:hAnsi="Times New Roman"/>
                 <w:sz w:val="24"/>
                 <w:szCs w:val="24"/>
                 <w:lang w:eastAsia="zh-CN" w:bidi="hi-IN"/>
@@ -755,7 +755,7 @@
             <w:proofErr w:type="spellEnd"/>
             <w:r>
               <w:rPr>
-                <w:rFonts w:ascii="Liberation Serif" w:eastAsia="Droid Sans Fallback" w:hAnsi="Liberation Serif"/>
+                <w:rFonts w:ascii="Times New Roman" w:eastAsia="Droid Sans Fallback" w:hAnsi="Times New Roman"/>
                 <w:sz w:val="24"/>
                 <w:szCs w:val="24"/>
                 <w:lang w:eastAsia="zh-CN" w:bidi="hi-IN"/>
@@ -764,7 +764,7 @@
             </w:r>
             <w:r>
               <w:rPr>
-                <w:rFonts w:ascii="Liberation Serif" w:eastAsia="Droid Sans Fallback" w:hAnsi="Liberation Serif"/>
+                <w:rFonts w:ascii="Times New Roman" w:eastAsia="Droid Sans Fallback" w:hAnsi="Times New Roman"/>
                 <w:sz w:val="24"/>
                 <w:szCs w:val="24"/>
                 <w:lang w:eastAsia="zh-CN" w:bidi="hi-IN"/>
@@ -773,7 +773,7 @@
             </w:r>
             <w:r>
               <w:rPr>
-                <w:rFonts w:ascii="Liberation Serif" w:eastAsia="Droid Sans Fallback" w:hAnsi="Liberation Serif"/>
+                <w:rFonts w:ascii="Times New Roman" w:eastAsia="Droid Sans Fallback" w:hAnsi="Times New Roman"/>
                 <w:sz w:val="24"/>
                 <w:szCs w:val="24"/>
                 <w:lang w:eastAsia="zh-CN" w:bidi="hi-IN"/>
@@ -799,7 +799,7 @@
               <w:ind w:firstLine="0"/>
               <w:jc w:val="left"/>
               <w:rPr>
-                <w:rFonts w:ascii="Liberation Serif" w:eastAsia="Droid Sans Fallback" w:hAnsi="Liberation Serif"/>
+                <w:rFonts w:ascii="Times New Roman" w:eastAsia="Droid Sans Fallback" w:hAnsi="Times New Roman"/>
                 <w:sz w:val="24"/>
                 <w:szCs w:val="24"/>
                 <w:lang w:eastAsia="zh-CN" w:bidi="hi-IN"/>
@@ -814,7 +814,7 @@
               <w:ind w:firstLine="0"/>
               <w:jc w:val="center"/>
               <w:rPr>
-                <w:rFonts w:ascii="Liberation Serif" w:eastAsia="Droid Sans Fallback" w:hAnsi="Liberation Serif"/>
+                <w:rFonts w:ascii="Times New Roman" w:eastAsia="Droid Sans Fallback" w:hAnsi="Times New Roman"/>
                 <w:sz w:val="24"/>
                 <w:szCs w:val="24"/>
                 <w:lang w:eastAsia="zh-CN" w:bidi="hi-IN"/>
@@ -822,7 +822,7 @@
             </w:pPr>
             <w:r>
               <w:rPr>
-                <w:rFonts w:ascii="Liberation Serif" w:eastAsia="Droid Sans Fallback" w:hAnsi="Liberation Serif"/>
+                <w:rFonts w:ascii="Times New Roman" w:eastAsia="Droid Sans Fallback" w:hAnsi="Times New Roman"/>
                 <w:sz w:val="18"/>
                 <w:szCs w:val="18"/>
                 <w:lang w:eastAsia="zh-CN" w:bidi="hi-IN"/>
@@ -837,7 +837,7 @@
               <w:spacing w:line="240" w:lineRule="auto"/>
               <w:ind w:firstLine="0"/>
               <w:rPr>
-                <w:rFonts w:ascii="Liberation Serif" w:eastAsia="Droid Sans Fallback" w:hAnsi="Liberation Serif"/>
+                <w:rFonts w:ascii="Times New Roman" w:eastAsia="Droid Sans Fallback" w:hAnsi="Times New Roman"/>
                 <w:sz w:val="24"/>
                 <w:szCs w:val="24"/>
                 <w:lang w:eastAsia="zh-CN" w:bidi="hi-IN"/>
@@ -864,7 +864,7 @@
               <w:ind w:firstLine="0"/>
               <w:jc w:val="left"/>
               <w:rPr>
-                <w:rFonts w:ascii="Liberation Serif" w:eastAsia="Droid Sans Fallback" w:hAnsi="Liberation Serif"/>
+                <w:rFonts w:ascii="Times New Roman" w:eastAsia="Droid Sans Fallback" w:hAnsi="Times New Roman"/>
                 <w:sz w:val="24"/>
                 <w:szCs w:val="24"/>
                 <w:lang w:eastAsia="zh-CN" w:bidi="hi-IN"/>
@@ -872,7 +872,7 @@
             </w:pPr>
             <w:r>
               <w:rPr>
-                <w:rFonts w:ascii="Liberation Serif" w:eastAsia="Droid Sans Fallback" w:hAnsi="Liberation Serif"/>
+                <w:rFonts w:ascii="Times New Roman" w:eastAsia="Droid Sans Fallback" w:hAnsi="Times New Roman"/>
                 <w:sz w:val="24"/>
                 <w:szCs w:val="24"/>
                 <w:lang w:eastAsia="zh-CN" w:bidi="hi-IN"/>
@@ -888,7 +888,7 @@
               <w:ind w:firstLine="0"/>
               <w:jc w:val="left"/>
               <w:rPr>
-                <w:rFonts w:ascii="Liberation Serif" w:eastAsia="Droid Sans Fallback" w:hAnsi="Liberation Serif"/>
+                <w:rFonts w:ascii="Times New Roman" w:eastAsia="Droid Sans Fallback" w:hAnsi="Times New Roman"/>
                 <w:sz w:val="24"/>
                 <w:szCs w:val="24"/>
                 <w:lang w:eastAsia="zh-CN" w:bidi="hi-IN"/>
@@ -909,7 +909,7 @@
               <w:ind w:firstLine="0"/>
               <w:jc w:val="left"/>
               <w:rPr>
-                <w:rFonts w:ascii="Liberation Serif" w:eastAsia="Droid Sans Fallback" w:hAnsi="Liberation Serif"/>
+                <w:rFonts w:ascii="Times New Roman" w:eastAsia="Droid Sans Fallback" w:hAnsi="Times New Roman"/>
                 <w:iCs/>
                 <w:sz w:val="24"/>
                 <w:szCs w:val="24"/>
@@ -918,7 +918,7 @@
             </w:pPr>
             <w:r>
               <w:rPr>
-                <w:rFonts w:ascii="Liberation Serif" w:eastAsia="Droid Sans Fallback" w:hAnsi="Liberation Serif"/>
+                <w:rFonts w:ascii="Times New Roman" w:eastAsia="Droid Sans Fallback" w:hAnsi="Times New Roman"/>
                 <w:sz w:val="24"/>
                 <w:szCs w:val="24"/>
                 <w:lang w:eastAsia="zh-CN" w:bidi="hi-IN"/>
@@ -934,7 +934,7 @@
               <w:ind w:firstLine="0"/>
               <w:jc w:val="left"/>
               <w:rPr>
-                <w:rFonts w:ascii="Liberation Serif" w:eastAsia="Droid Sans Fallback" w:hAnsi="Liberation Serif"/>
+                <w:rFonts w:ascii="Times New Roman" w:eastAsia="Droid Sans Fallback" w:hAnsi="Times New Roman"/>
                 <w:sz w:val="24"/>
                 <w:szCs w:val="24"/>
                 <w:lang w:eastAsia="zh-CN" w:bidi="hi-IN"/>
@@ -959,7 +959,7 @@
               <w:ind w:firstLine="0"/>
               <w:jc w:val="left"/>
               <w:rPr>
-                <w:rFonts w:ascii="Liberation Serif" w:eastAsia="Droid Sans Fallback" w:hAnsi="Liberation Serif"/>
+                <w:rFonts w:ascii="Times New Roman" w:eastAsia="Droid Sans Fallback" w:hAnsi="Times New Roman"/>
                 <w:sz w:val="24"/>
                 <w:szCs w:val="24"/>
                 <w:lang w:eastAsia="zh-CN" w:bidi="hi-IN"/>
@@ -977,7 +977,7 @@
               <w:ind w:firstLine="0"/>
               <w:jc w:val="left"/>
               <w:rPr>
-                <w:rFonts w:ascii="Liberation Serif" w:eastAsia="Droid Sans Fallback" w:hAnsi="Liberation Serif"/>
+                <w:rFonts w:ascii="Times New Roman" w:eastAsia="Droid Sans Fallback" w:hAnsi="Times New Roman"/>
                 <w:sz w:val="24"/>
                 <w:szCs w:val="24"/>
                 <w:lang w:eastAsia="zh-CN" w:bidi="hi-IN"/>
@@ -992,7 +992,7 @@
               <w:ind w:firstLine="0"/>
               <w:jc w:val="center"/>
               <w:rPr>
-                <w:rFonts w:ascii="Liberation Serif" w:eastAsia="Droid Sans Fallback" w:hAnsi="Liberation Serif"/>
+                <w:rFonts w:ascii="Times New Roman" w:eastAsia="Droid Sans Fallback" w:hAnsi="Times New Roman"/>
                 <w:sz w:val="24"/>
                 <w:szCs w:val="24"/>
                 <w:lang w:eastAsia="zh-CN" w:bidi="hi-IN"/>
@@ -1000,7 +1000,7 @@
             </w:pPr>
             <w:r>
               <w:rPr>
-                <w:rFonts w:ascii="Liberation Serif" w:eastAsia="Droid Sans Fallback" w:hAnsi="Liberation Serif"/>
+                <w:rFonts w:ascii="Times New Roman" w:eastAsia="Droid Sans Fallback" w:hAnsi="Times New Roman"/>
                 <w:sz w:val="18"/>
                 <w:szCs w:val="18"/>
                 <w:lang w:eastAsia="zh-CN" w:bidi="hi-IN"/>
@@ -1015,7 +1015,7 @@
               <w:spacing w:line="240" w:lineRule="auto"/>
               <w:ind w:firstLine="0"/>
               <w:rPr>
-                <w:rFonts w:ascii="Liberation Serif" w:eastAsia="Droid Sans Fallback" w:hAnsi="Liberation Serif"/>
+                <w:rFonts w:ascii="Times New Roman" w:eastAsia="Droid Sans Fallback" w:hAnsi="Times New Roman"/>
                 <w:sz w:val="24"/>
                 <w:szCs w:val="24"/>
                 <w:lang w:eastAsia="zh-CN" w:bidi="hi-IN"/>
@@ -1038,7 +1038,7 @@
               <w:ind w:firstLine="0"/>
               <w:jc w:val="left"/>
               <w:rPr>
-                <w:rFonts w:ascii="Liberation Serif" w:eastAsia="Droid Sans Fallback" w:hAnsi="Liberation Serif"/>
+                <w:rFonts w:ascii="Times New Roman" w:eastAsia="Droid Sans Fallback" w:hAnsi="Times New Roman"/>
                 <w:sz w:val="24"/>
                 <w:szCs w:val="24"/>
                 <w:lang w:eastAsia="zh-CN" w:bidi="hi-IN"/>
@@ -1060,7 +1060,7 @@
               <w:ind w:firstLine="0"/>
               <w:jc w:val="left"/>
               <w:rPr>
-                <w:rFonts w:ascii="Liberation Serif" w:eastAsia="Droid Sans Fallback" w:hAnsi="Liberation Serif"/>
+                <w:rFonts w:ascii="Times New Roman" w:eastAsia="Droid Sans Fallback" w:hAnsi="Times New Roman"/>
                 <w:sz w:val="24"/>
                 <w:szCs w:val="24"/>
                 <w:lang w:eastAsia="zh-CN" w:bidi="hi-IN"/>
@@ -1081,7 +1081,7 @@
               <w:spacing w:line="240" w:lineRule="auto"/>
               <w:ind w:firstLine="0"/>
               <w:rPr>
-                <w:rFonts w:ascii="Liberation Serif" w:eastAsia="Droid Sans Fallback" w:hAnsi="Liberation Serif"/>
+                <w:rFonts w:ascii="Times New Roman" w:eastAsia="Droid Sans Fallback" w:hAnsi="Times New Roman"/>
                 <w:sz w:val="24"/>
                 <w:szCs w:val="24"/>
                 <w:lang w:eastAsia="zh-CN" w:bidi="hi-IN"/>
@@ -1098,7 +1098,7 @@
         <w:spacing w:line="240" w:lineRule="auto"/>
         <w:ind w:firstLine="0"/>
         <w:rPr>
-          <w:rFonts w:ascii="Liberation Serif" w:eastAsia="Droid Sans Fallback" w:hAnsi="Liberation Serif"/>
+          <w:rFonts w:ascii="Times New Roman" w:eastAsia="Droid Sans Fallback" w:hAnsi="Times New Roman"/>
           <w:iCs/>
           <w:sz w:val="24"/>
           <w:szCs w:val="28"/>
@@ -1114,7 +1114,7 @@
         <w:ind w:firstLine="0"/>
         <w:jc w:val="center"/>
         <w:rPr>
-          <w:rFonts w:ascii="Liberation Serif" w:eastAsia="Droid Sans Fallback" w:hAnsi="Liberation Serif"/>
+          <w:rFonts w:ascii="Times New Roman" w:eastAsia="Droid Sans Fallback" w:hAnsi="Times New Roman"/>
           <w:iCs/>
           <w:sz w:val="24"/>
           <w:szCs w:val="28"/>
@@ -1130,7 +1130,7 @@
         <w:ind w:firstLine="0"/>
         <w:jc w:val="center"/>
         <w:rPr>
-          <w:rFonts w:ascii="Liberation Serif" w:eastAsia="Droid Sans Fallback" w:hAnsi="Liberation Serif"/>
+          <w:rFonts w:ascii="Times New Roman" w:eastAsia="Droid Sans Fallback" w:hAnsi="Times New Roman"/>
           <w:iCs/>
           <w:sz w:val="24"/>
           <w:szCs w:val="28"/>
@@ -1146,7 +1146,7 @@
         <w:ind w:firstLine="0"/>
         <w:jc w:val="center"/>
         <w:rPr>
-          <w:rFonts w:ascii="Liberation Serif" w:eastAsia="Droid Sans Fallback" w:hAnsi="Liberation Serif"/>
+          <w:rFonts w:ascii="Times New Roman" w:eastAsia="Droid Sans Fallback" w:hAnsi="Times New Roman"/>
           <w:iCs/>
           <w:sz w:val="24"/>
           <w:szCs w:val="28"/>
@@ -1162,7 +1162,7 @@
         <w:ind w:firstLine="0"/>
         <w:jc w:val="center"/>
         <w:rPr>
-          <w:rFonts w:ascii="Liberation Serif" w:eastAsia="Droid Sans Fallback" w:hAnsi="Liberation Serif"/>
+          <w:rFonts w:ascii="Times New Roman" w:eastAsia="Droid Sans Fallback" w:hAnsi="Times New Roman"/>
           <w:iCs/>
           <w:sz w:val="24"/>
           <w:szCs w:val="28"/>
@@ -1178,7 +1178,7 @@
         <w:ind w:firstLine="0"/>
         <w:jc w:val="center"/>
         <w:rPr>
-          <w:rFonts w:ascii="Liberation Serif" w:eastAsia="Droid Sans Fallback" w:hAnsi="Liberation Serif"/>
+          <w:rFonts w:ascii="Times New Roman" w:eastAsia="Droid Sans Fallback" w:hAnsi="Times New Roman"/>
           <w:iCs/>
           <w:sz w:val="24"/>
           <w:szCs w:val="28"/>
@@ -1194,7 +1194,7 @@
         <w:ind w:firstLine="0"/>
         <w:jc w:val="center"/>
         <w:rPr>
-          <w:rFonts w:ascii="Liberation Serif" w:eastAsia="Droid Sans Fallback" w:hAnsi="Liberation Serif"/>
+          <w:rFonts w:ascii="Times New Roman" w:eastAsia="Droid Sans Fallback" w:hAnsi="Times New Roman"/>
           <w:iCs/>
           <w:sz w:val="24"/>
           <w:szCs w:val="28"/>
@@ -1210,7 +1210,7 @@
         <w:ind w:firstLine="0"/>
         <w:jc w:val="center"/>
         <w:rPr>
-          <w:rFonts w:ascii="Liberation Serif" w:eastAsia="Droid Sans Fallback" w:hAnsi="Liberation Serif"/>
+          <w:rFonts w:ascii="Times New Roman" w:eastAsia="Droid Sans Fallback" w:hAnsi="Times New Roman"/>
           <w:iCs/>
           <w:sz w:val="24"/>
           <w:szCs w:val="28"/>
@@ -1226,7 +1226,7 @@
         <w:ind w:firstLine="0"/>
         <w:jc w:val="center"/>
         <w:rPr>
-          <w:rFonts w:ascii="Liberation Serif" w:eastAsia="Droid Sans Fallback" w:hAnsi="Liberation Serif"/>
+          <w:rFonts w:ascii="Times New Roman" w:eastAsia="Droid Sans Fallback" w:hAnsi="Times New Roman"/>
           <w:iCs/>
           <w:sz w:val="24"/>
           <w:szCs w:val="28"/>
@@ -1247,7 +1247,7 @@
       <w:proofErr w:type="spellStart"/>
       <w:r>
         <w:rPr>
-          <w:rFonts w:ascii="Liberation Serif" w:eastAsia="Droid Sans Fallback" w:hAnsi="Liberation Serif"/>
+          <w:rFonts w:ascii="Times New Roman" w:eastAsia="Droid Sans Fallback" w:hAnsi="Times New Roman"/>
           <w:sz w:val="24"/>
           <w:szCs w:val="28"/>
           <w:lang w:eastAsia="zh-CN" w:bidi="hi-IN"/>
@@ -1257,7 +1257,7 @@
       <w:proofErr w:type="spellEnd"/>
       <w:r>
         <w:rPr>
-          <w:rFonts w:ascii="Liberation Serif" w:eastAsia="Droid Sans Fallback" w:hAnsi="Liberation Serif"/>
+          <w:rFonts w:ascii="Times New Roman" w:eastAsia="Droid Sans Fallback" w:hAnsi="Times New Roman"/>
           <w:sz w:val="24"/>
           <w:szCs w:val="28"/>
           <w:lang w:eastAsia="zh-CN" w:bidi="hi-IN"/>
@@ -1270,14 +1270,17 @@
         <w:pStyle w:val="1"/>
         <w:keepNext/>
         <w:keepLines/>
+        <w:widowControl/>
         <w:spacing w:before="240" w:after="120" w:line="360" w:lineRule="auto"/>
         <w:ind w:left="0" w:right="0" w:firstLine="0"/>
         <w:jc w:val="center"/>
       </w:pPr>
       <w:r>
         <w:rPr>
-          <w:rFonts w:ascii="Times New Roman" w:hAnsi="Times New Roman" w:eastAsia="Times New Roman"/>
+          <w:rFonts w:ascii="Times New Roman" w:hAnsi="Times New Roman" w:eastAsia="Times New Roman" w:cs="Times New Roman"/>
           <w:b/>
+          <w:i w:val="0"/>
+          <w:color w:val="000000"/>
           <w:sz w:val="28"/>
         </w:rPr>
         <w:t>ПРАКТИЧЕСКАЯ РАБОТА № 2</w:t>
@@ -1285,14 +1288,20 @@
     </w:p>
     <w:p>
       <w:pPr>
+        <w:pStyle w:val="1"/>
         <w:keepNext/>
-        <w:spacing w:after="120"/>
+        <w:keepLines/>
+        <w:widowControl/>
+        <w:spacing w:after="120" w:before="240" w:line="360" w:lineRule="auto"/>
+        <w:ind w:left="0" w:right="0" w:firstLine="0"/>
         <w:jc w:val="center"/>
       </w:pPr>
       <w:r>
         <w:rPr>
-          <w:rFonts w:ascii="Times New Roman" w:hAnsi="Times New Roman" w:eastAsia="Times New Roman"/>
+          <w:rFonts w:ascii="Times New Roman" w:hAnsi="Times New Roman" w:eastAsia="Times New Roman" w:cs="Times New Roman"/>
           <w:b/>
+          <w:i w:val="0"/>
+          <w:color w:val="000000"/>
           <w:sz w:val="28"/>
         </w:rPr>
         <w:t>Формирование функциональных требований ИС (структурный анализ)</w:t>
@@ -1303,14 +1312,17 @@
         <w:pStyle w:val="1"/>
         <w:keepNext/>
         <w:keepLines/>
+        <w:widowControl/>
         <w:spacing w:before="240" w:after="120" w:line="360" w:lineRule="auto"/>
         <w:ind w:left="0" w:right="0" w:firstLine="0"/>
         <w:jc w:val="center"/>
       </w:pPr>
       <w:r>
         <w:rPr>
-          <w:rFonts w:ascii="Times New Roman" w:hAnsi="Times New Roman" w:eastAsia="Times New Roman"/>
+          <w:rFonts w:ascii="Times New Roman" w:hAnsi="Times New Roman" w:eastAsia="Times New Roman" w:cs="Times New Roman"/>
           <w:b/>
+          <w:i w:val="0"/>
+          <w:color w:val="000000"/>
           <w:sz w:val="28"/>
         </w:rPr>
         <w:t>1 Цель работы и индивидуальное задание</w:t>
@@ -1318,6 +1330,8 @@
     </w:p>
     <w:p>
       <w:pPr>
+        <w:keepNext w:val="0"/>
+        <w:keepLines w:val="0"/>
         <w:widowControl/>
         <w:spacing w:before="0" w:after="0" w:line="360" w:lineRule="auto"/>
         <w:ind w:left="0" w:right="0" w:firstLine="709"/>
@@ -1325,7 +1339,10 @@
       </w:pPr>
       <w:r>
         <w:rPr>
-          <w:rFonts w:ascii="Times New Roman" w:hAnsi="Times New Roman" w:eastAsia="Times New Roman"/>
+          <w:rFonts w:ascii="Times New Roman" w:hAnsi="Times New Roman" w:eastAsia="Times New Roman" w:cs="Times New Roman"/>
+          <w:b w:val="0"/>
+          <w:i w:val="0"/>
+          <w:color w:val="000000"/>
           <w:sz w:val="28"/>
         </w:rPr>
         <w:t>Цель работы – построить бизнес-модели процессов проектируемой информационной системы в нотации IDEF0 и определить связь операций, исполнителей и документов.</w:t>
@@ -1333,6 +1350,8 @@
     </w:p>
     <w:p>
       <w:pPr>
+        <w:keepNext w:val="0"/>
+        <w:keepLines w:val="0"/>
         <w:widowControl/>
         <w:spacing w:before="0" w:after="0" w:line="360" w:lineRule="auto"/>
         <w:ind w:left="0" w:right="0" w:firstLine="709"/>
@@ -1340,7 +1359,10 @@
       </w:pPr>
       <w:r>
         <w:rPr>
-          <w:rFonts w:ascii="Times New Roman" w:hAnsi="Times New Roman" w:eastAsia="Times New Roman"/>
+          <w:rFonts w:ascii="Times New Roman" w:hAnsi="Times New Roman" w:eastAsia="Times New Roman" w:cs="Times New Roman"/>
+          <w:b w:val="0"/>
+          <w:i w:val="0"/>
+          <w:color w:val="000000"/>
           <w:sz w:val="28"/>
         </w:rPr>
         <w:t>Индивидуальное задание: разработать контекстную диаграмму, декомпозицию контекстной диаграммы и детализацию процесса «Сформировать BOM и сопоставить товары поставщиков» для проекта «ИС поддержки бизнес-процесса формирования и актуализации карточек товаров компьютерных систем в ООО «Юкомс»».</w:t>
@@ -1351,14 +1373,17 @@
         <w:pStyle w:val="1"/>
         <w:keepNext/>
         <w:keepLines/>
+        <w:widowControl/>
         <w:spacing w:before="240" w:after="120" w:line="360" w:lineRule="auto"/>
         <w:ind w:left="0" w:right="0" w:firstLine="0"/>
         <w:jc w:val="center"/>
       </w:pPr>
       <w:r>
         <w:rPr>
-          <w:rFonts w:ascii="Times New Roman" w:hAnsi="Times New Roman" w:eastAsia="Times New Roman"/>
+          <w:rFonts w:ascii="Times New Roman" w:hAnsi="Times New Roman" w:eastAsia="Times New Roman" w:cs="Times New Roman"/>
           <w:b/>
+          <w:i w:val="0"/>
+          <w:color w:val="000000"/>
           <w:sz w:val="28"/>
         </w:rPr>
         <w:t>2 Этапы выполнения работы</w:t>
@@ -1367,14 +1392,19 @@
     <w:p>
       <w:pPr>
         <w:pStyle w:val="a0"/>
+        <w:keepNext w:val="0"/>
+        <w:keepLines w:val="0"/>
         <w:widowControl/>
         <w:spacing w:before="0" w:after="0" w:line="360" w:lineRule="auto"/>
-        <w:ind w:left="709" w:hanging="357"/>
+        <w:ind w:left="0" w:right="0" w:firstLine="709"/>
         <w:jc w:val="both"/>
       </w:pPr>
       <w:r>
         <w:rPr>
-          <w:rFonts w:ascii="Times New Roman" w:hAnsi="Times New Roman" w:eastAsia="Times New Roman"/>
+          <w:rFonts w:ascii="Times New Roman" w:hAnsi="Times New Roman" w:eastAsia="Times New Roman" w:cs="Times New Roman"/>
+          <w:b w:val="0"/>
+          <w:i w:val="0"/>
+          <w:color w:val="000000"/>
           <w:sz w:val="28"/>
         </w:rPr>
         <w:t>Выделены основные бизнес-процессы проектируемой ИС.</w:t>
@@ -1383,14 +1413,19 @@
     <w:p>
       <w:pPr>
         <w:pStyle w:val="a0"/>
+        <w:keepNext w:val="0"/>
+        <w:keepLines w:val="0"/>
         <w:widowControl/>
         <w:spacing w:before="0" w:after="0" w:line="360" w:lineRule="auto"/>
-        <w:ind w:left="709" w:hanging="357"/>
+        <w:ind w:left="0" w:right="0" w:firstLine="709"/>
         <w:jc w:val="both"/>
       </w:pPr>
       <w:r>
         <w:rPr>
-          <w:rFonts w:ascii="Times New Roman" w:hAnsi="Times New Roman" w:eastAsia="Times New Roman"/>
+          <w:rFonts w:ascii="Times New Roman" w:hAnsi="Times New Roman" w:eastAsia="Times New Roman" w:cs="Times New Roman"/>
+          <w:b w:val="0"/>
+          <w:i w:val="0"/>
+          <w:color w:val="000000"/>
           <w:sz w:val="28"/>
         </w:rPr>
         <w:t>Сформированы общее описание процесса, его границы, входы, управление, механизмы и выходы.</w:t>
@@ -1399,14 +1434,19 @@
     <w:p>
       <w:pPr>
         <w:pStyle w:val="a0"/>
+        <w:keepNext w:val="0"/>
+        <w:keepLines w:val="0"/>
         <w:widowControl/>
         <w:spacing w:before="0" w:after="0" w:line="360" w:lineRule="auto"/>
-        <w:ind w:left="709" w:hanging="357"/>
+        <w:ind w:left="0" w:right="0" w:firstLine="709"/>
         <w:jc w:val="both"/>
       </w:pPr>
       <w:r>
         <w:rPr>
-          <w:rFonts w:ascii="Times New Roman" w:hAnsi="Times New Roman" w:eastAsia="Times New Roman"/>
+          <w:rFonts w:ascii="Times New Roman" w:hAnsi="Times New Roman" w:eastAsia="Times New Roman" w:cs="Times New Roman"/>
+          <w:b w:val="0"/>
+          <w:i w:val="0"/>
+          <w:color w:val="000000"/>
           <w:sz w:val="28"/>
         </w:rPr>
         <w:t>Построены диаграммы IDEF0 уровней A-0, A0 и A2.</w:t>
@@ -1415,14 +1455,19 @@
     <w:p>
       <w:pPr>
         <w:pStyle w:val="a0"/>
+        <w:keepNext w:val="0"/>
+        <w:keepLines w:val="0"/>
         <w:widowControl/>
         <w:spacing w:before="0" w:after="0" w:line="360" w:lineRule="auto"/>
-        <w:ind w:left="709" w:hanging="357"/>
+        <w:ind w:left="0" w:right="0" w:firstLine="709"/>
         <w:jc w:val="both"/>
       </w:pPr>
       <w:r>
         <w:rPr>
-          <w:rFonts w:ascii="Times New Roman" w:hAnsi="Times New Roman" w:eastAsia="Times New Roman"/>
+          <w:rFonts w:ascii="Times New Roman" w:hAnsi="Times New Roman" w:eastAsia="Times New Roman" w:cs="Times New Roman"/>
+          <w:b w:val="0"/>
+          <w:i w:val="0"/>
+          <w:color w:val="000000"/>
           <w:sz w:val="28"/>
         </w:rPr>
         <w:t>Операции диаграмм сопоставлены с исполнителями, входными и результирующими документами.</w:t>
@@ -1433,14 +1478,17 @@
         <w:pStyle w:val="21"/>
         <w:keepNext/>
         <w:keepLines/>
+        <w:widowControl/>
         <w:spacing w:before="240" w:after="120" w:line="360" w:lineRule="auto"/>
         <w:ind w:left="0" w:right="0" w:firstLine="0"/>
         <w:jc w:val="left"/>
       </w:pPr>
       <w:r>
         <w:rPr>
-          <w:rFonts w:ascii="Times New Roman" w:hAnsi="Times New Roman" w:eastAsia="Times New Roman"/>
+          <w:rFonts w:ascii="Times New Roman" w:hAnsi="Times New Roman" w:eastAsia="Times New Roman" w:cs="Times New Roman"/>
           <w:b/>
+          <w:i w:val="0"/>
+          <w:color w:val="000000"/>
           <w:sz w:val="28"/>
         </w:rPr>
         <w:t>2.1 Основные бизнес-процессы</w:t>
@@ -1448,6 +1496,8 @@
     </w:p>
     <w:p>
       <w:pPr>
+        <w:keepNext w:val="0"/>
+        <w:keepLines w:val="0"/>
         <w:widowControl/>
         <w:spacing w:before="0" w:after="0" w:line="360" w:lineRule="auto"/>
         <w:ind w:left="0" w:right="0" w:firstLine="709"/>
@@ -1455,7 +1505,10 @@
       </w:pPr>
       <w:r>
         <w:rPr>
-          <w:rFonts w:ascii="Times New Roman" w:hAnsi="Times New Roman" w:eastAsia="Times New Roman"/>
+          <w:rFonts w:ascii="Times New Roman" w:hAnsi="Times New Roman" w:eastAsia="Times New Roman" w:cs="Times New Roman"/>
+          <w:b w:val="0"/>
+          <w:i w:val="0"/>
+          <w:color w:val="000000"/>
           <w:sz w:val="28"/>
         </w:rPr>
         <w:t>В рамках проекта выделены процессы, приведённые в таблице 1.</w:t>
@@ -1464,15 +1517,18 @@
     <w:p>
       <w:pPr>
         <w:keepNext/>
+        <w:keepLines/>
+        <w:widowControl/>
         <w:spacing w:line="240" w:lineRule="auto" w:before="120" w:after="60"/>
         <w:ind w:left="0" w:right="0" w:firstLine="0"/>
         <w:jc w:val="left"/>
       </w:pPr>
       <w:r>
         <w:rPr>
-          <w:rFonts w:ascii="Times New Roman" w:hAnsi="Times New Roman" w:eastAsia="Times New Roman"/>
+          <w:rFonts w:ascii="Times New Roman" w:hAnsi="Times New Roman" w:eastAsia="Times New Roman" w:cs="Times New Roman"/>
           <w:b w:val="0"/>
           <w:i/>
+          <w:color w:val="000000"/>
           <w:sz w:val="24"/>
         </w:rPr>
         <w:t>Таблица 1 – Основные бизнес-процессы</w:t>
@@ -1494,9 +1550,9 @@
         </w:tblBorders>
       </w:tblPr>
       <w:tblGrid>
-        <w:gridCol w:w="3120"/>
-        <w:gridCol w:w="3120"/>
-        <w:gridCol w:w="3120"/>
+        <w:gridCol w:w="680"/>
+        <w:gridCol w:w="4252"/>
+        <w:gridCol w:w="4422"/>
       </w:tblGrid>
       <w:tr>
         <w:trPr>
@@ -1505,8 +1561,7 @@
         </w:trPr>
         <w:tc>
           <w:tcPr>
-            <w:tcW w:type="dxa" w:w="624"/>
-            <w:shd w:val="nil"/>
+            <w:tcW w:type="dxa" w:w="680"/>
             <w:vAlign w:val="center"/>
             <w:tcMar>
               <w:top w:w="80" w:type="dxa"/>
@@ -1517,16 +1572,18 @@
           </w:tcPr>
           <w:p>
             <w:pPr>
-              <w:keepNext w:val="0"/>
-              <w:keepLines w:val="0"/>
+              <w:keepNext/>
+              <w:keepLines/>
               <w:spacing w:before="0" w:after="0" w:line="240" w:lineRule="auto"/>
               <w:ind w:left="0" w:right="0" w:firstLine="0"/>
               <w:jc w:val="center"/>
             </w:pPr>
             <w:r>
               <w:rPr>
-                <w:rFonts w:ascii="Times New Roman" w:hAnsi="Times New Roman" w:eastAsia="Times New Roman"/>
+                <w:rFonts w:ascii="Times New Roman" w:hAnsi="Times New Roman" w:eastAsia="Times New Roman" w:cs="Times New Roman"/>
                 <w:b/>
+                <w:i w:val="0"/>
+                <w:color w:val="000000"/>
                 <w:sz w:val="24"/>
               </w:rPr>
               <w:t>№</w:t>
@@ -1535,8 +1592,7 @@
         </w:tc>
         <w:tc>
           <w:tcPr>
-            <w:tcW w:type="dxa" w:w="4082"/>
-            <w:shd w:val="nil"/>
+            <w:tcW w:type="dxa" w:w="4252"/>
             <w:vAlign w:val="center"/>
             <w:tcMar>
               <w:top w:w="80" w:type="dxa"/>
@@ -1547,16 +1603,18 @@
           </w:tcPr>
           <w:p>
             <w:pPr>
-              <w:keepNext w:val="0"/>
-              <w:keepLines w:val="0"/>
+              <w:keepNext/>
+              <w:keepLines/>
               <w:spacing w:before="0" w:after="0" w:line="240" w:lineRule="auto"/>
               <w:ind w:left="0" w:right="0" w:firstLine="0"/>
-              <w:jc w:val="center"/>
+              <w:jc w:val="left"/>
             </w:pPr>
             <w:r>
               <w:rPr>
-                <w:rFonts w:ascii="Times New Roman" w:hAnsi="Times New Roman" w:eastAsia="Times New Roman"/>
+                <w:rFonts w:ascii="Times New Roman" w:hAnsi="Times New Roman" w:eastAsia="Times New Roman" w:cs="Times New Roman"/>
                 <w:b/>
+                <w:i w:val="0"/>
+                <w:color w:val="000000"/>
                 <w:sz w:val="24"/>
               </w:rPr>
               <w:t>Наименование бизнес-процесса</w:t>
@@ -1565,8 +1623,7 @@
         </w:tc>
         <w:tc>
           <w:tcPr>
-            <w:tcW w:type="dxa" w:w="4649"/>
-            <w:shd w:val="nil"/>
+            <w:tcW w:type="dxa" w:w="4422"/>
             <w:vAlign w:val="center"/>
             <w:tcMar>
               <w:top w:w="80" w:type="dxa"/>
@@ -1577,16 +1634,18 @@
           </w:tcPr>
           <w:p>
             <w:pPr>
-              <w:keepNext w:val="0"/>
-              <w:keepLines w:val="0"/>
+              <w:keepNext/>
+              <w:keepLines/>
               <w:spacing w:before="0" w:after="0" w:line="240" w:lineRule="auto"/>
               <w:ind w:left="0" w:right="0" w:firstLine="0"/>
-              <w:jc w:val="center"/>
+              <w:jc w:val="left"/>
             </w:pPr>
             <w:r>
               <w:rPr>
-                <w:rFonts w:ascii="Times New Roman" w:hAnsi="Times New Roman" w:eastAsia="Times New Roman"/>
+                <w:rFonts w:ascii="Times New Roman" w:hAnsi="Times New Roman" w:eastAsia="Times New Roman" w:cs="Times New Roman"/>
                 <w:b/>
+                <w:i w:val="0"/>
+                <w:color w:val="000000"/>
                 <w:sz w:val="24"/>
               </w:rPr>
               <w:t>Краткий результат</w:t>
@@ -1600,8 +1659,7 @@
         </w:trPr>
         <w:tc>
           <w:tcPr>
-            <w:tcW w:type="dxa" w:w="624"/>
-            <w:shd w:val="nil"/>
+            <w:tcW w:type="dxa" w:w="680"/>
             <w:vAlign w:val="center"/>
             <w:tcMar>
               <w:top w:w="80" w:type="dxa"/>
@@ -1613,15 +1671,17 @@
           <w:p>
             <w:pPr>
               <w:keepNext w:val="0"/>
-              <w:keepLines w:val="0"/>
+              <w:keepLines/>
               <w:spacing w:before="0" w:after="0" w:line="240" w:lineRule="auto"/>
               <w:ind w:left="0" w:right="0" w:firstLine="0"/>
               <w:jc w:val="center"/>
             </w:pPr>
             <w:r>
               <w:rPr>
-                <w:rFonts w:ascii="Times New Roman" w:hAnsi="Times New Roman" w:eastAsia="Times New Roman"/>
+                <w:rFonts w:ascii="Times New Roman" w:hAnsi="Times New Roman" w:eastAsia="Times New Roman" w:cs="Times New Roman"/>
                 <w:b w:val="0"/>
+                <w:i w:val="0"/>
+                <w:color w:val="000000"/>
                 <w:sz w:val="24"/>
               </w:rPr>
               <w:t>1</w:t>
@@ -1630,8 +1690,7 @@
         </w:tc>
         <w:tc>
           <w:tcPr>
-            <w:tcW w:type="dxa" w:w="4082"/>
-            <w:shd w:val="nil"/>
+            <w:tcW w:type="dxa" w:w="4252"/>
             <w:vAlign w:val="center"/>
             <w:tcMar>
               <w:top w:w="80" w:type="dxa"/>
@@ -1643,15 +1702,17 @@
           <w:p>
             <w:pPr>
               <w:keepNext w:val="0"/>
-              <w:keepLines w:val="0"/>
+              <w:keepLines/>
               <w:spacing w:before="0" w:after="0" w:line="240" w:lineRule="auto"/>
               <w:ind w:left="0" w:right="0" w:firstLine="0"/>
               <w:jc w:val="left"/>
             </w:pPr>
             <w:r>
               <w:rPr>
-                <w:rFonts w:ascii="Times New Roman" w:hAnsi="Times New Roman" w:eastAsia="Times New Roman"/>
+                <w:rFonts w:ascii="Times New Roman" w:hAnsi="Times New Roman" w:eastAsia="Times New Roman" w:cs="Times New Roman"/>
                 <w:b w:val="0"/>
+                <w:i w:val="0"/>
+                <w:color w:val="000000"/>
                 <w:sz w:val="24"/>
               </w:rPr>
               <w:t>Инициирование создания или изменения карточки</w:t>
@@ -1660,8 +1721,7 @@
         </w:tc>
         <w:tc>
           <w:tcPr>
-            <w:tcW w:type="dxa" w:w="4649"/>
-            <w:shd w:val="nil"/>
+            <w:tcW w:type="dxa" w:w="4422"/>
             <w:vAlign w:val="center"/>
             <w:tcMar>
               <w:top w:w="80" w:type="dxa"/>
@@ -1673,15 +1733,17 @@
           <w:p>
             <w:pPr>
               <w:keepNext w:val="0"/>
-              <w:keepLines w:val="0"/>
+              <w:keepLines/>
               <w:spacing w:before="0" w:after="0" w:line="240" w:lineRule="auto"/>
               <w:ind w:left="0" w:right="0" w:firstLine="0"/>
               <w:jc w:val="left"/>
             </w:pPr>
             <w:r>
               <w:rPr>
-                <w:rFonts w:ascii="Times New Roman" w:hAnsi="Times New Roman" w:eastAsia="Times New Roman"/>
+                <w:rFonts w:ascii="Times New Roman" w:hAnsi="Times New Roman" w:eastAsia="Times New Roman" w:cs="Times New Roman"/>
                 <w:b w:val="0"/>
+                <w:i w:val="0"/>
+                <w:color w:val="000000"/>
                 <w:sz w:val="24"/>
               </w:rPr>
               <w:t>Зарегистрированный запрос и черновик карточки</w:t>
@@ -1695,8 +1757,7 @@
         </w:trPr>
         <w:tc>
           <w:tcPr>
-            <w:tcW w:type="dxa" w:w="624"/>
-            <w:shd w:val="nil"/>
+            <w:tcW w:type="dxa" w:w="680"/>
             <w:vAlign w:val="center"/>
             <w:tcMar>
               <w:top w:w="80" w:type="dxa"/>
@@ -1708,15 +1769,17 @@
           <w:p>
             <w:pPr>
               <w:keepNext w:val="0"/>
-              <w:keepLines w:val="0"/>
+              <w:keepLines/>
               <w:spacing w:before="0" w:after="0" w:line="240" w:lineRule="auto"/>
               <w:ind w:left="0" w:right="0" w:firstLine="0"/>
               <w:jc w:val="center"/>
             </w:pPr>
             <w:r>
               <w:rPr>
-                <w:rFonts w:ascii="Times New Roman" w:hAnsi="Times New Roman" w:eastAsia="Times New Roman"/>
+                <w:rFonts w:ascii="Times New Roman" w:hAnsi="Times New Roman" w:eastAsia="Times New Roman" w:cs="Times New Roman"/>
                 <w:b w:val="0"/>
+                <w:i w:val="0"/>
+                <w:color w:val="000000"/>
                 <w:sz w:val="24"/>
               </w:rPr>
               <w:t>2</w:t>
@@ -1725,8 +1788,7 @@
         </w:tc>
         <w:tc>
           <w:tcPr>
-            <w:tcW w:type="dxa" w:w="4082"/>
-            <w:shd w:val="nil"/>
+            <w:tcW w:type="dxa" w:w="4252"/>
             <w:vAlign w:val="center"/>
             <w:tcMar>
               <w:top w:w="80" w:type="dxa"/>
@@ -1738,15 +1800,17 @@
           <w:p>
             <w:pPr>
               <w:keepNext w:val="0"/>
-              <w:keepLines w:val="0"/>
+              <w:keepLines/>
               <w:spacing w:before="0" w:after="0" w:line="240" w:lineRule="auto"/>
               <w:ind w:left="0" w:right="0" w:firstLine="0"/>
               <w:jc w:val="left"/>
             </w:pPr>
             <w:r>
               <w:rPr>
-                <w:rFonts w:ascii="Times New Roman" w:hAnsi="Times New Roman" w:eastAsia="Times New Roman"/>
+                <w:rFonts w:ascii="Times New Roman" w:hAnsi="Times New Roman" w:eastAsia="Times New Roman" w:cs="Times New Roman"/>
                 <w:b w:val="0"/>
+                <w:i w:val="0"/>
+                <w:color w:val="000000"/>
                 <w:sz w:val="24"/>
               </w:rPr>
               <w:t>Формирование BOM и сопоставление товаров</w:t>
@@ -1755,8 +1819,7 @@
         </w:tc>
         <w:tc>
           <w:tcPr>
-            <w:tcW w:type="dxa" w:w="4649"/>
-            <w:shd w:val="nil"/>
+            <w:tcW w:type="dxa" w:w="4422"/>
             <w:vAlign w:val="center"/>
             <w:tcMar>
               <w:top w:w="80" w:type="dxa"/>
@@ -1768,15 +1831,17 @@
           <w:p>
             <w:pPr>
               <w:keepNext w:val="0"/>
-              <w:keepLines w:val="0"/>
+              <w:keepLines/>
               <w:spacing w:before="0" w:after="0" w:line="240" w:lineRule="auto"/>
               <w:ind w:left="0" w:right="0" w:firstLine="0"/>
               <w:jc w:val="left"/>
             </w:pPr>
             <w:r>
               <w:rPr>
-                <w:rFonts w:ascii="Times New Roman" w:hAnsi="Times New Roman" w:eastAsia="Times New Roman"/>
+                <w:rFonts w:ascii="Times New Roman" w:hAnsi="Times New Roman" w:eastAsia="Times New Roman" w:cs="Times New Roman"/>
                 <w:b w:val="0"/>
+                <w:i w:val="0"/>
+                <w:color w:val="000000"/>
                 <w:sz w:val="24"/>
               </w:rPr>
               <w:t>Версия BOM с точными моделями или групповыми характеристиками</w:t>
@@ -1790,8 +1855,7 @@
         </w:trPr>
         <w:tc>
           <w:tcPr>
-            <w:tcW w:type="dxa" w:w="624"/>
-            <w:shd w:val="nil"/>
+            <w:tcW w:type="dxa" w:w="680"/>
             <w:vAlign w:val="center"/>
             <w:tcMar>
               <w:top w:w="80" w:type="dxa"/>
@@ -1803,15 +1867,17 @@
           <w:p>
             <w:pPr>
               <w:keepNext w:val="0"/>
-              <w:keepLines w:val="0"/>
+              <w:keepLines/>
               <w:spacing w:before="0" w:after="0" w:line="240" w:lineRule="auto"/>
               <w:ind w:left="0" w:right="0" w:firstLine="0"/>
               <w:jc w:val="center"/>
             </w:pPr>
             <w:r>
               <w:rPr>
-                <w:rFonts w:ascii="Times New Roman" w:hAnsi="Times New Roman" w:eastAsia="Times New Roman"/>
+                <w:rFonts w:ascii="Times New Roman" w:hAnsi="Times New Roman" w:eastAsia="Times New Roman" w:cs="Times New Roman"/>
                 <w:b w:val="0"/>
+                <w:i w:val="0"/>
+                <w:color w:val="000000"/>
                 <w:sz w:val="24"/>
               </w:rPr>
               <w:t>3</w:t>
@@ -1820,8 +1886,7 @@
         </w:tc>
         <w:tc>
           <w:tcPr>
-            <w:tcW w:type="dxa" w:w="4082"/>
-            <w:shd w:val="nil"/>
+            <w:tcW w:type="dxa" w:w="4252"/>
             <w:vAlign w:val="center"/>
             <w:tcMar>
               <w:top w:w="80" w:type="dxa"/>
@@ -1833,15 +1898,17 @@
           <w:p>
             <w:pPr>
               <w:keepNext w:val="0"/>
-              <w:keepLines w:val="0"/>
+              <w:keepLines/>
               <w:spacing w:before="0" w:after="0" w:line="240" w:lineRule="auto"/>
               <w:ind w:left="0" w:right="0" w:firstLine="0"/>
               <w:jc w:val="left"/>
             </w:pPr>
             <w:r>
               <w:rPr>
-                <w:rFonts w:ascii="Times New Roman" w:hAnsi="Times New Roman" w:eastAsia="Times New Roman"/>
+                <w:rFonts w:ascii="Times New Roman" w:hAnsi="Times New Roman" w:eastAsia="Times New Roman" w:cs="Times New Roman"/>
                 <w:b w:val="0"/>
+                <w:i w:val="0"/>
+                <w:color w:val="000000"/>
                 <w:sz w:val="24"/>
               </w:rPr>
               <w:t>Проверка совместимости</w:t>
@@ -1850,8 +1917,7 @@
         </w:tc>
         <w:tc>
           <w:tcPr>
-            <w:tcW w:type="dxa" w:w="4649"/>
-            <w:shd w:val="nil"/>
+            <w:tcW w:type="dxa" w:w="4422"/>
             <w:vAlign w:val="center"/>
             <w:tcMar>
               <w:top w:w="80" w:type="dxa"/>
@@ -1863,15 +1929,17 @@
           <w:p>
             <w:pPr>
               <w:keepNext w:val="0"/>
-              <w:keepLines w:val="0"/>
+              <w:keepLines/>
               <w:spacing w:before="0" w:after="0" w:line="240" w:lineRule="auto"/>
               <w:ind w:left="0" w:right="0" w:firstLine="0"/>
               <w:jc w:val="left"/>
             </w:pPr>
             <w:r>
               <w:rPr>
-                <w:rFonts w:ascii="Times New Roman" w:hAnsi="Times New Roman" w:eastAsia="Times New Roman"/>
+                <w:rFonts w:ascii="Times New Roman" w:hAnsi="Times New Roman" w:eastAsia="Times New Roman" w:cs="Times New Roman"/>
                 <w:b w:val="0"/>
+                <w:i w:val="0"/>
+                <w:color w:val="000000"/>
                 <w:sz w:val="24"/>
               </w:rPr>
               <w:t>Протокол без ошибок или перечень конфликтов</w:t>
@@ -1885,8 +1953,7 @@
         </w:trPr>
         <w:tc>
           <w:tcPr>
-            <w:tcW w:type="dxa" w:w="624"/>
-            <w:shd w:val="nil"/>
+            <w:tcW w:type="dxa" w:w="680"/>
             <w:vAlign w:val="center"/>
             <w:tcMar>
               <w:top w:w="80" w:type="dxa"/>
@@ -1898,15 +1965,17 @@
           <w:p>
             <w:pPr>
               <w:keepNext w:val="0"/>
-              <w:keepLines w:val="0"/>
+              <w:keepLines/>
               <w:spacing w:before="0" w:after="0" w:line="240" w:lineRule="auto"/>
               <w:ind w:left="0" w:right="0" w:firstLine="0"/>
               <w:jc w:val="center"/>
             </w:pPr>
             <w:r>
               <w:rPr>
-                <w:rFonts w:ascii="Times New Roman" w:hAnsi="Times New Roman" w:eastAsia="Times New Roman"/>
+                <w:rFonts w:ascii="Times New Roman" w:hAnsi="Times New Roman" w:eastAsia="Times New Roman" w:cs="Times New Roman"/>
                 <w:b w:val="0"/>
+                <w:i w:val="0"/>
+                <w:color w:val="000000"/>
                 <w:sz w:val="24"/>
               </w:rPr>
               <w:t>4</w:t>
@@ -1915,8 +1984,7 @@
         </w:tc>
         <w:tc>
           <w:tcPr>
-            <w:tcW w:type="dxa" w:w="4082"/>
-            <w:shd w:val="nil"/>
+            <w:tcW w:type="dxa" w:w="4252"/>
             <w:vAlign w:val="center"/>
             <w:tcMar>
               <w:top w:w="80" w:type="dxa"/>
@@ -1928,15 +1996,17 @@
           <w:p>
             <w:pPr>
               <w:keepNext w:val="0"/>
-              <w:keepLines w:val="0"/>
+              <w:keepLines/>
               <w:spacing w:before="0" w:after="0" w:line="240" w:lineRule="auto"/>
               <w:ind w:left="0" w:right="0" w:firstLine="0"/>
               <w:jc w:val="left"/>
             </w:pPr>
             <w:r>
               <w:rPr>
-                <w:rFonts w:ascii="Times New Roman" w:hAnsi="Times New Roman" w:eastAsia="Times New Roman"/>
+                <w:rFonts w:ascii="Times New Roman" w:hAnsi="Times New Roman" w:eastAsia="Times New Roman" w:cs="Times New Roman"/>
                 <w:b w:val="0"/>
+                <w:i w:val="0"/>
+                <w:color w:val="000000"/>
                 <w:sz w:val="24"/>
               </w:rPr>
               <w:t>Массовая замена компонентов</w:t>
@@ -1945,8 +2015,7 @@
         </w:tc>
         <w:tc>
           <w:tcPr>
-            <w:tcW w:type="dxa" w:w="4649"/>
-            <w:shd w:val="nil"/>
+            <w:tcW w:type="dxa" w:w="4422"/>
             <w:vAlign w:val="center"/>
             <w:tcMar>
               <w:top w:w="80" w:type="dxa"/>
@@ -1958,15 +2027,17 @@
           <w:p>
             <w:pPr>
               <w:keepNext w:val="0"/>
-              <w:keepLines w:val="0"/>
+              <w:keepLines/>
               <w:spacing w:before="0" w:after="0" w:line="240" w:lineRule="auto"/>
               <w:ind w:left="0" w:right="0" w:firstLine="0"/>
               <w:jc w:val="left"/>
             </w:pPr>
             <w:r>
               <w:rPr>
-                <w:rFonts w:ascii="Times New Roman" w:hAnsi="Times New Roman" w:eastAsia="Times New Roman"/>
+                <w:rFonts w:ascii="Times New Roman" w:hAnsi="Times New Roman" w:eastAsia="Times New Roman" w:cs="Times New Roman"/>
                 <w:b w:val="0"/>
+                <w:i w:val="0"/>
+                <w:color w:val="000000"/>
                 <w:sz w:val="24"/>
               </w:rPr>
               <w:t>Новые версии всех затронутых BOM</w:t>
@@ -1980,8 +2051,7 @@
         </w:trPr>
         <w:tc>
           <w:tcPr>
-            <w:tcW w:type="dxa" w:w="624"/>
-            <w:shd w:val="nil"/>
+            <w:tcW w:type="dxa" w:w="680"/>
             <w:vAlign w:val="center"/>
             <w:tcMar>
               <w:top w:w="80" w:type="dxa"/>
@@ -1993,15 +2063,17 @@
           <w:p>
             <w:pPr>
               <w:keepNext w:val="0"/>
-              <w:keepLines w:val="0"/>
+              <w:keepLines/>
               <w:spacing w:before="0" w:after="0" w:line="240" w:lineRule="auto"/>
               <w:ind w:left="0" w:right="0" w:firstLine="0"/>
               <w:jc w:val="center"/>
             </w:pPr>
             <w:r>
               <w:rPr>
-                <w:rFonts w:ascii="Times New Roman" w:hAnsi="Times New Roman" w:eastAsia="Times New Roman"/>
+                <w:rFonts w:ascii="Times New Roman" w:hAnsi="Times New Roman" w:eastAsia="Times New Roman" w:cs="Times New Roman"/>
                 <w:b w:val="0"/>
+                <w:i w:val="0"/>
+                <w:color w:val="000000"/>
                 <w:sz w:val="24"/>
               </w:rPr>
               <w:t>5</w:t>
@@ -2010,8 +2082,7 @@
         </w:tc>
         <w:tc>
           <w:tcPr>
-            <w:tcW w:type="dxa" w:w="4082"/>
-            <w:shd w:val="nil"/>
+            <w:tcW w:type="dxa" w:w="4252"/>
             <w:vAlign w:val="center"/>
             <w:tcMar>
               <w:top w:w="80" w:type="dxa"/>
@@ -2023,15 +2094,17 @@
           <w:p>
             <w:pPr>
               <w:keepNext w:val="0"/>
-              <w:keepLines w:val="0"/>
+              <w:keepLines/>
               <w:spacing w:before="0" w:after="0" w:line="240" w:lineRule="auto"/>
               <w:ind w:left="0" w:right="0" w:firstLine="0"/>
               <w:jc w:val="left"/>
             </w:pPr>
             <w:r>
               <w:rPr>
-                <w:rFonts w:ascii="Times New Roman" w:hAnsi="Times New Roman" w:eastAsia="Times New Roman"/>
+                <w:rFonts w:ascii="Times New Roman" w:hAnsi="Times New Roman" w:eastAsia="Times New Roman" w:cs="Times New Roman"/>
                 <w:b w:val="0"/>
+                <w:i w:val="0"/>
+                <w:color w:val="000000"/>
                 <w:sz w:val="24"/>
               </w:rPr>
               <w:t>Расчёт цены и веса</w:t>
@@ -2040,8 +2113,7 @@
         </w:tc>
         <w:tc>
           <w:tcPr>
-            <w:tcW w:type="dxa" w:w="4649"/>
-            <w:shd w:val="nil"/>
+            <w:tcW w:type="dxa" w:w="4422"/>
             <w:vAlign w:val="center"/>
             <w:tcMar>
               <w:top w:w="80" w:type="dxa"/>
@@ -2053,15 +2125,17 @@
           <w:p>
             <w:pPr>
               <w:keepNext w:val="0"/>
-              <w:keepLines w:val="0"/>
+              <w:keepLines/>
               <w:spacing w:before="0" w:after="0" w:line="240" w:lineRule="auto"/>
               <w:ind w:left="0" w:right="0" w:firstLine="0"/>
               <w:jc w:val="left"/>
             </w:pPr>
             <w:r>
               <w:rPr>
-                <w:rFonts w:ascii="Times New Roman" w:hAnsi="Times New Roman" w:eastAsia="Times New Roman"/>
+                <w:rFonts w:ascii="Times New Roman" w:hAnsi="Times New Roman" w:eastAsia="Times New Roman" w:cs="Times New Roman"/>
                 <w:b w:val="0"/>
+                <w:i w:val="0"/>
+                <w:color w:val="000000"/>
                 <w:sz w:val="24"/>
               </w:rPr>
               <w:t>Рассчитанные показатели карточки</w:t>
@@ -2075,8 +2149,7 @@
         </w:trPr>
         <w:tc>
           <w:tcPr>
-            <w:tcW w:type="dxa" w:w="624"/>
-            <w:shd w:val="nil"/>
+            <w:tcW w:type="dxa" w:w="680"/>
             <w:vAlign w:val="center"/>
             <w:tcMar>
               <w:top w:w="80" w:type="dxa"/>
@@ -2088,15 +2161,17 @@
           <w:p>
             <w:pPr>
               <w:keepNext w:val="0"/>
-              <w:keepLines w:val="0"/>
+              <w:keepLines/>
               <w:spacing w:before="0" w:after="0" w:line="240" w:lineRule="auto"/>
               <w:ind w:left="0" w:right="0" w:firstLine="0"/>
               <w:jc w:val="center"/>
             </w:pPr>
             <w:r>
               <w:rPr>
-                <w:rFonts w:ascii="Times New Roman" w:hAnsi="Times New Roman" w:eastAsia="Times New Roman"/>
+                <w:rFonts w:ascii="Times New Roman" w:hAnsi="Times New Roman" w:eastAsia="Times New Roman" w:cs="Times New Roman"/>
                 <w:b w:val="0"/>
+                <w:i w:val="0"/>
+                <w:color w:val="000000"/>
                 <w:sz w:val="24"/>
               </w:rPr>
               <w:t>6</w:t>
@@ -2105,8 +2180,7 @@
         </w:tc>
         <w:tc>
           <w:tcPr>
-            <w:tcW w:type="dxa" w:w="4082"/>
-            <w:shd w:val="nil"/>
+            <w:tcW w:type="dxa" w:w="4252"/>
             <w:vAlign w:val="center"/>
             <w:tcMar>
               <w:top w:w="80" w:type="dxa"/>
@@ -2118,15 +2192,17 @@
           <w:p>
             <w:pPr>
               <w:keepNext w:val="0"/>
-              <w:keepLines w:val="0"/>
+              <w:keepLines/>
               <w:spacing w:before="0" w:after="0" w:line="240" w:lineRule="auto"/>
               <w:ind w:left="0" w:right="0" w:firstLine="0"/>
               <w:jc w:val="left"/>
             </w:pPr>
             <w:r>
               <w:rPr>
-                <w:rFonts w:ascii="Times New Roman" w:hAnsi="Times New Roman" w:eastAsia="Times New Roman"/>
+                <w:rFonts w:ascii="Times New Roman" w:hAnsi="Times New Roman" w:eastAsia="Times New Roman" w:cs="Times New Roman"/>
                 <w:b w:val="0"/>
+                <w:i w:val="0"/>
+                <w:color w:val="000000"/>
                 <w:sz w:val="24"/>
               </w:rPr>
               <w:t>Подготовка изображений</w:t>
@@ -2135,8 +2211,7 @@
         </w:tc>
         <w:tc>
           <w:tcPr>
-            <w:tcW w:type="dxa" w:w="4649"/>
-            <w:shd w:val="nil"/>
+            <w:tcW w:type="dxa" w:w="4422"/>
             <w:vAlign w:val="center"/>
             <w:tcMar>
               <w:top w:w="80" w:type="dxa"/>
@@ -2148,15 +2223,17 @@
           <w:p>
             <w:pPr>
               <w:keepNext w:val="0"/>
-              <w:keepLines w:val="0"/>
+              <w:keepLines/>
               <w:spacing w:before="0" w:after="0" w:line="240" w:lineRule="auto"/>
               <w:ind w:left="0" w:right="0" w:firstLine="0"/>
               <w:jc w:val="left"/>
             </w:pPr>
             <w:r>
               <w:rPr>
-                <w:rFonts w:ascii="Times New Roman" w:hAnsi="Times New Roman" w:eastAsia="Times New Roman"/>
+                <w:rFonts w:ascii="Times New Roman" w:hAnsi="Times New Roman" w:eastAsia="Times New Roman" w:cs="Times New Roman"/>
                 <w:b w:val="0"/>
+                <w:i w:val="0"/>
+                <w:color w:val="000000"/>
                 <w:sz w:val="24"/>
               </w:rPr>
               <w:t>Комплект изображений по шаблонам</w:t>
@@ -2170,8 +2247,7 @@
         </w:trPr>
         <w:tc>
           <w:tcPr>
-            <w:tcW w:type="dxa" w:w="624"/>
-            <w:shd w:val="nil"/>
+            <w:tcW w:type="dxa" w:w="680"/>
             <w:vAlign w:val="center"/>
             <w:tcMar>
               <w:top w:w="80" w:type="dxa"/>
@@ -2183,15 +2259,17 @@
           <w:p>
             <w:pPr>
               <w:keepNext w:val="0"/>
-              <w:keepLines w:val="0"/>
+              <w:keepLines/>
               <w:spacing w:before="0" w:after="0" w:line="240" w:lineRule="auto"/>
               <w:ind w:left="0" w:right="0" w:firstLine="0"/>
               <w:jc w:val="center"/>
             </w:pPr>
             <w:r>
               <w:rPr>
-                <w:rFonts w:ascii="Times New Roman" w:hAnsi="Times New Roman" w:eastAsia="Times New Roman"/>
+                <w:rFonts w:ascii="Times New Roman" w:hAnsi="Times New Roman" w:eastAsia="Times New Roman" w:cs="Times New Roman"/>
                 <w:b w:val="0"/>
+                <w:i w:val="0"/>
+                <w:color w:val="000000"/>
                 <w:sz w:val="24"/>
               </w:rPr>
               <w:t>7</w:t>
@@ -2200,8 +2278,7 @@
         </w:tc>
         <w:tc>
           <w:tcPr>
-            <w:tcW w:type="dxa" w:w="4082"/>
-            <w:shd w:val="nil"/>
+            <w:tcW w:type="dxa" w:w="4252"/>
             <w:vAlign w:val="center"/>
             <w:tcMar>
               <w:top w:w="80" w:type="dxa"/>
@@ -2213,15 +2290,17 @@
           <w:p>
             <w:pPr>
               <w:keepNext w:val="0"/>
-              <w:keepLines w:val="0"/>
+              <w:keepLines/>
               <w:spacing w:before="0" w:after="0" w:line="240" w:lineRule="auto"/>
               <w:ind w:left="0" w:right="0" w:firstLine="0"/>
               <w:jc w:val="left"/>
             </w:pPr>
             <w:r>
               <w:rPr>
-                <w:rFonts w:ascii="Times New Roman" w:hAnsi="Times New Roman" w:eastAsia="Times New Roman"/>
+                <w:rFonts w:ascii="Times New Roman" w:hAnsi="Times New Roman" w:eastAsia="Times New Roman" w:cs="Times New Roman"/>
                 <w:b w:val="0"/>
+                <w:i w:val="0"/>
+                <w:color w:val="000000"/>
                 <w:sz w:val="24"/>
               </w:rPr>
               <w:t>Проверка и публикация в Ozon</w:t>
@@ -2230,8 +2309,7 @@
         </w:tc>
         <w:tc>
           <w:tcPr>
-            <w:tcW w:type="dxa" w:w="4649"/>
-            <w:shd w:val="nil"/>
+            <w:tcW w:type="dxa" w:w="4422"/>
             <w:vAlign w:val="center"/>
             <w:tcMar>
               <w:top w:w="80" w:type="dxa"/>
@@ -2243,18 +2321,20 @@
           <w:p>
             <w:pPr>
               <w:keepNext w:val="0"/>
-              <w:keepLines w:val="0"/>
+              <w:keepLines/>
               <w:spacing w:before="0" w:after="0" w:line="240" w:lineRule="auto"/>
               <w:ind w:left="0" w:right="0" w:firstLine="0"/>
               <w:jc w:val="left"/>
             </w:pPr>
             <w:r>
               <w:rPr>
-                <w:rFonts w:ascii="Times New Roman" w:hAnsi="Times New Roman" w:eastAsia="Times New Roman"/>
+                <w:rFonts w:ascii="Times New Roman" w:hAnsi="Times New Roman" w:eastAsia="Times New Roman" w:cs="Times New Roman"/>
                 <w:b w:val="0"/>
+                <w:i w:val="0"/>
+                <w:color w:val="000000"/>
                 <w:sz w:val="24"/>
               </w:rPr>
-              <w:t>Опубликованная карточка или зарегистрированная ошибка</w:t>
+              <w:t>Подтверждённая публикация, ожидающая сверки попытка либо классифицированная ошибка</w:t>
             </w:r>
           </w:p>
         </w:tc>
@@ -2265,8 +2345,7 @@
         </w:trPr>
         <w:tc>
           <w:tcPr>
-            <w:tcW w:type="dxa" w:w="624"/>
-            <w:shd w:val="nil"/>
+            <w:tcW w:type="dxa" w:w="680"/>
             <w:vAlign w:val="center"/>
             <w:tcMar>
               <w:top w:w="80" w:type="dxa"/>
@@ -2278,15 +2357,17 @@
           <w:p>
             <w:pPr>
               <w:keepNext w:val="0"/>
-              <w:keepLines w:val="0"/>
+              <w:keepLines/>
               <w:spacing w:before="0" w:after="0" w:line="240" w:lineRule="auto"/>
               <w:ind w:left="0" w:right="0" w:firstLine="0"/>
               <w:jc w:val="center"/>
             </w:pPr>
             <w:r>
               <w:rPr>
-                <w:rFonts w:ascii="Times New Roman" w:hAnsi="Times New Roman" w:eastAsia="Times New Roman"/>
+                <w:rFonts w:ascii="Times New Roman" w:hAnsi="Times New Roman" w:eastAsia="Times New Roman" w:cs="Times New Roman"/>
                 <w:b w:val="0"/>
+                <w:i w:val="0"/>
+                <w:color w:val="000000"/>
                 <w:sz w:val="24"/>
               </w:rPr>
               <w:t>8</w:t>
@@ -2295,8 +2376,7 @@
         </w:tc>
         <w:tc>
           <w:tcPr>
-            <w:tcW w:type="dxa" w:w="4082"/>
-            <w:shd w:val="nil"/>
+            <w:tcW w:type="dxa" w:w="4252"/>
             <w:vAlign w:val="center"/>
             <w:tcMar>
               <w:top w:w="80" w:type="dxa"/>
@@ -2308,15 +2388,17 @@
           <w:p>
             <w:pPr>
               <w:keepNext w:val="0"/>
-              <w:keepLines w:val="0"/>
+              <w:keepLines/>
               <w:spacing w:before="0" w:after="0" w:line="240" w:lineRule="auto"/>
               <w:ind w:left="0" w:right="0" w:firstLine="0"/>
               <w:jc w:val="left"/>
             </w:pPr>
             <w:r>
               <w:rPr>
-                <w:rFonts w:ascii="Times New Roman" w:hAnsi="Times New Roman" w:eastAsia="Times New Roman"/>
+                <w:rFonts w:ascii="Times New Roman" w:hAnsi="Times New Roman" w:eastAsia="Times New Roman" w:cs="Times New Roman"/>
                 <w:b w:val="0"/>
+                <w:i w:val="0"/>
+                <w:color w:val="000000"/>
                 <w:sz w:val="24"/>
               </w:rPr>
               <w:t>Аудит и актуализация</w:t>
@@ -2325,8 +2407,7 @@
         </w:tc>
         <w:tc>
           <w:tcPr>
-            <w:tcW w:type="dxa" w:w="4649"/>
-            <w:shd w:val="nil"/>
+            <w:tcW w:type="dxa" w:w="4422"/>
             <w:vAlign w:val="center"/>
             <w:tcMar>
               <w:top w:w="80" w:type="dxa"/>
@@ -2338,15 +2419,17 @@
           <w:p>
             <w:pPr>
               <w:keepNext w:val="0"/>
-              <w:keepLines w:val="0"/>
+              <w:keepLines/>
               <w:spacing w:before="0" w:after="0" w:line="240" w:lineRule="auto"/>
               <w:ind w:left="0" w:right="0" w:firstLine="0"/>
               <w:jc w:val="left"/>
             </w:pPr>
             <w:r>
               <w:rPr>
-                <w:rFonts w:ascii="Times New Roman" w:hAnsi="Times New Roman" w:eastAsia="Times New Roman"/>
+                <w:rFonts w:ascii="Times New Roman" w:hAnsi="Times New Roman" w:eastAsia="Times New Roman" w:cs="Times New Roman"/>
                 <w:b w:val="0"/>
+                <w:i w:val="0"/>
+                <w:color w:val="000000"/>
                 <w:sz w:val="24"/>
               </w:rPr>
               <w:t>История изменений и перечень карточек, требующих обновления</w:t>
@@ -2360,14 +2443,17 @@
         <w:pStyle w:val="21"/>
         <w:keepNext/>
         <w:keepLines/>
+        <w:widowControl/>
         <w:spacing w:before="240" w:after="120" w:line="360" w:lineRule="auto"/>
         <w:ind w:left="0" w:right="0" w:firstLine="0"/>
         <w:jc w:val="left"/>
       </w:pPr>
       <w:r>
         <w:rPr>
-          <w:rFonts w:ascii="Times New Roman" w:hAnsi="Times New Roman" w:eastAsia="Times New Roman"/>
+          <w:rFonts w:ascii="Times New Roman" w:hAnsi="Times New Roman" w:eastAsia="Times New Roman" w:cs="Times New Roman"/>
           <w:b/>
+          <w:i w:val="0"/>
+          <w:color w:val="000000"/>
           <w:sz w:val="28"/>
         </w:rPr>
         <w:t>2.2 Общее описание бизнес-процесса</w:t>
@@ -2375,6 +2461,8 @@
     </w:p>
     <w:p>
       <w:pPr>
+        <w:keepNext w:val="0"/>
+        <w:keepLines w:val="0"/>
         <w:widowControl/>
         <w:spacing w:before="0" w:after="0" w:line="360" w:lineRule="auto"/>
         <w:ind w:left="0" w:right="0" w:firstLine="709"/>
@@ -2382,7 +2470,10 @@
       </w:pPr>
       <w:r>
         <w:rPr>
-          <w:rFonts w:ascii="Times New Roman" w:hAnsi="Times New Roman" w:eastAsia="Times New Roman"/>
+          <w:rFonts w:ascii="Times New Roman" w:hAnsi="Times New Roman" w:eastAsia="Times New Roman" w:cs="Times New Roman"/>
+          <w:b w:val="0"/>
+          <w:i w:val="0"/>
+          <w:color w:val="000000"/>
           <w:sz w:val="28"/>
         </w:rPr>
         <w:t>Процесс начинается с решения создать новое товарное предложение или актуализировать существующую карточку. Менеджер маркетплейсов регистрирует запрос и указывает базовый корпус, категорию Ozon и целевые характеристики.</w:t>
@@ -2390,6 +2481,8 @@
     </w:p>
     <w:p>
       <w:pPr>
+        <w:keepNext w:val="0"/>
+        <w:keepLines w:val="0"/>
         <w:widowControl/>
         <w:spacing w:before="0" w:after="0" w:line="360" w:lineRule="auto"/>
         <w:ind w:left="0" w:right="0" w:firstLine="709"/>
@@ -2397,7 +2490,10 @@
       </w:pPr>
       <w:r>
         <w:rPr>
-          <w:rFonts w:ascii="Times New Roman" w:hAnsi="Times New Roman" w:eastAsia="Times New Roman"/>
+          <w:rFonts w:ascii="Times New Roman" w:hAnsi="Times New Roman" w:eastAsia="Times New Roman" w:cs="Times New Roman"/>
+          <w:b w:val="0"/>
+          <w:i w:val="0"/>
+          <w:color w:val="000000"/>
           <w:sz w:val="28"/>
         </w:rPr>
         <w:t>Технический специалист формирует BOM: для каждого слота выбирает групповую характеристику или точную модель, сопоставляет внутренний компонент с товарами PC4Games и ITPartner. Система получает цены и наличие, а затем проверяет совместимость конфигурации.</w:t>
@@ -2405,6 +2501,8 @@
     </w:p>
     <w:p>
       <w:pPr>
+        <w:keepNext w:val="0"/>
+        <w:keepLines w:val="0"/>
         <w:widowControl/>
         <w:spacing w:before="0" w:after="0" w:line="360" w:lineRule="auto"/>
         <w:ind w:left="0" w:right="0" w:firstLine="709"/>
@@ -2412,14 +2510,23 @@
       </w:pPr>
       <w:r>
         <w:rPr>
-          <w:rFonts w:ascii="Times New Roman" w:hAnsi="Times New Roman" w:eastAsia="Times New Roman"/>
+          <w:rFonts w:ascii="Times New Roman" w:hAnsi="Times New Roman" w:eastAsia="Times New Roman" w:cs="Times New Roman"/>
+          <w:b w:val="0"/>
+          <w:i w:val="0"/>
+          <w:color w:val="000000"/>
           <w:sz w:val="28"/>
         </w:rPr>
-        <w:t>После успешной проверки рассчитываются цена и вес, по шаблонам формируются изображения. Менеджер проверяет обязательные атрибуты и публикует карточку через API Ozon. При ошибке система сохраняет ответ в журнале и формирует повторную попытку. Процесс завершается принятой Ozon карточкой либо зарегистрированной ошибкой с назначенным ответственным.</w:t>
+        <w:t>После проверки рассчитываются цена и масса, готовятся изображения и обязательные атрибуты. Менеджер подтверждает отправку сохранённой ревизии. Система регистрирует попытку до обмена, сохраняет ответ и уточняет окончательный результат. Приём внешней задачи не означает публикацию. Окончательный отказ требует исправления; подтверждённый временный отказ без принятия операции допускает ограниченный повтор с задержкой; неизвестный исход — только сверку. Неоконченный обмен сохраняется в состоянии ожидания с ответственным.</w:t>
       </w:r>
     </w:p>
     <w:p>
       <w:pPr>
+        <w:keepNext w:val="0"/>
+        <w:keepLines w:val="0"/>
+        <w:widowControl/>
+        <w:spacing w:before="0" w:after="0" w:line="20" w:lineRule="exact"/>
+        <w:ind w:left="0" w:right="0" w:firstLine="0"/>
+        <w:jc w:val="both"/>
         <w:sectPr>
           <w:footerReference w:type="default" r:id="rId10"/>
           <w:headerReference w:type="default" r:id="rId22"/>
@@ -2438,14 +2545,17 @@
         <w:keepNext/>
         <w:keepLines/>
         <w:pageBreakBefore w:val="0"/>
+        <w:widowControl/>
         <w:spacing w:before="240" w:after="120" w:line="360" w:lineRule="auto"/>
         <w:ind w:left="0" w:right="0" w:firstLine="0"/>
         <w:jc w:val="left"/>
       </w:pPr>
       <w:r>
         <w:rPr>
-          <w:rFonts w:ascii="Times New Roman" w:hAnsi="Times New Roman" w:eastAsia="Times New Roman"/>
+          <w:rFonts w:ascii="Times New Roman" w:hAnsi="Times New Roman" w:eastAsia="Times New Roman" w:cs="Times New Roman"/>
           <w:b/>
+          <w:i w:val="0"/>
+          <w:color w:val="000000"/>
           <w:sz w:val="28"/>
         </w:rPr>
         <w:t>2.3 Контекстная диаграмма IDEF0</w:t>
@@ -2453,14 +2563,19 @@
     </w:p>
     <w:p>
       <w:pPr>
+        <w:keepNext w:val="0"/>
+        <w:keepLines w:val="0"/>
         <w:widowControl/>
-        <w:spacing w:before="0" w:after="100" w:line="240" w:lineRule="auto"/>
+        <w:spacing w:before="0" w:after="0" w:line="360" w:lineRule="auto"/>
         <w:ind w:left="0" w:right="0" w:firstLine="709"/>
         <w:jc w:val="both"/>
       </w:pPr>
       <w:r>
         <w:rPr>
-          <w:rFonts w:ascii="Times New Roman" w:hAnsi="Times New Roman" w:eastAsia="Times New Roman"/>
+          <w:rFonts w:ascii="Times New Roman" w:hAnsi="Times New Roman" w:eastAsia="Times New Roman" w:cs="Times New Roman"/>
+          <w:b w:val="0"/>
+          <w:i w:val="0"/>
+          <w:color w:val="000000"/>
           <w:sz w:val="28"/>
         </w:rPr>
         <w:t>Контекстная диаграмма A-0 на рисунке 1 задаёт границу модели. Стрелки слева обозначают входы, сверху – управляющие воздействия, справа – выходы, снизу – механизмы.</w:t>
@@ -2469,14 +2584,23 @@
     <w:p>
       <w:pPr>
         <w:keepNext/>
-        <w:spacing w:line="240" w:lineRule="auto"/>
-        <w:ind w:firstLine="0"/>
+        <w:keepLines w:val="0"/>
+        <w:widowControl/>
+        <w:spacing w:line="240" w:lineRule="auto" w:before="0" w:after="0"/>
+        <w:ind w:left="0" w:right="0" w:firstLine="0"/>
         <w:jc w:val="center"/>
       </w:pPr>
       <w:r>
+        <w:rPr>
+          <w:rFonts w:ascii="Times New Roman" w:hAnsi="Times New Roman" w:eastAsia="Times New Roman" w:cs="Times New Roman"/>
+          <w:b w:val="0"/>
+          <w:i w:val="0"/>
+          <w:color w:val="000000"/>
+          <w:sz w:val="28"/>
+        </w:rPr>
         <w:drawing>
           <wp:inline xmlns:a="http://schemas.openxmlformats.org/drawingml/2006/main" xmlns:pic="http://schemas.openxmlformats.org/drawingml/2006/picture">
-            <wp:extent cx="8280000" cy="4545720"/>
+            <wp:extent cx="8184240" cy="4546800"/>
             <wp:docPr id="298370855" name="Picture 298370855"/>
             <wp:cNvGraphicFramePr>
               <a:graphicFrameLocks noChangeAspect="1"/>
@@ -2497,7 +2621,7 @@
                   <pic:spPr>
                     <a:xfrm>
                       <a:off x="0" y="0"/>
-                      <a:ext cx="8280000" cy="4545720"/>
+                      <a:ext cx="8184240" cy="4546800"/>
                     </a:xfrm>
                     <a:prstGeom prst="rect"/>
                   </pic:spPr>
@@ -2512,15 +2636,17 @@
       <w:pPr>
         <w:keepNext w:val="0"/>
         <w:keepLines/>
+        <w:widowControl/>
         <w:spacing w:line="240" w:lineRule="auto" w:before="60" w:after="120"/>
         <w:ind w:left="0" w:right="0" w:firstLine="0"/>
         <w:jc w:val="center"/>
       </w:pPr>
       <w:r>
         <w:rPr>
-          <w:rFonts w:ascii="Times New Roman" w:hAnsi="Times New Roman" w:eastAsia="Times New Roman"/>
+          <w:rFonts w:ascii="Times New Roman" w:hAnsi="Times New Roman" w:eastAsia="Times New Roman" w:cs="Times New Roman"/>
           <w:b w:val="0"/>
           <w:i w:val="0"/>
+          <w:color w:val="000000"/>
           <w:sz w:val="28"/>
         </w:rPr>
         <w:t>Рисунок 1 – Контекстная диаграмма A-0</w:t>
@@ -2532,14 +2658,17 @@
         <w:keepNext/>
         <w:keepLines/>
         <w:pageBreakBefore/>
+        <w:widowControl/>
         <w:spacing w:before="240" w:after="120" w:line="360" w:lineRule="auto"/>
         <w:ind w:left="0" w:right="0" w:firstLine="0"/>
         <w:jc w:val="left"/>
       </w:pPr>
       <w:r>
         <w:rPr>
-          <w:rFonts w:ascii="Times New Roman" w:hAnsi="Times New Roman" w:eastAsia="Times New Roman"/>
+          <w:rFonts w:ascii="Times New Roman" w:hAnsi="Times New Roman" w:eastAsia="Times New Roman" w:cs="Times New Roman"/>
           <w:b/>
+          <w:i w:val="0"/>
+          <w:color w:val="000000"/>
           <w:sz w:val="28"/>
         </w:rPr>
         <w:t>2.4 Декомпозиция процесса</w:t>
@@ -2547,30 +2676,44 @@
     </w:p>
     <w:p>
       <w:pPr>
+        <w:keepNext w:val="0"/>
+        <w:keepLines w:val="0"/>
         <w:widowControl/>
-        <w:spacing w:before="0" w:after="100" w:line="240" w:lineRule="auto"/>
+        <w:spacing w:before="0" w:after="0" w:line="360" w:lineRule="auto"/>
         <w:ind w:left="0" w:right="0" w:firstLine="709"/>
         <w:jc w:val="both"/>
       </w:pPr>
       <w:r>
         <w:rPr>
-          <w:rFonts w:ascii="Times New Roman" w:hAnsi="Times New Roman" w:eastAsia="Times New Roman"/>
+          <w:rFonts w:ascii="Times New Roman" w:hAnsi="Times New Roman" w:eastAsia="Times New Roman" w:cs="Times New Roman"/>
+          <w:b w:val="0"/>
+          <w:i w:val="0"/>
+          <w:color w:val="000000"/>
           <w:sz w:val="28"/>
         </w:rPr>
-        <w:t>На диаграмме A0 основной процесс разложен на пять взаимосвязанных функций. Результат каждой функции служит входом следующей; публикация допускается только после успешного прохождения предыдущих этапов. Декомпозиция показана на рисунке 2.</w:t>
+        <w:t>На рисунке 2 показана декомпозиция на пять функций. Публикация допускается только после проверки ревизии.</w:t>
       </w:r>
     </w:p>
     <w:p>
       <w:pPr>
         <w:keepNext/>
-        <w:spacing w:line="240" w:lineRule="auto"/>
-        <w:ind w:firstLine="0"/>
+        <w:keepLines w:val="0"/>
+        <w:widowControl/>
+        <w:spacing w:line="240" w:lineRule="auto" w:before="0" w:after="0"/>
+        <w:ind w:left="0" w:right="0" w:firstLine="0"/>
         <w:jc w:val="center"/>
       </w:pPr>
       <w:r>
+        <w:rPr>
+          <w:rFonts w:ascii="Times New Roman" w:hAnsi="Times New Roman" w:eastAsia="Times New Roman" w:cs="Times New Roman"/>
+          <w:b w:val="0"/>
+          <w:i w:val="0"/>
+          <w:color w:val="000000"/>
+          <w:sz w:val="28"/>
+        </w:rPr>
         <w:drawing>
           <wp:inline xmlns:a="http://schemas.openxmlformats.org/drawingml/2006/main" xmlns:pic="http://schemas.openxmlformats.org/drawingml/2006/picture">
-            <wp:extent cx="8928000" cy="4464000"/>
+            <wp:extent cx="8294400" cy="4608000"/>
             <wp:docPr id="298370856" name="Picture 298370856"/>
             <wp:cNvGraphicFramePr>
               <a:graphicFrameLocks noChangeAspect="1"/>
@@ -2591,7 +2734,7 @@
                   <pic:spPr>
                     <a:xfrm>
                       <a:off x="0" y="0"/>
-                      <a:ext cx="8928000" cy="4464000"/>
+                      <a:ext cx="8294400" cy="4608000"/>
                     </a:xfrm>
                     <a:prstGeom prst="rect"/>
                   </pic:spPr>
@@ -2606,15 +2749,17 @@
       <w:pPr>
         <w:keepNext w:val="0"/>
         <w:keepLines/>
+        <w:widowControl/>
         <w:spacing w:line="240" w:lineRule="auto" w:before="60" w:after="120"/>
         <w:ind w:left="0" w:right="0" w:firstLine="0"/>
         <w:jc w:val="center"/>
       </w:pPr>
       <w:r>
         <w:rPr>
-          <w:rFonts w:ascii="Times New Roman" w:hAnsi="Times New Roman" w:eastAsia="Times New Roman"/>
+          <w:rFonts w:ascii="Times New Roman" w:hAnsi="Times New Roman" w:eastAsia="Times New Roman" w:cs="Times New Roman"/>
           <w:b w:val="0"/>
           <w:i w:val="0"/>
+          <w:color w:val="000000"/>
           <w:sz w:val="28"/>
         </w:rPr>
         <w:t>Рисунок 2 – Декомпозиция A0</w:t>
@@ -2626,14 +2771,17 @@
         <w:keepNext/>
         <w:keepLines/>
         <w:pageBreakBefore/>
+        <w:widowControl/>
         <w:spacing w:before="240" w:after="120" w:line="360" w:lineRule="auto"/>
         <w:ind w:left="0" w:right="0" w:firstLine="0"/>
         <w:jc w:val="left"/>
       </w:pPr>
       <w:r>
         <w:rPr>
-          <w:rFonts w:ascii="Times New Roman" w:hAnsi="Times New Roman" w:eastAsia="Times New Roman"/>
+          <w:rFonts w:ascii="Times New Roman" w:hAnsi="Times New Roman" w:eastAsia="Times New Roman" w:cs="Times New Roman"/>
           <w:b/>
+          <w:i w:val="0"/>
+          <w:color w:val="000000"/>
           <w:sz w:val="28"/>
         </w:rPr>
         <w:t>2.5 Детализация процесса формирования BOM</w:t>
@@ -2641,14 +2789,19 @@
     </w:p>
     <w:p>
       <w:pPr>
+        <w:keepNext w:val="0"/>
+        <w:keepLines w:val="0"/>
         <w:widowControl/>
-        <w:spacing w:before="0" w:after="100" w:line="240" w:lineRule="auto"/>
+        <w:spacing w:before="0" w:after="0" w:line="360" w:lineRule="auto"/>
         <w:ind w:left="0" w:right="0" w:firstLine="709"/>
         <w:jc w:val="both"/>
       </w:pPr>
       <w:r>
         <w:rPr>
-          <w:rFonts w:ascii="Times New Roman" w:hAnsi="Times New Roman" w:eastAsia="Times New Roman"/>
+          <w:rFonts w:ascii="Times New Roman" w:hAnsi="Times New Roman" w:eastAsia="Times New Roman" w:cs="Times New Roman"/>
+          <w:b w:val="0"/>
+          <w:i w:val="0"/>
+          <w:color w:val="000000"/>
           <w:sz w:val="28"/>
         </w:rPr>
         <w:t>Для детализации выбрана функция A2, так как именно в ней связываются обобщённые характеристики карточки, внутренние компоненты и точные модели поставщиков. Детализация A2 приведена на рисунке 3.</w:t>
@@ -2657,14 +2810,23 @@
     <w:p>
       <w:pPr>
         <w:keepNext/>
-        <w:spacing w:line="240" w:lineRule="auto"/>
-        <w:ind w:firstLine="0"/>
+        <w:keepLines w:val="0"/>
+        <w:widowControl/>
+        <w:spacing w:line="240" w:lineRule="auto" w:before="0" w:after="0"/>
+        <w:ind w:left="0" w:right="0" w:firstLine="0"/>
         <w:jc w:val="center"/>
       </w:pPr>
       <w:r>
+        <w:rPr>
+          <w:rFonts w:ascii="Times New Roman" w:hAnsi="Times New Roman" w:eastAsia="Times New Roman" w:cs="Times New Roman"/>
+          <w:b w:val="0"/>
+          <w:i w:val="0"/>
+          <w:color w:val="000000"/>
+          <w:sz w:val="28"/>
+        </w:rPr>
         <w:drawing>
           <wp:inline xmlns:a="http://schemas.openxmlformats.org/drawingml/2006/main" xmlns:pic="http://schemas.openxmlformats.org/drawingml/2006/picture">
-            <wp:extent cx="8928000" cy="4464000"/>
+            <wp:extent cx="8035200" cy="4464000"/>
             <wp:docPr id="298370857" name="Picture 298370857"/>
             <wp:cNvGraphicFramePr>
               <a:graphicFrameLocks noChangeAspect="1"/>
@@ -2685,7 +2847,7 @@
                   <pic:spPr>
                     <a:xfrm>
                       <a:off x="0" y="0"/>
-                      <a:ext cx="8928000" cy="4464000"/>
+                      <a:ext cx="8035200" cy="4464000"/>
                     </a:xfrm>
                     <a:prstGeom prst="rect"/>
                   </pic:spPr>
@@ -2700,15 +2862,17 @@
       <w:pPr>
         <w:keepNext w:val="0"/>
         <w:keepLines/>
+        <w:widowControl/>
         <w:spacing w:line="240" w:lineRule="auto" w:before="60" w:after="120"/>
         <w:ind w:left="0" w:right="0" w:firstLine="0"/>
         <w:jc w:val="center"/>
       </w:pPr>
       <w:r>
         <w:rPr>
-          <w:rFonts w:ascii="Times New Roman" w:hAnsi="Times New Roman" w:eastAsia="Times New Roman"/>
+          <w:rFonts w:ascii="Times New Roman" w:hAnsi="Times New Roman" w:eastAsia="Times New Roman" w:cs="Times New Roman"/>
           <w:b w:val="0"/>
           <w:i w:val="0"/>
+          <w:color w:val="000000"/>
           <w:sz w:val="28"/>
         </w:rPr>
         <w:t>Рисунок 3 – Детализация A2 «Сформировать BOM и сопоставить товары»</w:t>
@@ -2716,6 +2880,12 @@
     </w:p>
     <w:p>
       <w:pPr>
+        <w:keepNext w:val="0"/>
+        <w:keepLines w:val="0"/>
+        <w:widowControl/>
+        <w:spacing w:before="0" w:after="0" w:line="20" w:lineRule="exact"/>
+        <w:ind w:left="0" w:right="0" w:firstLine="0"/>
+        <w:jc w:val="both"/>
         <w:sectPr>
           <w:footerReference w:type="default" r:id="rId10"/>
           <w:headerReference w:type="default" r:id="rId24"/>
@@ -2733,14 +2903,17 @@
         <w:pStyle w:val="21"/>
         <w:keepNext/>
         <w:keepLines/>
+        <w:widowControl/>
         <w:spacing w:before="240" w:after="120" w:line="360" w:lineRule="auto"/>
         <w:ind w:left="0" w:right="0" w:firstLine="0"/>
         <w:jc w:val="left"/>
       </w:pPr>
       <w:r>
         <w:rPr>
-          <w:rFonts w:ascii="Times New Roman" w:hAnsi="Times New Roman" w:eastAsia="Times New Roman"/>
+          <w:rFonts w:ascii="Times New Roman" w:hAnsi="Times New Roman" w:eastAsia="Times New Roman" w:cs="Times New Roman"/>
           <w:b/>
+          <w:i w:val="0"/>
+          <w:color w:val="000000"/>
           <w:sz w:val="28"/>
         </w:rPr>
         <w:t>2.6 Операции, исполнители и документы</w:t>
@@ -2748,6 +2921,8 @@
     </w:p>
     <w:p>
       <w:pPr>
+        <w:keepNext w:val="0"/>
+        <w:keepLines w:val="0"/>
         <w:widowControl/>
         <w:spacing w:before="0" w:after="0" w:line="360" w:lineRule="auto"/>
         <w:ind w:left="0" w:right="0" w:firstLine="709"/>
@@ -2755,7 +2930,10 @@
       </w:pPr>
       <w:r>
         <w:rPr>
-          <w:rFonts w:ascii="Times New Roman" w:hAnsi="Times New Roman" w:eastAsia="Times New Roman"/>
+          <w:rFonts w:ascii="Times New Roman" w:hAnsi="Times New Roman" w:eastAsia="Times New Roman" w:cs="Times New Roman"/>
+          <w:b w:val="0"/>
+          <w:i w:val="0"/>
+          <w:color w:val="000000"/>
           <w:sz w:val="28"/>
         </w:rPr>
         <w:t>Состав операций и связанных с ними документов приведён в таблице 2.</w:t>
@@ -2764,15 +2942,18 @@
     <w:p>
       <w:pPr>
         <w:keepNext/>
+        <w:keepLines/>
+        <w:widowControl/>
         <w:spacing w:line="240" w:lineRule="auto" w:before="120" w:after="60"/>
         <w:ind w:left="0" w:right="0" w:firstLine="0"/>
         <w:jc w:val="left"/>
       </w:pPr>
       <w:r>
         <w:rPr>
-          <w:rFonts w:ascii="Times New Roman" w:hAnsi="Times New Roman" w:eastAsia="Times New Roman"/>
+          <w:rFonts w:ascii="Times New Roman" w:hAnsi="Times New Roman" w:eastAsia="Times New Roman" w:cs="Times New Roman"/>
           <w:b w:val="0"/>
           <w:i/>
+          <w:color w:val="000000"/>
           <w:sz w:val="24"/>
         </w:rPr>
         <w:t>Таблица 2 – Операции процесса и связанные документы</w:t>
@@ -2794,14 +2975,14 @@
         </w:tblBorders>
       </w:tblPr>
       <w:tblGrid>
-        <w:gridCol w:w="1786"/>
-        <w:gridCol w:w="1786"/>
-        <w:gridCol w:w="1786"/>
-        <w:gridCol w:w="1786"/>
-        <w:gridCol w:w="1786"/>
-        <w:gridCol w:w="1786"/>
-        <w:gridCol w:w="1786"/>
-        <w:gridCol w:w="1786"/>
+        <w:gridCol w:w="964"/>
+        <w:gridCol w:w="1757"/>
+        <w:gridCol w:w="1984"/>
+        <w:gridCol w:w="1814"/>
+        <w:gridCol w:w="1361"/>
+        <w:gridCol w:w="2154"/>
+        <w:gridCol w:w="1701"/>
+        <w:gridCol w:w="2551"/>
       </w:tblGrid>
       <w:tr>
         <w:trPr>
@@ -2810,8 +2991,260 @@
         </w:trPr>
         <w:tc>
           <w:tcPr>
-            <w:tcW w:type="dxa" w:w="1247"/>
-            <w:shd w:val="nil"/>
+            <w:tcW w:type="dxa" w:w="964"/>
+            <w:vAlign w:val="center"/>
+            <w:tcMar>
+              <w:top w:w="80" w:type="dxa"/>
+              <w:start w:w="90" w:type="dxa"/>
+              <w:bottom w:w="80" w:type="dxa"/>
+              <w:end w:w="90" w:type="dxa"/>
+            </w:tcMar>
+          </w:tcPr>
+          <w:p>
+            <w:pPr>
+              <w:keepNext/>
+              <w:keepLines/>
+              <w:spacing w:before="0" w:after="0" w:line="240" w:lineRule="auto"/>
+              <w:ind w:firstLine="0" w:left="0" w:right="0"/>
+              <w:jc w:val="center"/>
+            </w:pPr>
+            <w:r>
+              <w:rPr>
+                <w:rFonts w:ascii="Times New Roman" w:hAnsi="Times New Roman" w:eastAsia="Times New Roman" w:cs="Times New Roman"/>
+                <w:b/>
+                <w:i w:val="0"/>
+                <w:color w:val="000000"/>
+                <w:sz w:val="24"/>
+              </w:rPr>
+              <w:t>Код</w:t>
+            </w:r>
+          </w:p>
+        </w:tc>
+        <w:tc>
+          <w:tcPr>
+            <w:tcW w:type="dxa" w:w="1757"/>
+            <w:vAlign w:val="center"/>
+            <w:tcMar>
+              <w:top w:w="80" w:type="dxa"/>
+              <w:start w:w="90" w:type="dxa"/>
+              <w:bottom w:w="80" w:type="dxa"/>
+              <w:end w:w="90" w:type="dxa"/>
+            </w:tcMar>
+          </w:tcPr>
+          <w:p>
+            <w:pPr>
+              <w:keepNext/>
+              <w:keepLines/>
+              <w:spacing w:before="0" w:after="0" w:line="240" w:lineRule="auto"/>
+              <w:ind w:firstLine="0" w:left="0" w:right="0"/>
+              <w:jc w:val="left"/>
+            </w:pPr>
+            <w:r>
+              <w:rPr>
+                <w:rFonts w:ascii="Times New Roman" w:hAnsi="Times New Roman" w:eastAsia="Times New Roman" w:cs="Times New Roman"/>
+                <w:b/>
+                <w:i w:val="0"/>
+                <w:color w:val="000000"/>
+                <w:sz w:val="24"/>
+              </w:rPr>
+              <w:t>Результат</w:t>
+            </w:r>
+          </w:p>
+        </w:tc>
+        <w:tc>
+          <w:tcPr>
+            <w:tcW w:type="dxa" w:w="1984"/>
+            <w:vAlign w:val="center"/>
+            <w:tcMar>
+              <w:top w:w="80" w:type="dxa"/>
+              <w:start w:w="90" w:type="dxa"/>
+              <w:bottom w:w="80" w:type="dxa"/>
+              <w:end w:w="90" w:type="dxa"/>
+            </w:tcMar>
+          </w:tcPr>
+          <w:p>
+            <w:pPr>
+              <w:keepNext/>
+              <w:keepLines/>
+              <w:spacing w:before="0" w:after="0" w:line="240" w:lineRule="auto"/>
+              <w:ind w:firstLine="0" w:left="0" w:right="0"/>
+              <w:jc w:val="left"/>
+            </w:pPr>
+            <w:r>
+              <w:rPr>
+                <w:rFonts w:ascii="Times New Roman" w:hAnsi="Times New Roman" w:eastAsia="Times New Roman" w:cs="Times New Roman"/>
+                <w:b/>
+                <w:i w:val="0"/>
+                <w:color w:val="000000"/>
+                <w:sz w:val="24"/>
+              </w:rPr>
+              <w:t>Операция</w:t>
+            </w:r>
+          </w:p>
+        </w:tc>
+        <w:tc>
+          <w:tcPr>
+            <w:tcW w:type="dxa" w:w="1814"/>
+            <w:vAlign w:val="center"/>
+            <w:tcMar>
+              <w:top w:w="80" w:type="dxa"/>
+              <w:start w:w="90" w:type="dxa"/>
+              <w:bottom w:w="80" w:type="dxa"/>
+              <w:end w:w="90" w:type="dxa"/>
+            </w:tcMar>
+          </w:tcPr>
+          <w:p>
+            <w:pPr>
+              <w:keepNext/>
+              <w:keepLines/>
+              <w:spacing w:before="0" w:after="0" w:line="240" w:lineRule="auto"/>
+              <w:ind w:firstLine="0" w:left="0" w:right="0"/>
+              <w:jc w:val="left"/>
+            </w:pPr>
+            <w:r>
+              <w:rPr>
+                <w:rFonts w:ascii="Times New Roman" w:hAnsi="Times New Roman" w:eastAsia="Times New Roman" w:cs="Times New Roman"/>
+                <w:b/>
+                <w:i w:val="0"/>
+                <w:color w:val="000000"/>
+                <w:sz w:val="24"/>
+              </w:rPr>
+              <w:t>Исполнитель</w:t>
+            </w:r>
+          </w:p>
+        </w:tc>
+        <w:tc>
+          <w:tcPr>
+            <w:tcW w:type="dxa" w:w="1361"/>
+            <w:vAlign w:val="center"/>
+            <w:tcMar>
+              <w:top w:w="80" w:type="dxa"/>
+              <w:start w:w="90" w:type="dxa"/>
+              <w:bottom w:w="80" w:type="dxa"/>
+              <w:end w:w="90" w:type="dxa"/>
+            </w:tcMar>
+          </w:tcPr>
+          <w:p>
+            <w:pPr>
+              <w:keepNext/>
+              <w:keepLines/>
+              <w:spacing w:before="0" w:after="0" w:line="240" w:lineRule="auto"/>
+              <w:ind w:firstLine="0" w:left="0" w:right="0"/>
+              <w:jc w:val="left"/>
+            </w:pPr>
+            <w:r>
+              <w:rPr>
+                <w:rFonts w:ascii="Times New Roman" w:hAnsi="Times New Roman" w:eastAsia="Times New Roman" w:cs="Times New Roman"/>
+                <w:b/>
+                <w:i w:val="0"/>
+                <w:color w:val="000000"/>
+                <w:sz w:val="24"/>
+              </w:rPr>
+              <w:t>Период</w:t>
+            </w:r>
+          </w:p>
+        </w:tc>
+        <w:tc>
+          <w:tcPr>
+            <w:tcW w:type="dxa" w:w="2154"/>
+            <w:vAlign w:val="center"/>
+            <w:tcMar>
+              <w:top w:w="80" w:type="dxa"/>
+              <w:start w:w="90" w:type="dxa"/>
+              <w:bottom w:w="80" w:type="dxa"/>
+              <w:end w:w="90" w:type="dxa"/>
+            </w:tcMar>
+          </w:tcPr>
+          <w:p>
+            <w:pPr>
+              <w:keepNext/>
+              <w:keepLines/>
+              <w:spacing w:before="0" w:after="0" w:line="240" w:lineRule="auto"/>
+              <w:ind w:firstLine="0" w:left="0" w:right="0"/>
+              <w:jc w:val="left"/>
+            </w:pPr>
+            <w:r>
+              <w:rPr>
+                <w:rFonts w:ascii="Times New Roman" w:hAnsi="Times New Roman" w:eastAsia="Times New Roman" w:cs="Times New Roman"/>
+                <w:b/>
+                <w:i w:val="0"/>
+                <w:color w:val="000000"/>
+                <w:sz w:val="24"/>
+              </w:rPr>
+              <w:t>Основание</w:t>
+            </w:r>
+          </w:p>
+        </w:tc>
+        <w:tc>
+          <w:tcPr>
+            <w:tcW w:type="dxa" w:w="1701"/>
+            <w:vAlign w:val="center"/>
+            <w:tcMar>
+              <w:top w:w="80" w:type="dxa"/>
+              <w:start w:w="90" w:type="dxa"/>
+              <w:bottom w:w="80" w:type="dxa"/>
+              <w:end w:w="90" w:type="dxa"/>
+            </w:tcMar>
+          </w:tcPr>
+          <w:p>
+            <w:pPr>
+              <w:keepNext/>
+              <w:keepLines/>
+              <w:spacing w:before="0" w:after="0" w:line="240" w:lineRule="auto"/>
+              <w:ind w:firstLine="0" w:left="0" w:right="0"/>
+              <w:jc w:val="left"/>
+            </w:pPr>
+            <w:r>
+              <w:rPr>
+                <w:rFonts w:ascii="Times New Roman" w:hAnsi="Times New Roman" w:eastAsia="Times New Roman" w:cs="Times New Roman"/>
+                <w:b/>
+                <w:i w:val="0"/>
+                <w:color w:val="000000"/>
+                <w:sz w:val="24"/>
+              </w:rPr>
+              <w:t>Реестр</w:t>
+            </w:r>
+          </w:p>
+        </w:tc>
+        <w:tc>
+          <w:tcPr>
+            <w:tcW w:type="dxa" w:w="2551"/>
+            <w:vAlign w:val="center"/>
+            <w:tcMar>
+              <w:top w:w="80" w:type="dxa"/>
+              <w:start w:w="90" w:type="dxa"/>
+              <w:bottom w:w="80" w:type="dxa"/>
+              <w:end w:w="90" w:type="dxa"/>
+            </w:tcMar>
+          </w:tcPr>
+          <w:p>
+            <w:pPr>
+              <w:keepNext/>
+              <w:keepLines/>
+              <w:spacing w:before="0" w:after="0" w:line="240" w:lineRule="auto"/>
+              <w:ind w:firstLine="0" w:left="0" w:right="0"/>
+              <w:jc w:val="left"/>
+            </w:pPr>
+            <w:r>
+              <w:rPr>
+                <w:rFonts w:ascii="Times New Roman" w:hAnsi="Times New Roman" w:eastAsia="Times New Roman" w:cs="Times New Roman"/>
+                <w:b/>
+                <w:i w:val="0"/>
+                <w:color w:val="000000"/>
+                <w:sz w:val="24"/>
+              </w:rPr>
+              <w:t>Примечание</w:t>
+            </w:r>
+          </w:p>
+        </w:tc>
+      </w:tr>
+      <w:tr>
+        <w:trPr>
+          <w:cantSplit/>
+        </w:trPr>
+        <w:tc>
+          <w:tcPr>
+            <w:tcW w:type="dxa" w:w="964"/>
             <w:vAlign w:val="center"/>
             <w:tcMar>
               <w:top w:w="80" w:type="dxa"/>
@@ -2823,25 +3256,26 @@
           <w:p>
             <w:pPr>
               <w:keepNext w:val="0"/>
-              <w:keepLines w:val="0"/>
+              <w:keepLines/>
               <w:spacing w:before="0" w:after="0" w:line="240" w:lineRule="auto"/>
               <w:ind w:left="0" w:right="0" w:firstLine="0"/>
               <w:jc w:val="center"/>
             </w:pPr>
             <w:r>
               <w:rPr>
-                <w:rFonts w:ascii="Times New Roman" w:hAnsi="Times New Roman" w:eastAsia="Times New Roman"/>
-                <w:b/>
-                <w:sz w:val="22"/>
+                <w:rFonts w:ascii="Times New Roman" w:hAnsi="Times New Roman" w:eastAsia="Times New Roman" w:cs="Times New Roman"/>
+                <w:b w:val="0"/>
+                <w:i w:val="0"/>
+                <w:color w:val="000000"/>
+                <w:sz w:val="24"/>
               </w:rPr>
-              <w:t>Диаграмма, операция</w:t>
+              <w:t>A0 / A1</w:t>
             </w:r>
           </w:p>
         </w:tc>
         <w:tc>
           <w:tcPr>
-            <w:tcW w:type="dxa" w:w="1984"/>
-            <w:shd w:val="nil"/>
+            <w:tcW w:type="dxa" w:w="1757"/>
             <w:vAlign w:val="center"/>
             <w:tcMar>
               <w:top w:w="80" w:type="dxa"/>
@@ -2853,25 +3287,26 @@
           <w:p>
             <w:pPr>
               <w:keepNext w:val="0"/>
-              <w:keepLines w:val="0"/>
+              <w:keepLines/>
               <w:spacing w:before="0" w:after="0" w:line="240" w:lineRule="auto"/>
               <w:ind w:left="0" w:right="0" w:firstLine="0"/>
-              <w:jc w:val="center"/>
+              <w:jc w:val="left"/>
             </w:pPr>
             <w:r>
               <w:rPr>
-                <w:rFonts w:ascii="Times New Roman" w:hAnsi="Times New Roman" w:eastAsia="Times New Roman"/>
-                <w:b/>
-                <w:sz w:val="22"/>
+                <w:rFonts w:ascii="Times New Roman" w:hAnsi="Times New Roman" w:eastAsia="Times New Roman" w:cs="Times New Roman"/>
+                <w:b w:val="0"/>
+                <w:i w:val="0"/>
+                <w:color w:val="000000"/>
+                <w:sz w:val="24"/>
               </w:rPr>
-              <w:t>Результирующий объект</w:t>
+              <w:t>Запрос и черновик карточки</w:t>
             </w:r>
           </w:p>
         </w:tc>
         <w:tc>
           <w:tcPr>
-            <w:tcW w:type="dxa" w:w="1928"/>
-            <w:shd w:val="nil"/>
+            <w:tcW w:type="dxa" w:w="1984"/>
             <w:vAlign w:val="center"/>
             <w:tcMar>
               <w:top w:w="80" w:type="dxa"/>
@@ -2883,25 +3318,26 @@
           <w:p>
             <w:pPr>
               <w:keepNext w:val="0"/>
-              <w:keepLines w:val="0"/>
+              <w:keepLines/>
               <w:spacing w:before="0" w:after="0" w:line="240" w:lineRule="auto"/>
-              <w:ind w:left="0" w:right="0" w:firstLine="0"/>
-              <w:jc w:val="center"/>
+              <w:ind w:firstLine="0" w:left="0" w:right="0"/>
+              <w:jc w:val="left"/>
             </w:pPr>
             <w:r>
               <w:rPr>
-                <w:rFonts w:ascii="Times New Roman" w:hAnsi="Times New Roman" w:eastAsia="Times New Roman"/>
-                <w:b/>
-                <w:sz w:val="22"/>
+                <w:rFonts w:ascii="Times New Roman" w:hAnsi="Times New Roman" w:eastAsia="Times New Roman" w:cs="Times New Roman"/>
+                <w:b w:val="0"/>
+                <w:i w:val="0"/>
+                <w:color w:val="000000"/>
+                <w:sz w:val="24"/>
               </w:rPr>
-              <w:t>Операция</w:t>
+              <w:t>Записать запрос</w:t>
             </w:r>
           </w:p>
         </w:tc>
         <w:tc>
           <w:tcPr>
-            <w:tcW w:type="dxa" w:w="1984"/>
-            <w:shd w:val="nil"/>
+            <w:tcW w:type="dxa" w:w="1814"/>
             <w:vAlign w:val="center"/>
             <w:tcMar>
               <w:top w:w="80" w:type="dxa"/>
@@ -2913,25 +3349,26 @@
           <w:p>
             <w:pPr>
               <w:keepNext w:val="0"/>
-              <w:keepLines w:val="0"/>
+              <w:keepLines/>
               <w:spacing w:before="0" w:after="0" w:line="240" w:lineRule="auto"/>
               <w:ind w:left="0" w:right="0" w:firstLine="0"/>
-              <w:jc w:val="center"/>
+              <w:jc w:val="left"/>
             </w:pPr>
             <w:r>
               <w:rPr>
-                <w:rFonts w:ascii="Times New Roman" w:hAnsi="Times New Roman" w:eastAsia="Times New Roman"/>
-                <w:b/>
-                <w:sz w:val="22"/>
+                <w:rFonts w:ascii="Times New Roman" w:hAnsi="Times New Roman" w:eastAsia="Times New Roman" w:cs="Times New Roman"/>
+                <w:b w:val="0"/>
+                <w:i w:val="0"/>
+                <w:color w:val="000000"/>
+                <w:sz w:val="24"/>
               </w:rPr>
-              <w:t>Исполнитель</w:t>
+              <w:t>Менеджер маркетплейсов</w:t>
             </w:r>
           </w:p>
         </w:tc>
         <w:tc>
           <w:tcPr>
-            <w:tcW w:type="dxa" w:w="1701"/>
-            <w:shd w:val="nil"/>
+            <w:tcW w:type="dxa" w:w="1361"/>
             <w:vAlign w:val="center"/>
             <w:tcMar>
               <w:top w:w="80" w:type="dxa"/>
@@ -2943,25 +3380,26 @@
           <w:p>
             <w:pPr>
               <w:keepNext w:val="0"/>
-              <w:keepLines w:val="0"/>
+              <w:keepLines/>
               <w:spacing w:before="0" w:after="0" w:line="240" w:lineRule="auto"/>
-              <w:ind w:left="0" w:right="0" w:firstLine="0"/>
-              <w:jc w:val="center"/>
+              <w:ind w:firstLine="0" w:left="0" w:right="0"/>
+              <w:jc w:val="left"/>
             </w:pPr>
             <w:r>
               <w:rPr>
-                <w:rFonts w:ascii="Times New Roman" w:hAnsi="Times New Roman" w:eastAsia="Times New Roman"/>
-                <w:b/>
-                <w:sz w:val="22"/>
+                <w:rFonts w:ascii="Times New Roman" w:hAnsi="Times New Roman" w:eastAsia="Times New Roman" w:cs="Times New Roman"/>
+                <w:b w:val="0"/>
+                <w:i w:val="0"/>
+                <w:color w:val="000000"/>
+                <w:sz w:val="24"/>
               </w:rPr>
-              <w:t>Периодичность</w:t>
+              <w:t>По запросу</w:t>
             </w:r>
           </w:p>
         </w:tc>
         <w:tc>
           <w:tcPr>
-            <w:tcW w:type="dxa" w:w="2268"/>
-            <w:shd w:val="nil"/>
+            <w:tcW w:type="dxa" w:w="2154"/>
             <w:vAlign w:val="center"/>
             <w:tcMar>
               <w:top w:w="80" w:type="dxa"/>
@@ -2973,25 +3411,26 @@
           <w:p>
             <w:pPr>
               <w:keepNext w:val="0"/>
-              <w:keepLines w:val="0"/>
+              <w:keepLines/>
               <w:spacing w:before="0" w:after="0" w:line="240" w:lineRule="auto"/>
               <w:ind w:left="0" w:right="0" w:firstLine="0"/>
-              <w:jc w:val="center"/>
+              <w:jc w:val="left"/>
             </w:pPr>
             <w:r>
               <w:rPr>
-                <w:rFonts w:ascii="Times New Roman" w:hAnsi="Times New Roman" w:eastAsia="Times New Roman"/>
-                <w:b/>
-                <w:sz w:val="22"/>
+                <w:rFonts w:ascii="Times New Roman" w:hAnsi="Times New Roman" w:eastAsia="Times New Roman" w:cs="Times New Roman"/>
+                <w:b w:val="0"/>
+                <w:i w:val="0"/>
+                <w:color w:val="000000"/>
+                <w:sz w:val="24"/>
               </w:rPr>
-              <w:t>Документы-основания</w:t>
+              <w:t>Решение о товарном предложении</w:t>
             </w:r>
           </w:p>
         </w:tc>
         <w:tc>
           <w:tcPr>
-            <w:tcW w:type="dxa" w:w="1814"/>
-            <w:shd w:val="nil"/>
+            <w:tcW w:type="dxa" w:w="1701"/>
             <w:vAlign w:val="center"/>
             <w:tcMar>
               <w:top w:w="80" w:type="dxa"/>
@@ -3003,25 +3442,26 @@
           <w:p>
             <w:pPr>
               <w:keepNext w:val="0"/>
-              <w:keepLines w:val="0"/>
+              <w:keepLines/>
               <w:spacing w:before="0" w:after="0" w:line="240" w:lineRule="auto"/>
               <w:ind w:left="0" w:right="0" w:firstLine="0"/>
-              <w:jc w:val="center"/>
+              <w:jc w:val="left"/>
             </w:pPr>
             <w:r>
               <w:rPr>
-                <w:rFonts w:ascii="Times New Roman" w:hAnsi="Times New Roman" w:eastAsia="Times New Roman"/>
-                <w:b/>
-                <w:sz w:val="22"/>
+                <w:rFonts w:ascii="Times New Roman" w:hAnsi="Times New Roman" w:eastAsia="Times New Roman" w:cs="Times New Roman"/>
+                <w:b w:val="0"/>
+                <w:i w:val="0"/>
+                <w:color w:val="000000"/>
+                <w:sz w:val="24"/>
               </w:rPr>
-              <w:t>Реестр</w:t>
+              <w:t>Реестр запросов</w:t>
             </w:r>
           </w:p>
         </w:tc>
         <w:tc>
           <w:tcPr>
-            <w:tcW w:type="dxa" w:w="1814"/>
-            <w:shd w:val="nil"/>
+            <w:tcW w:type="dxa" w:w="2551"/>
             <w:vAlign w:val="center"/>
             <w:tcMar>
               <w:top w:w="80" w:type="dxa"/>
@@ -3033,261 +3473,18 @@
           <w:p>
             <w:pPr>
               <w:keepNext w:val="0"/>
-              <w:keepLines w:val="0"/>
-              <w:spacing w:before="0" w:after="0" w:line="240" w:lineRule="auto"/>
-              <w:ind w:left="0" w:right="0" w:firstLine="0"/>
-              <w:jc w:val="center"/>
-            </w:pPr>
-            <w:r>
-              <w:rPr>
-                <w:rFonts w:ascii="Times New Roman" w:hAnsi="Times New Roman" w:eastAsia="Times New Roman"/>
-                <w:b/>
-                <w:sz w:val="22"/>
-              </w:rPr>
-              <w:t>Комментарий</w:t>
-            </w:r>
-          </w:p>
-        </w:tc>
-      </w:tr>
-      <w:tr>
-        <w:trPr>
-          <w:cantSplit/>
-        </w:trPr>
-        <w:tc>
-          <w:tcPr>
-            <w:tcW w:type="dxa" w:w="1247"/>
-            <w:shd w:val="nil"/>
-            <w:vAlign w:val="center"/>
-            <w:tcMar>
-              <w:top w:w="80" w:type="dxa"/>
-              <w:start w:w="90" w:type="dxa"/>
-              <w:bottom w:w="80" w:type="dxa"/>
-              <w:end w:w="90" w:type="dxa"/>
-            </w:tcMar>
-          </w:tcPr>
-          <w:p>
-            <w:pPr>
-              <w:keepNext w:val="0"/>
-              <w:keepLines w:val="0"/>
-              <w:spacing w:before="0" w:after="0" w:line="240" w:lineRule="auto"/>
-              <w:ind w:left="0" w:right="0" w:firstLine="0"/>
-              <w:jc w:val="center"/>
-            </w:pPr>
-            <w:r>
-              <w:rPr>
-                <w:rFonts w:ascii="Times New Roman" w:hAnsi="Times New Roman" w:eastAsia="Times New Roman"/>
-                <w:b w:val="0"/>
-                <w:sz w:val="22"/>
-              </w:rPr>
-              <w:t>A0 / A1</w:t>
-            </w:r>
-          </w:p>
-        </w:tc>
-        <w:tc>
-          <w:tcPr>
-            <w:tcW w:type="dxa" w:w="1984"/>
-            <w:shd w:val="nil"/>
-            <w:vAlign w:val="center"/>
-            <w:tcMar>
-              <w:top w:w="80" w:type="dxa"/>
-              <w:start w:w="90" w:type="dxa"/>
-              <w:bottom w:w="80" w:type="dxa"/>
-              <w:end w:w="90" w:type="dxa"/>
-            </w:tcMar>
-          </w:tcPr>
-          <w:p>
-            <w:pPr>
-              <w:keepNext w:val="0"/>
-              <w:keepLines w:val="0"/>
+              <w:keepLines/>
               <w:spacing w:before="0" w:after="0" w:line="240" w:lineRule="auto"/>
               <w:ind w:left="0" w:right="0" w:firstLine="0"/>
               <w:jc w:val="left"/>
             </w:pPr>
             <w:r>
               <w:rPr>
-                <w:rFonts w:ascii="Times New Roman" w:hAnsi="Times New Roman" w:eastAsia="Times New Roman"/>
+                <w:rFonts w:ascii="Times New Roman" w:hAnsi="Times New Roman" w:eastAsia="Times New Roman" w:cs="Times New Roman"/>
                 <w:b w:val="0"/>
-                <w:sz w:val="22"/>
-              </w:rPr>
-              <w:t>Запрос и черновик карточки</w:t>
-            </w:r>
-          </w:p>
-        </w:tc>
-        <w:tc>
-          <w:tcPr>
-            <w:tcW w:type="dxa" w:w="1928"/>
-            <w:shd w:val="nil"/>
-            <w:vAlign w:val="center"/>
-            <w:tcMar>
-              <w:top w:w="80" w:type="dxa"/>
-              <w:start w:w="90" w:type="dxa"/>
-              <w:bottom w:w="80" w:type="dxa"/>
-              <w:end w:w="90" w:type="dxa"/>
-            </w:tcMar>
-          </w:tcPr>
-          <w:p>
-            <w:pPr>
-              <w:keepNext w:val="0"/>
-              <w:keepLines w:val="0"/>
-              <w:spacing w:before="0" w:after="0" w:line="240" w:lineRule="auto"/>
-              <w:ind w:left="0" w:right="0" w:firstLine="0"/>
-              <w:jc w:val="left"/>
-            </w:pPr>
-            <w:r>
-              <w:rPr>
-                <w:rFonts w:ascii="Times New Roman" w:hAnsi="Times New Roman" w:eastAsia="Times New Roman"/>
-                <w:b w:val="0"/>
-                <w:sz w:val="22"/>
-              </w:rPr>
-              <w:t>Зарегистрировать запрос</w:t>
-            </w:r>
-          </w:p>
-        </w:tc>
-        <w:tc>
-          <w:tcPr>
-            <w:tcW w:type="dxa" w:w="1984"/>
-            <w:shd w:val="nil"/>
-            <w:vAlign w:val="center"/>
-            <w:tcMar>
-              <w:top w:w="80" w:type="dxa"/>
-              <w:start w:w="90" w:type="dxa"/>
-              <w:bottom w:w="80" w:type="dxa"/>
-              <w:end w:w="90" w:type="dxa"/>
-            </w:tcMar>
-          </w:tcPr>
-          <w:p>
-            <w:pPr>
-              <w:keepNext w:val="0"/>
-              <w:keepLines w:val="0"/>
-              <w:spacing w:before="0" w:after="0" w:line="240" w:lineRule="auto"/>
-              <w:ind w:left="0" w:right="0" w:firstLine="0"/>
-              <w:jc w:val="left"/>
-            </w:pPr>
-            <w:r>
-              <w:rPr>
-                <w:rFonts w:ascii="Times New Roman" w:hAnsi="Times New Roman" w:eastAsia="Times New Roman"/>
-                <w:b w:val="0"/>
-                <w:sz w:val="22"/>
-              </w:rPr>
-              <w:t>Менеджер маркетплейсов</w:t>
-            </w:r>
-          </w:p>
-        </w:tc>
-        <w:tc>
-          <w:tcPr>
-            <w:tcW w:type="dxa" w:w="1701"/>
-            <w:shd w:val="nil"/>
-            <w:vAlign w:val="center"/>
-            <w:tcMar>
-              <w:top w:w="80" w:type="dxa"/>
-              <w:start w:w="90" w:type="dxa"/>
-              <w:bottom w:w="80" w:type="dxa"/>
-              <w:end w:w="90" w:type="dxa"/>
-            </w:tcMar>
-          </w:tcPr>
-          <w:p>
-            <w:pPr>
-              <w:keepNext w:val="0"/>
-              <w:keepLines w:val="0"/>
-              <w:spacing w:before="0" w:after="0" w:line="240" w:lineRule="auto"/>
-              <w:ind w:left="0" w:right="0" w:firstLine="0"/>
-              <w:jc w:val="left"/>
-            </w:pPr>
-            <w:r>
-              <w:rPr>
-                <w:rFonts w:ascii="Times New Roman" w:hAnsi="Times New Roman" w:eastAsia="Times New Roman"/>
-                <w:b w:val="0"/>
-                <w:sz w:val="22"/>
-              </w:rPr>
-              <w:t>По мере необходимости</w:t>
-            </w:r>
-          </w:p>
-        </w:tc>
-        <w:tc>
-          <w:tcPr>
-            <w:tcW w:type="dxa" w:w="2268"/>
-            <w:shd w:val="nil"/>
-            <w:vAlign w:val="center"/>
-            <w:tcMar>
-              <w:top w:w="80" w:type="dxa"/>
-              <w:start w:w="90" w:type="dxa"/>
-              <w:bottom w:w="80" w:type="dxa"/>
-              <w:end w:w="90" w:type="dxa"/>
-            </w:tcMar>
-          </w:tcPr>
-          <w:p>
-            <w:pPr>
-              <w:keepNext w:val="0"/>
-              <w:keepLines w:val="0"/>
-              <w:spacing w:before="0" w:after="0" w:line="240" w:lineRule="auto"/>
-              <w:ind w:left="0" w:right="0" w:firstLine="0"/>
-              <w:jc w:val="left"/>
-            </w:pPr>
-            <w:r>
-              <w:rPr>
-                <w:rFonts w:ascii="Times New Roman" w:hAnsi="Times New Roman" w:eastAsia="Times New Roman"/>
-                <w:b w:val="0"/>
-                <w:sz w:val="22"/>
-              </w:rPr>
-              <w:t>Решение о товарном предложении</w:t>
-            </w:r>
-          </w:p>
-        </w:tc>
-        <w:tc>
-          <w:tcPr>
-            <w:tcW w:type="dxa" w:w="1814"/>
-            <w:shd w:val="nil"/>
-            <w:vAlign w:val="center"/>
-            <w:tcMar>
-              <w:top w:w="80" w:type="dxa"/>
-              <w:start w:w="90" w:type="dxa"/>
-              <w:bottom w:w="80" w:type="dxa"/>
-              <w:end w:w="90" w:type="dxa"/>
-            </w:tcMar>
-          </w:tcPr>
-          <w:p>
-            <w:pPr>
-              <w:keepNext w:val="0"/>
-              <w:keepLines w:val="0"/>
-              <w:spacing w:before="0" w:after="0" w:line="240" w:lineRule="auto"/>
-              <w:ind w:left="0" w:right="0" w:firstLine="0"/>
-              <w:jc w:val="left"/>
-            </w:pPr>
-            <w:r>
-              <w:rPr>
-                <w:rFonts w:ascii="Times New Roman" w:hAnsi="Times New Roman" w:eastAsia="Times New Roman"/>
-                <w:b w:val="0"/>
-                <w:sz w:val="22"/>
-              </w:rPr>
-              <w:t>Реестр запросов</w:t>
-            </w:r>
-          </w:p>
-        </w:tc>
-        <w:tc>
-          <w:tcPr>
-            <w:tcW w:type="dxa" w:w="1814"/>
-            <w:shd w:val="nil"/>
-            <w:vAlign w:val="center"/>
-            <w:tcMar>
-              <w:top w:w="80" w:type="dxa"/>
-              <w:start w:w="90" w:type="dxa"/>
-              <w:bottom w:w="80" w:type="dxa"/>
-              <w:end w:w="90" w:type="dxa"/>
-            </w:tcMar>
-          </w:tcPr>
-          <w:p>
-            <w:pPr>
-              <w:keepNext w:val="0"/>
-              <w:keepLines w:val="0"/>
-              <w:spacing w:before="0" w:after="0" w:line="240" w:lineRule="auto"/>
-              <w:ind w:left="0" w:right="0" w:firstLine="0"/>
-              <w:jc w:val="left"/>
-            </w:pPr>
-            <w:r>
-              <w:rPr>
-                <w:rFonts w:ascii="Times New Roman" w:hAnsi="Times New Roman" w:eastAsia="Times New Roman"/>
-                <w:b w:val="0"/>
-                <w:sz w:val="22"/>
+                <w:i w:val="0"/>
+                <w:color w:val="000000"/>
+                <w:sz w:val="24"/>
               </w:rPr>
               <w:t>Начало процесса</w:t>
             </w:r>
@@ -3300,8 +3497,7 @@
         </w:trPr>
         <w:tc>
           <w:tcPr>
-            <w:tcW w:type="dxa" w:w="1247"/>
-            <w:shd w:val="nil"/>
+            <w:tcW w:type="dxa" w:w="964"/>
             <w:vAlign w:val="center"/>
             <w:tcMar>
               <w:top w:w="80" w:type="dxa"/>
@@ -3313,16 +3509,18 @@
           <w:p>
             <w:pPr>
               <w:keepNext w:val="0"/>
-              <w:keepLines w:val="0"/>
+              <w:keepLines/>
               <w:spacing w:before="0" w:after="0" w:line="240" w:lineRule="auto"/>
               <w:ind w:left="0" w:right="0" w:firstLine="0"/>
               <w:jc w:val="center"/>
             </w:pPr>
             <w:r>
               <w:rPr>
-                <w:rFonts w:ascii="Times New Roman" w:hAnsi="Times New Roman" w:eastAsia="Times New Roman"/>
+                <w:rFonts w:ascii="Times New Roman" w:hAnsi="Times New Roman" w:eastAsia="Times New Roman" w:cs="Times New Roman"/>
                 <w:b w:val="0"/>
-                <w:sz w:val="22"/>
+                <w:i w:val="0"/>
+                <w:color w:val="000000"/>
+                <w:sz w:val="24"/>
               </w:rPr>
               <w:t>A2 / A21</w:t>
             </w:r>
@@ -3330,8 +3528,7 @@
         </w:tc>
         <w:tc>
           <w:tcPr>
-            <w:tcW w:type="dxa" w:w="1984"/>
-            <w:shd w:val="nil"/>
+            <w:tcW w:type="dxa" w:w="1757"/>
             <w:vAlign w:val="center"/>
             <w:tcMar>
               <w:top w:w="80" w:type="dxa"/>
@@ -3343,16 +3540,18 @@
           <w:p>
             <w:pPr>
               <w:keepNext w:val="0"/>
-              <w:keepLines w:val="0"/>
+              <w:keepLines/>
               <w:spacing w:before="0" w:after="0" w:line="240" w:lineRule="auto"/>
               <w:ind w:left="0" w:right="0" w:firstLine="0"/>
               <w:jc w:val="left"/>
             </w:pPr>
             <w:r>
               <w:rPr>
-                <w:rFonts w:ascii="Times New Roman" w:hAnsi="Times New Roman" w:eastAsia="Times New Roman"/>
+                <w:rFonts w:ascii="Times New Roman" w:hAnsi="Times New Roman" w:eastAsia="Times New Roman" w:cs="Times New Roman"/>
                 <w:b w:val="0"/>
-                <w:sz w:val="22"/>
+                <w:i w:val="0"/>
+                <w:color w:val="000000"/>
+                <w:sz w:val="24"/>
               </w:rPr>
               <w:t>Основа BOM</w:t>
             </w:r>
@@ -3360,8 +3559,7 @@
         </w:tc>
         <w:tc>
           <w:tcPr>
-            <w:tcW w:type="dxa" w:w="1928"/>
-            <w:shd w:val="nil"/>
+            <w:tcW w:type="dxa" w:w="1984"/>
             <w:vAlign w:val="center"/>
             <w:tcMar>
               <w:top w:w="80" w:type="dxa"/>
@@ -3373,16 +3571,18 @@
           <w:p>
             <w:pPr>
               <w:keepNext w:val="0"/>
-              <w:keepLines w:val="0"/>
+              <w:keepLines/>
               <w:spacing w:before="0" w:after="0" w:line="240" w:lineRule="auto"/>
               <w:ind w:left="0" w:right="0" w:firstLine="0"/>
               <w:jc w:val="left"/>
             </w:pPr>
             <w:r>
               <w:rPr>
-                <w:rFonts w:ascii="Times New Roman" w:hAnsi="Times New Roman" w:eastAsia="Times New Roman"/>
+                <w:rFonts w:ascii="Times New Roman" w:hAnsi="Times New Roman" w:eastAsia="Times New Roman" w:cs="Times New Roman"/>
                 <w:b w:val="0"/>
-                <w:sz w:val="22"/>
+                <w:i w:val="0"/>
+                <w:color w:val="000000"/>
+                <w:sz w:val="24"/>
               </w:rPr>
               <w:t>Выбрать корпус и характеристики</w:t>
             </w:r>
@@ -3390,8 +3590,7 @@
         </w:tc>
         <w:tc>
           <w:tcPr>
-            <w:tcW w:type="dxa" w:w="1984"/>
-            <w:shd w:val="nil"/>
+            <w:tcW w:type="dxa" w:w="1814"/>
             <w:vAlign w:val="center"/>
             <w:tcMar>
               <w:top w:w="80" w:type="dxa"/>
@@ -3403,16 +3602,18 @@
           <w:p>
             <w:pPr>
               <w:keepNext w:val="0"/>
-              <w:keepLines w:val="0"/>
+              <w:keepLines/>
               <w:spacing w:before="0" w:after="0" w:line="240" w:lineRule="auto"/>
               <w:ind w:left="0" w:right="0" w:firstLine="0"/>
               <w:jc w:val="left"/>
             </w:pPr>
             <w:r>
               <w:rPr>
-                <w:rFonts w:ascii="Times New Roman" w:hAnsi="Times New Roman" w:eastAsia="Times New Roman"/>
+                <w:rFonts w:ascii="Times New Roman" w:hAnsi="Times New Roman" w:eastAsia="Times New Roman" w:cs="Times New Roman"/>
                 <w:b w:val="0"/>
-                <w:sz w:val="22"/>
+                <w:i w:val="0"/>
+                <w:color w:val="000000"/>
+                <w:sz w:val="24"/>
               </w:rPr>
               <w:t>Технический специалист</w:t>
             </w:r>
@@ -3420,8 +3621,7 @@
         </w:tc>
         <w:tc>
           <w:tcPr>
-            <w:tcW w:type="dxa" w:w="1701"/>
-            <w:shd w:val="nil"/>
+            <w:tcW w:type="dxa" w:w="1361"/>
             <w:vAlign w:val="center"/>
             <w:tcMar>
               <w:top w:w="80" w:type="dxa"/>
@@ -3433,16 +3633,18 @@
           <w:p>
             <w:pPr>
               <w:keepNext w:val="0"/>
-              <w:keepLines w:val="0"/>
+              <w:keepLines/>
               <w:spacing w:before="0" w:after="0" w:line="240" w:lineRule="auto"/>
               <w:ind w:left="0" w:right="0" w:firstLine="0"/>
               <w:jc w:val="left"/>
             </w:pPr>
             <w:r>
               <w:rPr>
-                <w:rFonts w:ascii="Times New Roman" w:hAnsi="Times New Roman" w:eastAsia="Times New Roman"/>
+                <w:rFonts w:ascii="Times New Roman" w:hAnsi="Times New Roman" w:eastAsia="Times New Roman" w:cs="Times New Roman"/>
                 <w:b w:val="0"/>
-                <w:sz w:val="22"/>
+                <w:i w:val="0"/>
+                <w:color w:val="000000"/>
+                <w:sz w:val="24"/>
               </w:rPr>
               <w:t>Для каждой BOM</w:t>
             </w:r>
@@ -3450,8 +3652,7 @@
         </w:tc>
         <w:tc>
           <w:tcPr>
-            <w:tcW w:type="dxa" w:w="2268"/>
-            <w:shd w:val="nil"/>
+            <w:tcW w:type="dxa" w:w="2154"/>
             <w:vAlign w:val="center"/>
             <w:tcMar>
               <w:top w:w="80" w:type="dxa"/>
@@ -3463,16 +3664,18 @@
           <w:p>
             <w:pPr>
               <w:keepNext w:val="0"/>
-              <w:keepLines w:val="0"/>
+              <w:keepLines/>
               <w:spacing w:before="0" w:after="0" w:line="240" w:lineRule="auto"/>
               <w:ind w:left="0" w:right="0" w:firstLine="0"/>
               <w:jc w:val="left"/>
             </w:pPr>
             <w:r>
               <w:rPr>
-                <w:rFonts w:ascii="Times New Roman" w:hAnsi="Times New Roman" w:eastAsia="Times New Roman"/>
+                <w:rFonts w:ascii="Times New Roman" w:hAnsi="Times New Roman" w:eastAsia="Times New Roman" w:cs="Times New Roman"/>
                 <w:b w:val="0"/>
-                <w:sz w:val="22"/>
+                <w:i w:val="0"/>
+                <w:color w:val="000000"/>
+                <w:sz w:val="24"/>
               </w:rPr>
               <w:t>Запрос; справочник корпусов</w:t>
             </w:r>
@@ -3480,8 +3683,7 @@
         </w:tc>
         <w:tc>
           <w:tcPr>
-            <w:tcW w:type="dxa" w:w="1814"/>
-            <w:shd w:val="nil"/>
+            <w:tcW w:type="dxa" w:w="1701"/>
             <w:vAlign w:val="center"/>
             <w:tcMar>
               <w:top w:w="80" w:type="dxa"/>
@@ -3493,16 +3695,18 @@
           <w:p>
             <w:pPr>
               <w:keepNext w:val="0"/>
-              <w:keepLines w:val="0"/>
+              <w:keepLines/>
               <w:spacing w:before="0" w:after="0" w:line="240" w:lineRule="auto"/>
               <w:ind w:left="0" w:right="0" w:firstLine="0"/>
               <w:jc w:val="left"/>
             </w:pPr>
             <w:r>
               <w:rPr>
-                <w:rFonts w:ascii="Times New Roman" w:hAnsi="Times New Roman" w:eastAsia="Times New Roman"/>
+                <w:rFonts w:ascii="Times New Roman" w:hAnsi="Times New Roman" w:eastAsia="Times New Roman" w:cs="Times New Roman"/>
                 <w:b w:val="0"/>
-                <w:sz w:val="22"/>
+                <w:i w:val="0"/>
+                <w:color w:val="000000"/>
+                <w:sz w:val="24"/>
               </w:rPr>
               <w:t>Реестр BOM</w:t>
             </w:r>
@@ -3510,8 +3714,7 @@
         </w:tc>
         <w:tc>
           <w:tcPr>
-            <w:tcW w:type="dxa" w:w="1814"/>
-            <w:shd w:val="nil"/>
+            <w:tcW w:type="dxa" w:w="2551"/>
             <w:vAlign w:val="center"/>
             <w:tcMar>
               <w:top w:w="80" w:type="dxa"/>
@@ -3523,16 +3726,18 @@
           <w:p>
             <w:pPr>
               <w:keepNext w:val="0"/>
-              <w:keepLines w:val="0"/>
+              <w:keepLines/>
               <w:spacing w:before="0" w:after="0" w:line="240" w:lineRule="auto"/>
               <w:ind w:left="0" w:right="0" w:firstLine="0"/>
               <w:jc w:val="left"/>
             </w:pPr>
             <w:r>
               <w:rPr>
-                <w:rFonts w:ascii="Times New Roman" w:hAnsi="Times New Roman" w:eastAsia="Times New Roman"/>
+                <w:rFonts w:ascii="Times New Roman" w:hAnsi="Times New Roman" w:eastAsia="Times New Roman" w:cs="Times New Roman"/>
                 <w:b w:val="0"/>
-                <w:sz w:val="22"/>
+                <w:i w:val="0"/>
+                <w:color w:val="000000"/>
+                <w:sz w:val="24"/>
               </w:rPr>
               <w:t>Создаётся новая версия</w:t>
             </w:r>
@@ -3545,8 +3750,7 @@
         </w:trPr>
         <w:tc>
           <w:tcPr>
-            <w:tcW w:type="dxa" w:w="1247"/>
-            <w:shd w:val="nil"/>
+            <w:tcW w:type="dxa" w:w="964"/>
             <w:vAlign w:val="center"/>
             <w:tcMar>
               <w:top w:w="80" w:type="dxa"/>
@@ -3558,16 +3762,18 @@
           <w:p>
             <w:pPr>
               <w:keepNext w:val="0"/>
-              <w:keepLines w:val="0"/>
+              <w:keepLines/>
               <w:spacing w:before="0" w:after="0" w:line="240" w:lineRule="auto"/>
               <w:ind w:left="0" w:right="0" w:firstLine="0"/>
               <w:jc w:val="center"/>
             </w:pPr>
             <w:r>
               <w:rPr>
-                <w:rFonts w:ascii="Times New Roman" w:hAnsi="Times New Roman" w:eastAsia="Times New Roman"/>
+                <w:rFonts w:ascii="Times New Roman" w:hAnsi="Times New Roman" w:eastAsia="Times New Roman" w:cs="Times New Roman"/>
                 <w:b w:val="0"/>
-                <w:sz w:val="22"/>
+                <w:i w:val="0"/>
+                <w:color w:val="000000"/>
+                <w:sz w:val="24"/>
               </w:rPr>
               <w:t>A2 / A22</w:t>
             </w:r>
@@ -3575,8 +3781,7 @@
         </w:tc>
         <w:tc>
           <w:tcPr>
-            <w:tcW w:type="dxa" w:w="1984"/>
-            <w:shd w:val="nil"/>
+            <w:tcW w:type="dxa" w:w="1757"/>
             <w:vAlign w:val="center"/>
             <w:tcMar>
               <w:top w:w="80" w:type="dxa"/>
@@ -3588,16 +3793,18 @@
           <w:p>
             <w:pPr>
               <w:keepNext w:val="0"/>
-              <w:keepLines w:val="0"/>
+              <w:keepLines/>
               <w:spacing w:before="0" w:after="0" w:line="240" w:lineRule="auto"/>
               <w:ind w:left="0" w:right="0" w:firstLine="0"/>
               <w:jc w:val="left"/>
             </w:pPr>
             <w:r>
               <w:rPr>
-                <w:rFonts w:ascii="Times New Roman" w:hAnsi="Times New Roman" w:eastAsia="Times New Roman"/>
+                <w:rFonts w:ascii="Times New Roman" w:hAnsi="Times New Roman" w:eastAsia="Times New Roman" w:cs="Times New Roman"/>
                 <w:b w:val="0"/>
-                <w:sz w:val="22"/>
+                <w:i w:val="0"/>
+                <w:color w:val="000000"/>
+                <w:sz w:val="24"/>
               </w:rPr>
               <w:t>Состав BOM</w:t>
             </w:r>
@@ -3605,8 +3812,7 @@
         </w:tc>
         <w:tc>
           <w:tcPr>
-            <w:tcW w:type="dxa" w:w="1928"/>
-            <w:shd w:val="nil"/>
+            <w:tcW w:type="dxa" w:w="1984"/>
             <w:vAlign w:val="center"/>
             <w:tcMar>
               <w:top w:w="80" w:type="dxa"/>
@@ -3618,16 +3824,18 @@
           <w:p>
             <w:pPr>
               <w:keepNext w:val="0"/>
-              <w:keepLines w:val="0"/>
+              <w:keepLines/>
               <w:spacing w:before="0" w:after="0" w:line="240" w:lineRule="auto"/>
               <w:ind w:left="0" w:right="0" w:firstLine="0"/>
               <w:jc w:val="left"/>
             </w:pPr>
             <w:r>
               <w:rPr>
-                <w:rFonts w:ascii="Times New Roman" w:hAnsi="Times New Roman" w:eastAsia="Times New Roman"/>
+                <w:rFonts w:ascii="Times New Roman" w:hAnsi="Times New Roman" w:eastAsia="Times New Roman" w:cs="Times New Roman"/>
                 <w:b w:val="0"/>
-                <w:sz w:val="22"/>
+                <w:i w:val="0"/>
+                <w:color w:val="000000"/>
+                <w:sz w:val="24"/>
               </w:rPr>
               <w:t>Заполнить слоты BOM</w:t>
             </w:r>
@@ -3635,8 +3843,7 @@
         </w:tc>
         <w:tc>
           <w:tcPr>
-            <w:tcW w:type="dxa" w:w="1984"/>
-            <w:shd w:val="nil"/>
+            <w:tcW w:type="dxa" w:w="1814"/>
             <w:vAlign w:val="center"/>
             <w:tcMar>
               <w:top w:w="80" w:type="dxa"/>
@@ -3648,16 +3855,18 @@
           <w:p>
             <w:pPr>
               <w:keepNext w:val="0"/>
-              <w:keepLines w:val="0"/>
+              <w:keepLines/>
               <w:spacing w:before="0" w:after="0" w:line="240" w:lineRule="auto"/>
               <w:ind w:left="0" w:right="0" w:firstLine="0"/>
               <w:jc w:val="left"/>
             </w:pPr>
             <w:r>
               <w:rPr>
-                <w:rFonts w:ascii="Times New Roman" w:hAnsi="Times New Roman" w:eastAsia="Times New Roman"/>
+                <w:rFonts w:ascii="Times New Roman" w:hAnsi="Times New Roman" w:eastAsia="Times New Roman" w:cs="Times New Roman"/>
                 <w:b w:val="0"/>
-                <w:sz w:val="22"/>
+                <w:i w:val="0"/>
+                <w:color w:val="000000"/>
+                <w:sz w:val="24"/>
               </w:rPr>
               <w:t>Технический специалист</w:t>
             </w:r>
@@ -3665,8 +3874,7 @@
         </w:tc>
         <w:tc>
           <w:tcPr>
-            <w:tcW w:type="dxa" w:w="1701"/>
-            <w:shd w:val="nil"/>
+            <w:tcW w:type="dxa" w:w="1361"/>
             <w:vAlign w:val="center"/>
             <w:tcMar>
               <w:top w:w="80" w:type="dxa"/>
@@ -3678,16 +3886,18 @@
           <w:p>
             <w:pPr>
               <w:keepNext w:val="0"/>
-              <w:keepLines w:val="0"/>
+              <w:keepLines/>
               <w:spacing w:before="0" w:after="0" w:line="240" w:lineRule="auto"/>
               <w:ind w:left="0" w:right="0" w:firstLine="0"/>
               <w:jc w:val="left"/>
             </w:pPr>
             <w:r>
               <w:rPr>
-                <w:rFonts w:ascii="Times New Roman" w:hAnsi="Times New Roman" w:eastAsia="Times New Roman"/>
+                <w:rFonts w:ascii="Times New Roman" w:hAnsi="Times New Roman" w:eastAsia="Times New Roman" w:cs="Times New Roman"/>
                 <w:b w:val="0"/>
-                <w:sz w:val="22"/>
+                <w:i w:val="0"/>
+                <w:color w:val="000000"/>
+                <w:sz w:val="24"/>
               </w:rPr>
               <w:t>Для каждой BOM</w:t>
             </w:r>
@@ -3695,8 +3905,7 @@
         </w:tc>
         <w:tc>
           <w:tcPr>
-            <w:tcW w:type="dxa" w:w="2268"/>
-            <w:shd w:val="nil"/>
+            <w:tcW w:type="dxa" w:w="2154"/>
             <w:vAlign w:val="center"/>
             <w:tcMar>
               <w:top w:w="80" w:type="dxa"/>
@@ -3708,16 +3917,18 @@
           <w:p>
             <w:pPr>
               <w:keepNext w:val="0"/>
-              <w:keepLines w:val="0"/>
+              <w:keepLines/>
               <w:spacing w:before="0" w:after="0" w:line="240" w:lineRule="auto"/>
               <w:ind w:left="0" w:right="0" w:firstLine="0"/>
               <w:jc w:val="left"/>
             </w:pPr>
             <w:r>
               <w:rPr>
-                <w:rFonts w:ascii="Times New Roman" w:hAnsi="Times New Roman" w:eastAsia="Times New Roman"/>
+                <w:rFonts w:ascii="Times New Roman" w:hAnsi="Times New Roman" w:eastAsia="Times New Roman" w:cs="Times New Roman"/>
                 <w:b w:val="0"/>
-                <w:sz w:val="22"/>
+                <w:i w:val="0"/>
+                <w:color w:val="000000"/>
+                <w:sz w:val="24"/>
               </w:rPr>
               <w:t>Основа BOM; справочник компонентов</w:t>
             </w:r>
@@ -3725,8 +3936,7 @@
         </w:tc>
         <w:tc>
           <w:tcPr>
-            <w:tcW w:type="dxa" w:w="1814"/>
-            <w:shd w:val="nil"/>
+            <w:tcW w:type="dxa" w:w="1701"/>
             <w:vAlign w:val="center"/>
             <w:tcMar>
               <w:top w:w="80" w:type="dxa"/>
@@ -3738,16 +3948,18 @@
           <w:p>
             <w:pPr>
               <w:keepNext w:val="0"/>
-              <w:keepLines w:val="0"/>
+              <w:keepLines/>
               <w:spacing w:before="0" w:after="0" w:line="240" w:lineRule="auto"/>
               <w:ind w:left="0" w:right="0" w:firstLine="0"/>
               <w:jc w:val="left"/>
             </w:pPr>
             <w:r>
               <w:rPr>
-                <w:rFonts w:ascii="Times New Roman" w:hAnsi="Times New Roman" w:eastAsia="Times New Roman"/>
+                <w:rFonts w:ascii="Times New Roman" w:hAnsi="Times New Roman" w:eastAsia="Times New Roman" w:cs="Times New Roman"/>
                 <w:b w:val="0"/>
-                <w:sz w:val="22"/>
+                <w:i w:val="0"/>
+                <w:color w:val="000000"/>
+                <w:sz w:val="24"/>
               </w:rPr>
               <w:t>Реестр BOM</w:t>
             </w:r>
@@ -3755,8 +3967,7 @@
         </w:tc>
         <w:tc>
           <w:tcPr>
-            <w:tcW w:type="dxa" w:w="1814"/>
-            <w:shd w:val="nil"/>
+            <w:tcW w:type="dxa" w:w="2551"/>
             <w:vAlign w:val="center"/>
             <w:tcMar>
               <w:top w:w="80" w:type="dxa"/>
@@ -3768,16 +3979,18 @@
           <w:p>
             <w:pPr>
               <w:keepNext w:val="0"/>
-              <w:keepLines w:val="0"/>
+              <w:keepLines/>
               <w:spacing w:before="0" w:after="0" w:line="240" w:lineRule="auto"/>
               <w:ind w:left="0" w:right="0" w:firstLine="0"/>
               <w:jc w:val="left"/>
             </w:pPr>
             <w:r>
               <w:rPr>
-                <w:rFonts w:ascii="Times New Roman" w:hAnsi="Times New Roman" w:eastAsia="Times New Roman"/>
+                <w:rFonts w:ascii="Times New Roman" w:hAnsi="Times New Roman" w:eastAsia="Times New Roman" w:cs="Times New Roman"/>
                 <w:b w:val="0"/>
-                <w:sz w:val="22"/>
+                <w:i w:val="0"/>
+                <w:color w:val="000000"/>
+                <w:sz w:val="24"/>
               </w:rPr>
               <w:t>Группа или точная модель</w:t>
             </w:r>
@@ -3790,8 +4003,7 @@
         </w:trPr>
         <w:tc>
           <w:tcPr>
-            <w:tcW w:type="dxa" w:w="1247"/>
-            <w:shd w:val="nil"/>
+            <w:tcW w:type="dxa" w:w="964"/>
             <w:vAlign w:val="center"/>
             <w:tcMar>
               <w:top w:w="80" w:type="dxa"/>
@@ -3803,16 +4015,18 @@
           <w:p>
             <w:pPr>
               <w:keepNext w:val="0"/>
-              <w:keepLines w:val="0"/>
+              <w:keepLines/>
               <w:spacing w:before="0" w:after="0" w:line="240" w:lineRule="auto"/>
               <w:ind w:left="0" w:right="0" w:firstLine="0"/>
               <w:jc w:val="center"/>
             </w:pPr>
             <w:r>
               <w:rPr>
-                <w:rFonts w:ascii="Times New Roman" w:hAnsi="Times New Roman" w:eastAsia="Times New Roman"/>
+                <w:rFonts w:ascii="Times New Roman" w:hAnsi="Times New Roman" w:eastAsia="Times New Roman" w:cs="Times New Roman"/>
                 <w:b w:val="0"/>
-                <w:sz w:val="22"/>
+                <w:i w:val="0"/>
+                <w:color w:val="000000"/>
+                <w:sz w:val="24"/>
               </w:rPr>
               <w:t>A2 / A23</w:t>
             </w:r>
@@ -3820,8 +4034,7 @@
         </w:tc>
         <w:tc>
           <w:tcPr>
-            <w:tcW w:type="dxa" w:w="1984"/>
-            <w:shd w:val="nil"/>
+            <w:tcW w:type="dxa" w:w="1757"/>
             <w:vAlign w:val="center"/>
             <w:tcMar>
               <w:top w:w="80" w:type="dxa"/>
@@ -3833,16 +4046,18 @@
           <w:p>
             <w:pPr>
               <w:keepNext w:val="0"/>
-              <w:keepLines w:val="0"/>
+              <w:keepLines/>
               <w:spacing w:before="0" w:after="0" w:line="240" w:lineRule="auto"/>
               <w:ind w:left="0" w:right="0" w:firstLine="0"/>
               <w:jc w:val="left"/>
             </w:pPr>
             <w:r>
               <w:rPr>
-                <w:rFonts w:ascii="Times New Roman" w:hAnsi="Times New Roman" w:eastAsia="Times New Roman"/>
+                <w:rFonts w:ascii="Times New Roman" w:hAnsi="Times New Roman" w:eastAsia="Times New Roman" w:cs="Times New Roman"/>
                 <w:b w:val="0"/>
-                <w:sz w:val="22"/>
+                <w:i w:val="0"/>
+                <w:color w:val="000000"/>
+                <w:sz w:val="24"/>
               </w:rPr>
               <w:t>Связи с товарами поставщиков</w:t>
             </w:r>
@@ -3850,8 +4065,7 @@
         </w:tc>
         <w:tc>
           <w:tcPr>
-            <w:tcW w:type="dxa" w:w="1928"/>
-            <w:shd w:val="nil"/>
+            <w:tcW w:type="dxa" w:w="1984"/>
             <w:vAlign w:val="center"/>
             <w:tcMar>
               <w:top w:w="80" w:type="dxa"/>
@@ -3863,16 +4077,18 @@
           <w:p>
             <w:pPr>
               <w:keepNext w:val="0"/>
-              <w:keepLines w:val="0"/>
+              <w:keepLines/>
               <w:spacing w:before="0" w:after="0" w:line="240" w:lineRule="auto"/>
               <w:ind w:left="0" w:right="0" w:firstLine="0"/>
               <w:jc w:val="left"/>
             </w:pPr>
             <w:r>
               <w:rPr>
-                <w:rFonts w:ascii="Times New Roman" w:hAnsi="Times New Roman" w:eastAsia="Times New Roman"/>
+                <w:rFonts w:ascii="Times New Roman" w:hAnsi="Times New Roman" w:eastAsia="Times New Roman" w:cs="Times New Roman"/>
                 <w:b w:val="0"/>
-                <w:sz w:val="22"/>
+                <w:i w:val="0"/>
+                <w:color w:val="000000"/>
+                <w:sz w:val="24"/>
               </w:rPr>
               <w:t>Сопоставить компоненты</w:t>
             </w:r>
@@ -3880,8 +4096,7 @@
         </w:tc>
         <w:tc>
           <w:tcPr>
-            <w:tcW w:type="dxa" w:w="1984"/>
-            <w:shd w:val="nil"/>
+            <w:tcW w:type="dxa" w:w="1814"/>
             <w:vAlign w:val="center"/>
             <w:tcMar>
               <w:top w:w="80" w:type="dxa"/>
@@ -3893,16 +4108,18 @@
           <w:p>
             <w:pPr>
               <w:keepNext w:val="0"/>
-              <w:keepLines w:val="0"/>
+              <w:keepLines/>
               <w:spacing w:before="0" w:after="0" w:line="240" w:lineRule="auto"/>
               <w:ind w:left="0" w:right="0" w:firstLine="0"/>
               <w:jc w:val="left"/>
             </w:pPr>
             <w:r>
               <w:rPr>
-                <w:rFonts w:ascii="Times New Roman" w:hAnsi="Times New Roman" w:eastAsia="Times New Roman"/>
+                <w:rFonts w:ascii="Times New Roman" w:hAnsi="Times New Roman" w:eastAsia="Times New Roman" w:cs="Times New Roman"/>
                 <w:b w:val="0"/>
-                <w:sz w:val="22"/>
+                <w:i w:val="0"/>
+                <w:color w:val="000000"/>
+                <w:sz w:val="24"/>
               </w:rPr>
               <w:t>Технический специалист</w:t>
             </w:r>
@@ -3910,8 +4127,7 @@
         </w:tc>
         <w:tc>
           <w:tcPr>
-            <w:tcW w:type="dxa" w:w="1701"/>
-            <w:shd w:val="nil"/>
+            <w:tcW w:type="dxa" w:w="1361"/>
             <w:vAlign w:val="center"/>
             <w:tcMar>
               <w:top w:w="80" w:type="dxa"/>
@@ -3923,16 +4139,18 @@
           <w:p>
             <w:pPr>
               <w:keepNext w:val="0"/>
-              <w:keepLines w:val="0"/>
+              <w:keepLines/>
               <w:spacing w:before="0" w:after="0" w:line="240" w:lineRule="auto"/>
               <w:ind w:left="0" w:right="0" w:firstLine="0"/>
               <w:jc w:val="left"/>
             </w:pPr>
             <w:r>
               <w:rPr>
-                <w:rFonts w:ascii="Times New Roman" w:hAnsi="Times New Roman" w:eastAsia="Times New Roman"/>
+                <w:rFonts w:ascii="Times New Roman" w:hAnsi="Times New Roman" w:eastAsia="Times New Roman" w:cs="Times New Roman"/>
                 <w:b w:val="0"/>
-                <w:sz w:val="22"/>
+                <w:i w:val="0"/>
+                <w:color w:val="000000"/>
+                <w:sz w:val="24"/>
               </w:rPr>
               <w:t>При новой модели</w:t>
             </w:r>
@@ -3940,8 +4158,7 @@
         </w:tc>
         <w:tc>
           <w:tcPr>
-            <w:tcW w:type="dxa" w:w="2268"/>
-            <w:shd w:val="nil"/>
+            <w:tcW w:type="dxa" w:w="2154"/>
             <w:vAlign w:val="center"/>
             <w:tcMar>
               <w:top w:w="80" w:type="dxa"/>
@@ -3953,16 +4170,18 @@
           <w:p>
             <w:pPr>
               <w:keepNext w:val="0"/>
-              <w:keepLines w:val="0"/>
+              <w:keepLines/>
               <w:spacing w:before="0" w:after="0" w:line="240" w:lineRule="auto"/>
               <w:ind w:left="0" w:right="0" w:firstLine="0"/>
               <w:jc w:val="left"/>
             </w:pPr>
             <w:r>
               <w:rPr>
-                <w:rFonts w:ascii="Times New Roman" w:hAnsi="Times New Roman" w:eastAsia="Times New Roman"/>
+                <w:rFonts w:ascii="Times New Roman" w:hAnsi="Times New Roman" w:eastAsia="Times New Roman" w:cs="Times New Roman"/>
                 <w:b w:val="0"/>
-                <w:sz w:val="22"/>
+                <w:i w:val="0"/>
+                <w:color w:val="000000"/>
+                <w:sz w:val="24"/>
               </w:rPr>
               <w:t>Товары PC4Games и ITPartner</w:t>
             </w:r>
@@ -3970,8 +4189,7 @@
         </w:tc>
         <w:tc>
           <w:tcPr>
-            <w:tcW w:type="dxa" w:w="1814"/>
-            <w:shd w:val="nil"/>
+            <w:tcW w:type="dxa" w:w="1701"/>
             <w:vAlign w:val="center"/>
             <w:tcMar>
               <w:top w:w="80" w:type="dxa"/>
@@ -3983,16 +4201,18 @@
           <w:p>
             <w:pPr>
               <w:keepNext w:val="0"/>
-              <w:keepLines w:val="0"/>
+              <w:keepLines/>
               <w:spacing w:before="0" w:after="0" w:line="240" w:lineRule="auto"/>
               <w:ind w:left="0" w:right="0" w:firstLine="0"/>
               <w:jc w:val="left"/>
             </w:pPr>
             <w:r>
               <w:rPr>
-                <w:rFonts w:ascii="Times New Roman" w:hAnsi="Times New Roman" w:eastAsia="Times New Roman"/>
+                <w:rFonts w:ascii="Times New Roman" w:hAnsi="Times New Roman" w:eastAsia="Times New Roman" w:cs="Times New Roman"/>
                 <w:b w:val="0"/>
-                <w:sz w:val="22"/>
+                <w:i w:val="0"/>
+                <w:color w:val="000000"/>
+                <w:sz w:val="24"/>
               </w:rPr>
               <w:t>Реестр сопоставлений</w:t>
             </w:r>
@@ -4000,8 +4220,7 @@
         </w:tc>
         <w:tc>
           <w:tcPr>
-            <w:tcW w:type="dxa" w:w="1814"/>
-            <w:shd w:val="nil"/>
+            <w:tcW w:type="dxa" w:w="2551"/>
             <w:vAlign w:val="center"/>
             <w:tcMar>
               <w:top w:w="80" w:type="dxa"/>
@@ -4013,16 +4232,18 @@
           <w:p>
             <w:pPr>
               <w:keepNext w:val="0"/>
-              <w:keepLines w:val="0"/>
+              <w:keepLines/>
               <w:spacing w:before="0" w:after="0" w:line="240" w:lineRule="auto"/>
               <w:ind w:left="0" w:right="0" w:firstLine="0"/>
               <w:jc w:val="left"/>
             </w:pPr>
             <w:r>
               <w:rPr>
-                <w:rFonts w:ascii="Times New Roman" w:hAnsi="Times New Roman" w:eastAsia="Times New Roman"/>
+                <w:rFonts w:ascii="Times New Roman" w:hAnsi="Times New Roman" w:eastAsia="Times New Roman" w:cs="Times New Roman"/>
                 <w:b w:val="0"/>
-                <w:sz w:val="22"/>
+                <w:i w:val="0"/>
+                <w:color w:val="000000"/>
+                <w:sz w:val="24"/>
               </w:rPr>
               <w:t>Один компонент может иметь несколько товаров</w:t>
             </w:r>
@@ -4035,8 +4256,7 @@
         </w:trPr>
         <w:tc>
           <w:tcPr>
-            <w:tcW w:type="dxa" w:w="1247"/>
-            <w:shd w:val="nil"/>
+            <w:tcW w:type="dxa" w:w="964"/>
             <w:vAlign w:val="center"/>
             <w:tcMar>
               <w:top w:w="80" w:type="dxa"/>
@@ -4048,16 +4268,18 @@
           <w:p>
             <w:pPr>
               <w:keepNext w:val="0"/>
-              <w:keepLines w:val="0"/>
+              <w:keepLines/>
               <w:spacing w:before="0" w:after="0" w:line="240" w:lineRule="auto"/>
               <w:ind w:left="0" w:right="0" w:firstLine="0"/>
               <w:jc w:val="center"/>
             </w:pPr>
             <w:r>
               <w:rPr>
-                <w:rFonts w:ascii="Times New Roman" w:hAnsi="Times New Roman" w:eastAsia="Times New Roman"/>
+                <w:rFonts w:ascii="Times New Roman" w:hAnsi="Times New Roman" w:eastAsia="Times New Roman" w:cs="Times New Roman"/>
                 <w:b w:val="0"/>
-                <w:sz w:val="22"/>
+                <w:i w:val="0"/>
+                <w:color w:val="000000"/>
+                <w:sz w:val="24"/>
               </w:rPr>
               <w:t>A2 / A24</w:t>
             </w:r>
@@ -4065,8 +4287,7 @@
         </w:tc>
         <w:tc>
           <w:tcPr>
-            <w:tcW w:type="dxa" w:w="1984"/>
-            <w:shd w:val="nil"/>
+            <w:tcW w:type="dxa" w:w="1757"/>
             <w:vAlign w:val="center"/>
             <w:tcMar>
               <w:top w:w="80" w:type="dxa"/>
@@ -4078,16 +4299,18 @@
           <w:p>
             <w:pPr>
               <w:keepNext w:val="0"/>
-              <w:keepLines w:val="0"/>
+              <w:keepLines/>
               <w:spacing w:before="0" w:after="0" w:line="240" w:lineRule="auto"/>
               <w:ind w:left="0" w:right="0" w:firstLine="0"/>
               <w:jc w:val="left"/>
             </w:pPr>
             <w:r>
               <w:rPr>
-                <w:rFonts w:ascii="Times New Roman" w:hAnsi="Times New Roman" w:eastAsia="Times New Roman"/>
+                <w:rFonts w:ascii="Times New Roman" w:hAnsi="Times New Roman" w:eastAsia="Times New Roman" w:cs="Times New Roman"/>
                 <w:b w:val="0"/>
-                <w:sz w:val="22"/>
+                <w:i w:val="0"/>
+                <w:color w:val="000000"/>
+                <w:sz w:val="24"/>
               </w:rPr>
               <w:t>Выбранные предложения</w:t>
             </w:r>
@@ -4095,8 +4318,7 @@
         </w:tc>
         <w:tc>
           <w:tcPr>
-            <w:tcW w:type="dxa" w:w="1928"/>
-            <w:shd w:val="nil"/>
+            <w:tcW w:type="dxa" w:w="1984"/>
             <w:vAlign w:val="center"/>
             <w:tcMar>
               <w:top w:w="80" w:type="dxa"/>
@@ -4108,16 +4330,18 @@
           <w:p>
             <w:pPr>
               <w:keepNext w:val="0"/>
-              <w:keepLines w:val="0"/>
+              <w:keepLines/>
               <w:spacing w:before="0" w:after="0" w:line="240" w:lineRule="auto"/>
               <w:ind w:left="0" w:right="0" w:firstLine="0"/>
               <w:jc w:val="left"/>
             </w:pPr>
             <w:r>
               <w:rPr>
-                <w:rFonts w:ascii="Times New Roman" w:hAnsi="Times New Roman" w:eastAsia="Times New Roman"/>
+                <w:rFonts w:ascii="Times New Roman" w:hAnsi="Times New Roman" w:eastAsia="Times New Roman" w:cs="Times New Roman"/>
                 <w:b w:val="0"/>
-                <w:sz w:val="22"/>
+                <w:i w:val="0"/>
+                <w:color w:val="000000"/>
+                <w:sz w:val="24"/>
               </w:rPr>
               <w:t>Выбрать актуальные цены и наличие</w:t>
             </w:r>
@@ -4125,8 +4349,7 @@
         </w:tc>
         <w:tc>
           <w:tcPr>
-            <w:tcW w:type="dxa" w:w="1984"/>
-            <w:shd w:val="nil"/>
+            <w:tcW w:type="dxa" w:w="1814"/>
             <w:vAlign w:val="center"/>
             <w:tcMar>
               <w:top w:w="80" w:type="dxa"/>
@@ -4138,16 +4361,18 @@
           <w:p>
             <w:pPr>
               <w:keepNext w:val="0"/>
-              <w:keepLines w:val="0"/>
+              <w:keepLines/>
               <w:spacing w:before="0" w:after="0" w:line="240" w:lineRule="auto"/>
               <w:ind w:left="0" w:right="0" w:firstLine="0"/>
               <w:jc w:val="left"/>
             </w:pPr>
             <w:r>
               <w:rPr>
-                <w:rFonts w:ascii="Times New Roman" w:hAnsi="Times New Roman" w:eastAsia="Times New Roman"/>
+                <w:rFonts w:ascii="Times New Roman" w:hAnsi="Times New Roman" w:eastAsia="Times New Roman" w:cs="Times New Roman"/>
                 <w:b w:val="0"/>
-                <w:sz w:val="22"/>
+                <w:i w:val="0"/>
+                <w:color w:val="000000"/>
+                <w:sz w:val="24"/>
               </w:rPr>
               <w:t>ИС по правилам приоритета</w:t>
             </w:r>
@@ -4155,8 +4380,7 @@
         </w:tc>
         <w:tc>
           <w:tcPr>
-            <w:tcW w:type="dxa" w:w="1701"/>
-            <w:shd w:val="nil"/>
+            <w:tcW w:type="dxa" w:w="1361"/>
             <w:vAlign w:val="center"/>
             <w:tcMar>
               <w:top w:w="80" w:type="dxa"/>
@@ -4168,25 +4392,26 @@
           <w:p>
             <w:pPr>
               <w:keepNext w:val="0"/>
-              <w:keepLines w:val="0"/>
+              <w:keepLines/>
               <w:spacing w:before="0" w:after="0" w:line="240" w:lineRule="auto"/>
-              <w:ind w:left="0" w:right="0" w:firstLine="0"/>
+              <w:ind w:firstLine="0" w:left="0" w:right="0"/>
               <w:jc w:val="left"/>
             </w:pPr>
             <w:r>
               <w:rPr>
-                <w:rFonts w:ascii="Times New Roman" w:hAnsi="Times New Roman" w:eastAsia="Times New Roman"/>
+                <w:rFonts w:ascii="Times New Roman" w:hAnsi="Times New Roman" w:eastAsia="Times New Roman" w:cs="Times New Roman"/>
                 <w:b w:val="0"/>
-                <w:sz w:val="22"/>
+                <w:i w:val="0"/>
+                <w:color w:val="000000"/>
+                <w:sz w:val="24"/>
               </w:rPr>
-              <w:t>При обновлении данных</w:t>
+              <w:t>При загрузке цен</w:t>
             </w:r>
           </w:p>
         </w:tc>
         <w:tc>
           <w:tcPr>
-            <w:tcW w:type="dxa" w:w="2268"/>
-            <w:shd w:val="nil"/>
+            <w:tcW w:type="dxa" w:w="2154"/>
             <w:vAlign w:val="center"/>
             <w:tcMar>
               <w:top w:w="80" w:type="dxa"/>
@@ -4198,16 +4423,18 @@
           <w:p>
             <w:pPr>
               <w:keepNext w:val="0"/>
-              <w:keepLines w:val="0"/>
+              <w:keepLines/>
               <w:spacing w:before="0" w:after="0" w:line="240" w:lineRule="auto"/>
               <w:ind w:left="0" w:right="0" w:firstLine="0"/>
               <w:jc w:val="left"/>
             </w:pPr>
             <w:r>
               <w:rPr>
-                <w:rFonts w:ascii="Times New Roman" w:hAnsi="Times New Roman" w:eastAsia="Times New Roman"/>
+                <w:rFonts w:ascii="Times New Roman" w:hAnsi="Times New Roman" w:eastAsia="Times New Roman" w:cs="Times New Roman"/>
                 <w:b w:val="0"/>
-                <w:sz w:val="22"/>
+                <w:i w:val="0"/>
+                <w:color w:val="000000"/>
+                <w:sz w:val="24"/>
               </w:rPr>
               <w:t>Предложения поставщиков</w:t>
             </w:r>
@@ -4215,8 +4442,7 @@
         </w:tc>
         <w:tc>
           <w:tcPr>
-            <w:tcW w:type="dxa" w:w="1814"/>
-            <w:shd w:val="nil"/>
+            <w:tcW w:type="dxa" w:w="1701"/>
             <w:vAlign w:val="center"/>
             <w:tcMar>
               <w:top w:w="80" w:type="dxa"/>
@@ -4228,16 +4454,18 @@
           <w:p>
             <w:pPr>
               <w:keepNext w:val="0"/>
-              <w:keepLines w:val="0"/>
+              <w:keepLines/>
               <w:spacing w:before="0" w:after="0" w:line="240" w:lineRule="auto"/>
               <w:ind w:left="0" w:right="0" w:firstLine="0"/>
               <w:jc w:val="left"/>
             </w:pPr>
             <w:r>
               <w:rPr>
-                <w:rFonts w:ascii="Times New Roman" w:hAnsi="Times New Roman" w:eastAsia="Times New Roman"/>
+                <w:rFonts w:ascii="Times New Roman" w:hAnsi="Times New Roman" w:eastAsia="Times New Roman" w:cs="Times New Roman"/>
                 <w:b w:val="0"/>
-                <w:sz w:val="22"/>
+                <w:i w:val="0"/>
+                <w:color w:val="000000"/>
+                <w:sz w:val="24"/>
               </w:rPr>
               <w:t>Реестр предложений</w:t>
             </w:r>
@@ -4245,8 +4473,7 @@
         </w:tc>
         <w:tc>
           <w:tcPr>
-            <w:tcW w:type="dxa" w:w="1814"/>
-            <w:shd w:val="nil"/>
+            <w:tcW w:type="dxa" w:w="2551"/>
             <w:vAlign w:val="center"/>
             <w:tcMar>
               <w:top w:w="80" w:type="dxa"/>
@@ -4258,16 +4485,18 @@
           <w:p>
             <w:pPr>
               <w:keepNext w:val="0"/>
-              <w:keepLines w:val="0"/>
+              <w:keepLines/>
               <w:spacing w:before="0" w:after="0" w:line="240" w:lineRule="auto"/>
               <w:ind w:left="0" w:right="0" w:firstLine="0"/>
               <w:jc w:val="left"/>
             </w:pPr>
             <w:r>
               <w:rPr>
-                <w:rFonts w:ascii="Times New Roman" w:hAnsi="Times New Roman" w:eastAsia="Times New Roman"/>
+                <w:rFonts w:ascii="Times New Roman" w:hAnsi="Times New Roman" w:eastAsia="Times New Roman" w:cs="Times New Roman"/>
                 <w:b w:val="0"/>
-                <w:sz w:val="22"/>
+                <w:i w:val="0"/>
+                <w:color w:val="000000"/>
+                <w:sz w:val="24"/>
               </w:rPr>
               <w:t>Цена имеет момент актуальности</w:t>
             </w:r>
@@ -4280,8 +4509,7 @@
         </w:trPr>
         <w:tc>
           <w:tcPr>
-            <w:tcW w:type="dxa" w:w="1247"/>
-            <w:shd w:val="nil"/>
+            <w:tcW w:type="dxa" w:w="964"/>
             <w:vAlign w:val="center"/>
             <w:tcMar>
               <w:top w:w="80" w:type="dxa"/>
@@ -4293,16 +4521,18 @@
           <w:p>
             <w:pPr>
               <w:keepNext w:val="0"/>
-              <w:keepLines w:val="0"/>
+              <w:keepLines/>
               <w:spacing w:before="0" w:after="0" w:line="240" w:lineRule="auto"/>
               <w:ind w:left="0" w:right="0" w:firstLine="0"/>
               <w:jc w:val="center"/>
             </w:pPr>
             <w:r>
               <w:rPr>
-                <w:rFonts w:ascii="Times New Roman" w:hAnsi="Times New Roman" w:eastAsia="Times New Roman"/>
+                <w:rFonts w:ascii="Times New Roman" w:hAnsi="Times New Roman" w:eastAsia="Times New Roman" w:cs="Times New Roman"/>
                 <w:b w:val="0"/>
-                <w:sz w:val="22"/>
+                <w:i w:val="0"/>
+                <w:color w:val="000000"/>
+                <w:sz w:val="24"/>
               </w:rPr>
               <w:t>A2 / A25</w:t>
             </w:r>
@@ -4310,8 +4540,7 @@
         </w:tc>
         <w:tc>
           <w:tcPr>
-            <w:tcW w:type="dxa" w:w="1984"/>
-            <w:shd w:val="nil"/>
+            <w:tcW w:type="dxa" w:w="1757"/>
             <w:vAlign w:val="center"/>
             <w:tcMar>
               <w:top w:w="80" w:type="dxa"/>
@@ -4323,16 +4552,18 @@
           <w:p>
             <w:pPr>
               <w:keepNext w:val="0"/>
-              <w:keepLines w:val="0"/>
+              <w:keepLines/>
               <w:spacing w:before="0" w:after="0" w:line="240" w:lineRule="auto"/>
               <w:ind w:left="0" w:right="0" w:firstLine="0"/>
               <w:jc w:val="left"/>
             </w:pPr>
             <w:r>
               <w:rPr>
-                <w:rFonts w:ascii="Times New Roman" w:hAnsi="Times New Roman" w:eastAsia="Times New Roman"/>
+                <w:rFonts w:ascii="Times New Roman" w:hAnsi="Times New Roman" w:eastAsia="Times New Roman" w:cs="Times New Roman"/>
                 <w:b w:val="0"/>
-                <w:sz w:val="22"/>
+                <w:i w:val="0"/>
+                <w:color w:val="000000"/>
+                <w:sz w:val="24"/>
               </w:rPr>
               <w:t>Версия BOM</w:t>
             </w:r>
@@ -4340,8 +4571,7 @@
         </w:tc>
         <w:tc>
           <w:tcPr>
-            <w:tcW w:type="dxa" w:w="1928"/>
-            <w:shd w:val="nil"/>
+            <w:tcW w:type="dxa" w:w="1984"/>
             <w:vAlign w:val="center"/>
             <w:tcMar>
               <w:top w:w="80" w:type="dxa"/>
@@ -4353,16 +4583,18 @@
           <w:p>
             <w:pPr>
               <w:keepNext w:val="0"/>
-              <w:keepLines w:val="0"/>
+              <w:keepLines/>
               <w:spacing w:before="0" w:after="0" w:line="240" w:lineRule="auto"/>
               <w:ind w:left="0" w:right="0" w:firstLine="0"/>
               <w:jc w:val="left"/>
             </w:pPr>
             <w:r>
               <w:rPr>
-                <w:rFonts w:ascii="Times New Roman" w:hAnsi="Times New Roman" w:eastAsia="Times New Roman"/>
+                <w:rFonts w:ascii="Times New Roman" w:hAnsi="Times New Roman" w:eastAsia="Times New Roman" w:cs="Times New Roman"/>
                 <w:b w:val="0"/>
-                <w:sz w:val="22"/>
+                <w:i w:val="0"/>
+                <w:color w:val="000000"/>
+                <w:sz w:val="24"/>
               </w:rPr>
               <w:t>Сохранить версию</w:t>
             </w:r>
@@ -4370,8 +4602,7 @@
         </w:tc>
         <w:tc>
           <w:tcPr>
-            <w:tcW w:type="dxa" w:w="1984"/>
-            <w:shd w:val="nil"/>
+            <w:tcW w:type="dxa" w:w="1814"/>
             <w:vAlign w:val="center"/>
             <w:tcMar>
               <w:top w:w="80" w:type="dxa"/>
@@ -4383,16 +4614,18 @@
           <w:p>
             <w:pPr>
               <w:keepNext w:val="0"/>
-              <w:keepLines w:val="0"/>
+              <w:keepLines/>
               <w:spacing w:before="0" w:after="0" w:line="240" w:lineRule="auto"/>
               <w:ind w:left="0" w:right="0" w:firstLine="0"/>
               <w:jc w:val="left"/>
             </w:pPr>
             <w:r>
               <w:rPr>
-                <w:rFonts w:ascii="Times New Roman" w:hAnsi="Times New Roman" w:eastAsia="Times New Roman"/>
+                <w:rFonts w:ascii="Times New Roman" w:hAnsi="Times New Roman" w:eastAsia="Times New Roman" w:cs="Times New Roman"/>
                 <w:b w:val="0"/>
-                <w:sz w:val="22"/>
+                <w:i w:val="0"/>
+                <w:color w:val="000000"/>
+                <w:sz w:val="24"/>
               </w:rPr>
               <w:t>Технический специалист</w:t>
             </w:r>
@@ -4400,8 +4633,7 @@
         </w:tc>
         <w:tc>
           <w:tcPr>
-            <w:tcW w:type="dxa" w:w="1701"/>
-            <w:shd w:val="nil"/>
+            <w:tcW w:type="dxa" w:w="1361"/>
             <w:vAlign w:val="center"/>
             <w:tcMar>
               <w:top w:w="80" w:type="dxa"/>
@@ -4413,16 +4645,18 @@
           <w:p>
             <w:pPr>
               <w:keepNext w:val="0"/>
-              <w:keepLines w:val="0"/>
+              <w:keepLines/>
               <w:spacing w:before="0" w:after="0" w:line="240" w:lineRule="auto"/>
               <w:ind w:left="0" w:right="0" w:firstLine="0"/>
               <w:jc w:val="left"/>
             </w:pPr>
             <w:r>
               <w:rPr>
-                <w:rFonts w:ascii="Times New Roman" w:hAnsi="Times New Roman" w:eastAsia="Times New Roman"/>
+                <w:rFonts w:ascii="Times New Roman" w:hAnsi="Times New Roman" w:eastAsia="Times New Roman" w:cs="Times New Roman"/>
                 <w:b w:val="0"/>
-                <w:sz w:val="22"/>
+                <w:i w:val="0"/>
+                <w:color w:val="000000"/>
+                <w:sz w:val="24"/>
               </w:rPr>
               <w:t>После каждого изменения</w:t>
             </w:r>
@@ -4430,8 +4664,7 @@
         </w:tc>
         <w:tc>
           <w:tcPr>
-            <w:tcW w:type="dxa" w:w="2268"/>
-            <w:shd w:val="nil"/>
+            <w:tcW w:type="dxa" w:w="2154"/>
             <w:vAlign w:val="center"/>
             <w:tcMar>
               <w:top w:w="80" w:type="dxa"/>
@@ -4443,16 +4676,18 @@
           <w:p>
             <w:pPr>
               <w:keepNext w:val="0"/>
-              <w:keepLines w:val="0"/>
+              <w:keepLines/>
               <w:spacing w:before="0" w:after="0" w:line="240" w:lineRule="auto"/>
               <w:ind w:left="0" w:right="0" w:firstLine="0"/>
               <w:jc w:val="left"/>
             </w:pPr>
             <w:r>
               <w:rPr>
-                <w:rFonts w:ascii="Times New Roman" w:hAnsi="Times New Roman" w:eastAsia="Times New Roman"/>
+                <w:rFonts w:ascii="Times New Roman" w:hAnsi="Times New Roman" w:eastAsia="Times New Roman" w:cs="Times New Roman"/>
                 <w:b w:val="0"/>
-                <w:sz w:val="22"/>
+                <w:i w:val="0"/>
+                <w:color w:val="000000"/>
+                <w:sz w:val="24"/>
               </w:rPr>
               <w:t>Состав и выбранные предложения</w:t>
             </w:r>
@@ -4460,8 +4695,7 @@
         </w:tc>
         <w:tc>
           <w:tcPr>
-            <w:tcW w:type="dxa" w:w="1814"/>
-            <w:shd w:val="nil"/>
+            <w:tcW w:type="dxa" w:w="1701"/>
             <w:vAlign w:val="center"/>
             <w:tcMar>
               <w:top w:w="80" w:type="dxa"/>
@@ -4473,16 +4707,18 @@
           <w:p>
             <w:pPr>
               <w:keepNext w:val="0"/>
-              <w:keepLines w:val="0"/>
+              <w:keepLines/>
               <w:spacing w:before="0" w:after="0" w:line="240" w:lineRule="auto"/>
               <w:ind w:left="0" w:right="0" w:firstLine="0"/>
               <w:jc w:val="left"/>
             </w:pPr>
             <w:r>
               <w:rPr>
-                <w:rFonts w:ascii="Times New Roman" w:hAnsi="Times New Roman" w:eastAsia="Times New Roman"/>
+                <w:rFonts w:ascii="Times New Roman" w:hAnsi="Times New Roman" w:eastAsia="Times New Roman" w:cs="Times New Roman"/>
                 <w:b w:val="0"/>
-                <w:sz w:val="22"/>
+                <w:i w:val="0"/>
+                <w:color w:val="000000"/>
+                <w:sz w:val="24"/>
               </w:rPr>
               <w:t>Реестр BOM</w:t>
             </w:r>
@@ -4490,8 +4726,7 @@
         </w:tc>
         <w:tc>
           <w:tcPr>
-            <w:tcW w:type="dxa" w:w="1814"/>
-            <w:shd w:val="nil"/>
+            <w:tcW w:type="dxa" w:w="2551"/>
             <w:vAlign w:val="center"/>
             <w:tcMar>
               <w:top w:w="80" w:type="dxa"/>
@@ -4503,16 +4738,18 @@
           <w:p>
             <w:pPr>
               <w:keepNext w:val="0"/>
-              <w:keepLines w:val="0"/>
+              <w:keepLines/>
               <w:spacing w:before="0" w:after="0" w:line="240" w:lineRule="auto"/>
               <w:ind w:left="0" w:right="0" w:firstLine="0"/>
               <w:jc w:val="left"/>
             </w:pPr>
             <w:r>
               <w:rPr>
-                <w:rFonts w:ascii="Times New Roman" w:hAnsi="Times New Roman" w:eastAsia="Times New Roman"/>
+                <w:rFonts w:ascii="Times New Roman" w:hAnsi="Times New Roman" w:eastAsia="Times New Roman" w:cs="Times New Roman"/>
                 <w:b w:val="0"/>
-                <w:sz w:val="22"/>
+                <w:i w:val="0"/>
+                <w:color w:val="000000"/>
+                <w:sz w:val="24"/>
               </w:rPr>
               <w:t>Передаётся на проверку</w:t>
             </w:r>
@@ -4525,8 +4762,7 @@
         </w:trPr>
         <w:tc>
           <w:tcPr>
-            <w:tcW w:type="dxa" w:w="1247"/>
-            <w:shd w:val="nil"/>
+            <w:tcW w:type="dxa" w:w="964"/>
             <w:vAlign w:val="center"/>
             <w:tcMar>
               <w:top w:w="80" w:type="dxa"/>
@@ -4538,16 +4774,18 @@
           <w:p>
             <w:pPr>
               <w:keepNext w:val="0"/>
-              <w:keepLines w:val="0"/>
+              <w:keepLines/>
               <w:spacing w:before="0" w:after="0" w:line="240" w:lineRule="auto"/>
               <w:ind w:left="0" w:right="0" w:firstLine="0"/>
               <w:jc w:val="center"/>
             </w:pPr>
             <w:r>
               <w:rPr>
-                <w:rFonts w:ascii="Times New Roman" w:hAnsi="Times New Roman" w:eastAsia="Times New Roman"/>
+                <w:rFonts w:ascii="Times New Roman" w:hAnsi="Times New Roman" w:eastAsia="Times New Roman" w:cs="Times New Roman"/>
                 <w:b w:val="0"/>
-                <w:sz w:val="22"/>
+                <w:i w:val="0"/>
+                <w:color w:val="000000"/>
+                <w:sz w:val="24"/>
               </w:rPr>
               <w:t>A0 / A3</w:t>
             </w:r>
@@ -4555,8 +4793,7 @@
         </w:tc>
         <w:tc>
           <w:tcPr>
-            <w:tcW w:type="dxa" w:w="1984"/>
-            <w:shd w:val="nil"/>
+            <w:tcW w:type="dxa" w:w="1757"/>
             <w:vAlign w:val="center"/>
             <w:tcMar>
               <w:top w:w="80" w:type="dxa"/>
@@ -4568,16 +4805,18 @@
           <w:p>
             <w:pPr>
               <w:keepNext w:val="0"/>
-              <w:keepLines w:val="0"/>
+              <w:keepLines/>
               <w:spacing w:before="0" w:after="0" w:line="240" w:lineRule="auto"/>
               <w:ind w:left="0" w:right="0" w:firstLine="0"/>
               <w:jc w:val="left"/>
             </w:pPr>
             <w:r>
               <w:rPr>
-                <w:rFonts w:ascii="Times New Roman" w:hAnsi="Times New Roman" w:eastAsia="Times New Roman"/>
+                <w:rFonts w:ascii="Times New Roman" w:hAnsi="Times New Roman" w:eastAsia="Times New Roman" w:cs="Times New Roman"/>
                 <w:b w:val="0"/>
-                <w:sz w:val="22"/>
+                <w:i w:val="0"/>
+                <w:color w:val="000000"/>
+                <w:sz w:val="24"/>
               </w:rPr>
               <w:t>Протокол проверки</w:t>
             </w:r>
@@ -4585,8 +4824,7 @@
         </w:tc>
         <w:tc>
           <w:tcPr>
-            <w:tcW w:type="dxa" w:w="1928"/>
-            <w:shd w:val="nil"/>
+            <w:tcW w:type="dxa" w:w="1984"/>
             <w:vAlign w:val="center"/>
             <w:tcMar>
               <w:top w:w="80" w:type="dxa"/>
@@ -4598,16 +4836,18 @@
           <w:p>
             <w:pPr>
               <w:keepNext w:val="0"/>
-              <w:keepLines w:val="0"/>
+              <w:keepLines/>
               <w:spacing w:before="0" w:after="0" w:line="240" w:lineRule="auto"/>
               <w:ind w:left="0" w:right="0" w:firstLine="0"/>
               <w:jc w:val="left"/>
             </w:pPr>
             <w:r>
               <w:rPr>
-                <w:rFonts w:ascii="Times New Roman" w:hAnsi="Times New Roman" w:eastAsia="Times New Roman"/>
+                <w:rFonts w:ascii="Times New Roman" w:hAnsi="Times New Roman" w:eastAsia="Times New Roman" w:cs="Times New Roman"/>
                 <w:b w:val="0"/>
-                <w:sz w:val="22"/>
+                <w:i w:val="0"/>
+                <w:color w:val="000000"/>
+                <w:sz w:val="24"/>
               </w:rPr>
               <w:t>Проверить совместимость</w:t>
             </w:r>
@@ -4615,8 +4855,7 @@
         </w:tc>
         <w:tc>
           <w:tcPr>
-            <w:tcW w:type="dxa" w:w="1984"/>
-            <w:shd w:val="nil"/>
+            <w:tcW w:type="dxa" w:w="1814"/>
             <w:vAlign w:val="center"/>
             <w:tcMar>
               <w:top w:w="80" w:type="dxa"/>
@@ -4628,16 +4867,18 @@
           <w:p>
             <w:pPr>
               <w:keepNext w:val="0"/>
-              <w:keepLines w:val="0"/>
+              <w:keepLines/>
               <w:spacing w:before="0" w:after="0" w:line="240" w:lineRule="auto"/>
               <w:ind w:left="0" w:right="0" w:firstLine="0"/>
               <w:jc w:val="left"/>
             </w:pPr>
             <w:r>
               <w:rPr>
-                <w:rFonts w:ascii="Times New Roman" w:hAnsi="Times New Roman" w:eastAsia="Times New Roman"/>
+                <w:rFonts w:ascii="Times New Roman" w:hAnsi="Times New Roman" w:eastAsia="Times New Roman" w:cs="Times New Roman"/>
                 <w:b w:val="0"/>
-                <w:sz w:val="22"/>
+                <w:i w:val="0"/>
+                <w:color w:val="000000"/>
+                <w:sz w:val="24"/>
               </w:rPr>
               <w:t>ИС; технический специалист</w:t>
             </w:r>
@@ -4645,8 +4886,7 @@
         </w:tc>
         <w:tc>
           <w:tcPr>
-            <w:tcW w:type="dxa" w:w="1701"/>
-            <w:shd w:val="nil"/>
+            <w:tcW w:type="dxa" w:w="1361"/>
             <w:vAlign w:val="center"/>
             <w:tcMar>
               <w:top w:w="80" w:type="dxa"/>
@@ -4658,16 +4898,18 @@
           <w:p>
             <w:pPr>
               <w:keepNext w:val="0"/>
-              <w:keepLines w:val="0"/>
+              <w:keepLines/>
               <w:spacing w:before="0" w:after="0" w:line="240" w:lineRule="auto"/>
               <w:ind w:left="0" w:right="0" w:firstLine="0"/>
               <w:jc w:val="left"/>
             </w:pPr>
             <w:r>
               <w:rPr>
-                <w:rFonts w:ascii="Times New Roman" w:hAnsi="Times New Roman" w:eastAsia="Times New Roman"/>
+                <w:rFonts w:ascii="Times New Roman" w:hAnsi="Times New Roman" w:eastAsia="Times New Roman" w:cs="Times New Roman"/>
                 <w:b w:val="0"/>
-                <w:sz w:val="22"/>
+                <w:i w:val="0"/>
+                <w:color w:val="000000"/>
+                <w:sz w:val="24"/>
               </w:rPr>
               <w:t>При изменении BOM</w:t>
             </w:r>
@@ -4675,8 +4917,7 @@
         </w:tc>
         <w:tc>
           <w:tcPr>
-            <w:tcW w:type="dxa" w:w="2268"/>
-            <w:shd w:val="nil"/>
+            <w:tcW w:type="dxa" w:w="2154"/>
             <w:vAlign w:val="center"/>
             <w:tcMar>
               <w:top w:w="80" w:type="dxa"/>
@@ -4688,16 +4929,18 @@
           <w:p>
             <w:pPr>
               <w:keepNext w:val="0"/>
-              <w:keepLines w:val="0"/>
+              <w:keepLines/>
               <w:spacing w:before="0" w:after="0" w:line="240" w:lineRule="auto"/>
               <w:ind w:left="0" w:right="0" w:firstLine="0"/>
               <w:jc w:val="left"/>
             </w:pPr>
             <w:r>
               <w:rPr>
-                <w:rFonts w:ascii="Times New Roman" w:hAnsi="Times New Roman" w:eastAsia="Times New Roman"/>
+                <w:rFonts w:ascii="Times New Roman" w:hAnsi="Times New Roman" w:eastAsia="Times New Roman" w:cs="Times New Roman"/>
                 <w:b w:val="0"/>
-                <w:sz w:val="22"/>
+                <w:i w:val="0"/>
+                <w:color w:val="000000"/>
+                <w:sz w:val="24"/>
               </w:rPr>
               <w:t>Версия BOM; правила совместимости</w:t>
             </w:r>
@@ -4705,8 +4948,7 @@
         </w:tc>
         <w:tc>
           <w:tcPr>
-            <w:tcW w:type="dxa" w:w="1814"/>
-            <w:shd w:val="nil"/>
+            <w:tcW w:type="dxa" w:w="1701"/>
             <w:vAlign w:val="center"/>
             <w:tcMar>
               <w:top w:w="80" w:type="dxa"/>
@@ -4718,16 +4960,18 @@
           <w:p>
             <w:pPr>
               <w:keepNext w:val="0"/>
-              <w:keepLines w:val="0"/>
+              <w:keepLines/>
               <w:spacing w:before="0" w:after="0" w:line="240" w:lineRule="auto"/>
               <w:ind w:left="0" w:right="0" w:firstLine="0"/>
               <w:jc w:val="left"/>
             </w:pPr>
             <w:r>
               <w:rPr>
-                <w:rFonts w:ascii="Times New Roman" w:hAnsi="Times New Roman" w:eastAsia="Times New Roman"/>
+                <w:rFonts w:ascii="Times New Roman" w:hAnsi="Times New Roman" w:eastAsia="Times New Roman" w:cs="Times New Roman"/>
                 <w:b w:val="0"/>
-                <w:sz w:val="22"/>
+                <w:i w:val="0"/>
+                <w:color w:val="000000"/>
+                <w:sz w:val="24"/>
               </w:rPr>
               <w:t>Журнал проверок</w:t>
             </w:r>
@@ -4735,8 +4979,7 @@
         </w:tc>
         <w:tc>
           <w:tcPr>
-            <w:tcW w:type="dxa" w:w="1814"/>
-            <w:shd w:val="nil"/>
+            <w:tcW w:type="dxa" w:w="2551"/>
             <w:vAlign w:val="center"/>
             <w:tcMar>
               <w:top w:w="80" w:type="dxa"/>
@@ -4748,16 +4991,18 @@
           <w:p>
             <w:pPr>
               <w:keepNext w:val="0"/>
-              <w:keepLines w:val="0"/>
+              <w:keepLines/>
               <w:spacing w:before="0" w:after="0" w:line="240" w:lineRule="auto"/>
               <w:ind w:left="0" w:right="0" w:firstLine="0"/>
               <w:jc w:val="left"/>
             </w:pPr>
             <w:r>
               <w:rPr>
-                <w:rFonts w:ascii="Times New Roman" w:hAnsi="Times New Roman" w:eastAsia="Times New Roman"/>
+                <w:rFonts w:ascii="Times New Roman" w:hAnsi="Times New Roman" w:eastAsia="Times New Roman" w:cs="Times New Roman"/>
                 <w:b w:val="0"/>
-                <w:sz w:val="22"/>
+                <w:i w:val="0"/>
+                <w:color w:val="000000"/>
+                <w:sz w:val="24"/>
               </w:rPr>
               <w:t>Конфликты возвращаются в A2</w:t>
             </w:r>
@@ -4770,8 +5015,7 @@
         </w:trPr>
         <w:tc>
           <w:tcPr>
-            <w:tcW w:type="dxa" w:w="1247"/>
-            <w:shd w:val="nil"/>
+            <w:tcW w:type="dxa" w:w="964"/>
             <w:vAlign w:val="center"/>
             <w:tcMar>
               <w:top w:w="80" w:type="dxa"/>
@@ -4783,16 +5027,18 @@
           <w:p>
             <w:pPr>
               <w:keepNext w:val="0"/>
-              <w:keepLines w:val="0"/>
+              <w:keepLines/>
               <w:spacing w:before="0" w:after="0" w:line="240" w:lineRule="auto"/>
               <w:ind w:left="0" w:right="0" w:firstLine="0"/>
               <w:jc w:val="center"/>
             </w:pPr>
             <w:r>
               <w:rPr>
-                <w:rFonts w:ascii="Times New Roman" w:hAnsi="Times New Roman" w:eastAsia="Times New Roman"/>
+                <w:rFonts w:ascii="Times New Roman" w:hAnsi="Times New Roman" w:eastAsia="Times New Roman" w:cs="Times New Roman"/>
                 <w:b w:val="0"/>
-                <w:sz w:val="22"/>
+                <w:i w:val="0"/>
+                <w:color w:val="000000"/>
+                <w:sz w:val="24"/>
               </w:rPr>
               <w:t>A0 / A4</w:t>
             </w:r>
@@ -4800,8 +5046,7 @@
         </w:tc>
         <w:tc>
           <w:tcPr>
-            <w:tcW w:type="dxa" w:w="1984"/>
-            <w:shd w:val="nil"/>
+            <w:tcW w:type="dxa" w:w="1757"/>
             <w:vAlign w:val="center"/>
             <w:tcMar>
               <w:top w:w="80" w:type="dxa"/>
@@ -4813,16 +5058,18 @@
           <w:p>
             <w:pPr>
               <w:keepNext w:val="0"/>
-              <w:keepLines w:val="0"/>
+              <w:keepLines/>
               <w:spacing w:before="0" w:after="0" w:line="240" w:lineRule="auto"/>
               <w:ind w:left="0" w:right="0" w:firstLine="0"/>
               <w:jc w:val="left"/>
             </w:pPr>
             <w:r>
               <w:rPr>
-                <w:rFonts w:ascii="Times New Roman" w:hAnsi="Times New Roman" w:eastAsia="Times New Roman"/>
+                <w:rFonts w:ascii="Times New Roman" w:hAnsi="Times New Roman" w:eastAsia="Times New Roman" w:cs="Times New Roman"/>
                 <w:b w:val="0"/>
-                <w:sz w:val="22"/>
+                <w:i w:val="0"/>
+                <w:color w:val="000000"/>
+                <w:sz w:val="24"/>
               </w:rPr>
               <w:t>Цена, вес, изображения</w:t>
             </w:r>
@@ -4830,8 +5077,7 @@
         </w:tc>
         <w:tc>
           <w:tcPr>
-            <w:tcW w:type="dxa" w:w="1928"/>
-            <w:shd w:val="nil"/>
+            <w:tcW w:type="dxa" w:w="1984"/>
             <w:vAlign w:val="center"/>
             <w:tcMar>
               <w:top w:w="80" w:type="dxa"/>
@@ -4843,16 +5089,18 @@
           <w:p>
             <w:pPr>
               <w:keepNext w:val="0"/>
-              <w:keepLines w:val="0"/>
+              <w:keepLines/>
               <w:spacing w:before="0" w:after="0" w:line="240" w:lineRule="auto"/>
               <w:ind w:left="0" w:right="0" w:firstLine="0"/>
               <w:jc w:val="left"/>
             </w:pPr>
             <w:r>
               <w:rPr>
-                <w:rFonts w:ascii="Times New Roman" w:hAnsi="Times New Roman" w:eastAsia="Times New Roman"/>
+                <w:rFonts w:ascii="Times New Roman" w:hAnsi="Times New Roman" w:eastAsia="Times New Roman" w:cs="Times New Roman"/>
                 <w:b w:val="0"/>
-                <w:sz w:val="22"/>
+                <w:i w:val="0"/>
+                <w:color w:val="000000"/>
+                <w:sz w:val="24"/>
               </w:rPr>
               <w:t>Рассчитать и подготовить контент</w:t>
             </w:r>
@@ -4860,8 +5108,7 @@
         </w:tc>
         <w:tc>
           <w:tcPr>
-            <w:tcW w:type="dxa" w:w="1984"/>
-            <w:shd w:val="nil"/>
+            <w:tcW w:type="dxa" w:w="1814"/>
             <w:vAlign w:val="center"/>
             <w:tcMar>
               <w:top w:w="80" w:type="dxa"/>
@@ -4873,16 +5120,18 @@
           <w:p>
             <w:pPr>
               <w:keepNext w:val="0"/>
-              <w:keepLines w:val="0"/>
+              <w:keepLines/>
               <w:spacing w:before="0" w:after="0" w:line="240" w:lineRule="auto"/>
               <w:ind w:left="0" w:right="0" w:firstLine="0"/>
               <w:jc w:val="left"/>
             </w:pPr>
             <w:r>
               <w:rPr>
-                <w:rFonts w:ascii="Times New Roman" w:hAnsi="Times New Roman" w:eastAsia="Times New Roman"/>
+                <w:rFonts w:ascii="Times New Roman" w:hAnsi="Times New Roman" w:eastAsia="Times New Roman" w:cs="Times New Roman"/>
                 <w:b w:val="0"/>
-                <w:sz w:val="22"/>
+                <w:i w:val="0"/>
+                <w:color w:val="000000"/>
+                <w:sz w:val="24"/>
               </w:rPr>
               <w:t>ИС; дизайнер</w:t>
             </w:r>
@@ -4890,8 +5139,7 @@
         </w:tc>
         <w:tc>
           <w:tcPr>
-            <w:tcW w:type="dxa" w:w="1701"/>
-            <w:shd w:val="nil"/>
+            <w:tcW w:type="dxa" w:w="1361"/>
             <w:vAlign w:val="center"/>
             <w:tcMar>
               <w:top w:w="80" w:type="dxa"/>
@@ -4903,16 +5151,18 @@
           <w:p>
             <w:pPr>
               <w:keepNext w:val="0"/>
-              <w:keepLines w:val="0"/>
+              <w:keepLines/>
               <w:spacing w:before="0" w:after="0" w:line="240" w:lineRule="auto"/>
               <w:ind w:left="0" w:right="0" w:firstLine="0"/>
               <w:jc w:val="left"/>
             </w:pPr>
             <w:r>
               <w:rPr>
-                <w:rFonts w:ascii="Times New Roman" w:hAnsi="Times New Roman" w:eastAsia="Times New Roman"/>
+                <w:rFonts w:ascii="Times New Roman" w:hAnsi="Times New Roman" w:eastAsia="Times New Roman" w:cs="Times New Roman"/>
                 <w:b w:val="0"/>
-                <w:sz w:val="22"/>
+                <w:i w:val="0"/>
+                <w:color w:val="000000"/>
+                <w:sz w:val="24"/>
               </w:rPr>
               <w:t>После успешной проверки</w:t>
             </w:r>
@@ -4920,8 +5170,7 @@
         </w:tc>
         <w:tc>
           <w:tcPr>
-            <w:tcW w:type="dxa" w:w="2268"/>
-            <w:shd w:val="nil"/>
+            <w:tcW w:type="dxa" w:w="2154"/>
             <w:vAlign w:val="center"/>
             <w:tcMar>
               <w:top w:w="80" w:type="dxa"/>
@@ -4933,16 +5182,18 @@
           <w:p>
             <w:pPr>
               <w:keepNext w:val="0"/>
-              <w:keepLines w:val="0"/>
+              <w:keepLines/>
               <w:spacing w:before="0" w:after="0" w:line="240" w:lineRule="auto"/>
               <w:ind w:left="0" w:right="0" w:firstLine="0"/>
               <w:jc w:val="left"/>
             </w:pPr>
             <w:r>
               <w:rPr>
-                <w:rFonts w:ascii="Times New Roman" w:hAnsi="Times New Roman" w:eastAsia="Times New Roman"/>
+                <w:rFonts w:ascii="Times New Roman" w:hAnsi="Times New Roman" w:eastAsia="Times New Roman" w:cs="Times New Roman"/>
                 <w:b w:val="0"/>
-                <w:sz w:val="22"/>
+                <w:i w:val="0"/>
+                <w:color w:val="000000"/>
+                <w:sz w:val="24"/>
               </w:rPr>
               <w:t>BOM; цены; правила веса; шаблоны</w:t>
             </w:r>
@@ -4950,8 +5201,7 @@
         </w:tc>
         <w:tc>
           <w:tcPr>
-            <w:tcW w:type="dxa" w:w="1814"/>
-            <w:shd w:val="nil"/>
+            <w:tcW w:type="dxa" w:w="1701"/>
             <w:vAlign w:val="center"/>
             <w:tcMar>
               <w:top w:w="80" w:type="dxa"/>
@@ -4963,16 +5213,18 @@
           <w:p>
             <w:pPr>
               <w:keepNext w:val="0"/>
-              <w:keepLines w:val="0"/>
+              <w:keepLines/>
               <w:spacing w:before="0" w:after="0" w:line="240" w:lineRule="auto"/>
               <w:ind w:left="0" w:right="0" w:firstLine="0"/>
               <w:jc w:val="left"/>
             </w:pPr>
             <w:r>
               <w:rPr>
-                <w:rFonts w:ascii="Times New Roman" w:hAnsi="Times New Roman" w:eastAsia="Times New Roman"/>
+                <w:rFonts w:ascii="Times New Roman" w:hAnsi="Times New Roman" w:eastAsia="Times New Roman" w:cs="Times New Roman"/>
                 <w:b w:val="0"/>
-                <w:sz w:val="22"/>
+                <w:i w:val="0"/>
+                <w:color w:val="000000"/>
+                <w:sz w:val="24"/>
               </w:rPr>
               <w:t>Реестр карточек</w:t>
             </w:r>
@@ -4980,8 +5232,7 @@
         </w:tc>
         <w:tc>
           <w:tcPr>
-            <w:tcW w:type="dxa" w:w="1814"/>
-            <w:shd w:val="nil"/>
+            <w:tcW w:type="dxa" w:w="2551"/>
             <w:vAlign w:val="center"/>
             <w:tcMar>
               <w:top w:w="80" w:type="dxa"/>
@@ -4993,16 +5244,18 @@
           <w:p>
             <w:pPr>
               <w:keepNext w:val="0"/>
-              <w:keepLines w:val="0"/>
+              <w:keepLines/>
               <w:spacing w:before="0" w:after="0" w:line="240" w:lineRule="auto"/>
               <w:ind w:left="0" w:right="0" w:firstLine="0"/>
               <w:jc w:val="left"/>
             </w:pPr>
             <w:r>
               <w:rPr>
-                <w:rFonts w:ascii="Times New Roman" w:hAnsi="Times New Roman" w:eastAsia="Times New Roman"/>
+                <w:rFonts w:ascii="Times New Roman" w:hAnsi="Times New Roman" w:eastAsia="Times New Roman" w:cs="Times New Roman"/>
                 <w:b w:val="0"/>
-                <w:sz w:val="22"/>
+                <w:i w:val="0"/>
+                <w:color w:val="000000"/>
+                <w:sz w:val="24"/>
               </w:rPr>
               <w:t>Изменение цены помечает карточку</w:t>
             </w:r>
@@ -5015,8 +5268,7 @@
         </w:trPr>
         <w:tc>
           <w:tcPr>
-            <w:tcW w:type="dxa" w:w="1247"/>
-            <w:shd w:val="nil"/>
+            <w:tcW w:type="dxa" w:w="964"/>
             <w:vAlign w:val="center"/>
             <w:tcMar>
               <w:top w:w="80" w:type="dxa"/>
@@ -5028,16 +5280,18 @@
           <w:p>
             <w:pPr>
               <w:keepNext w:val="0"/>
-              <w:keepLines w:val="0"/>
+              <w:keepLines/>
               <w:spacing w:before="0" w:after="0" w:line="240" w:lineRule="auto"/>
               <w:ind w:left="0" w:right="0" w:firstLine="0"/>
               <w:jc w:val="center"/>
             </w:pPr>
             <w:r>
               <w:rPr>
-                <w:rFonts w:ascii="Times New Roman" w:hAnsi="Times New Roman" w:eastAsia="Times New Roman"/>
+                <w:rFonts w:ascii="Times New Roman" w:hAnsi="Times New Roman" w:eastAsia="Times New Roman" w:cs="Times New Roman"/>
                 <w:b w:val="0"/>
-                <w:sz w:val="22"/>
+                <w:i w:val="0"/>
+                <w:color w:val="000000"/>
+                <w:sz w:val="24"/>
               </w:rPr>
               <w:t>A0 / A5</w:t>
             </w:r>
@@ -5045,8 +5299,7 @@
         </w:tc>
         <w:tc>
           <w:tcPr>
-            <w:tcW w:type="dxa" w:w="1984"/>
-            <w:shd w:val="nil"/>
+            <w:tcW w:type="dxa" w:w="1757"/>
             <w:vAlign w:val="center"/>
             <w:tcMar>
               <w:top w:w="80" w:type="dxa"/>
@@ -5058,16 +5311,18 @@
           <w:p>
             <w:pPr>
               <w:keepNext w:val="0"/>
-              <w:keepLines w:val="0"/>
+              <w:keepLines/>
               <w:spacing w:before="0" w:after="0" w:line="240" w:lineRule="auto"/>
               <w:ind w:left="0" w:right="0" w:firstLine="0"/>
               <w:jc w:val="left"/>
             </w:pPr>
             <w:r>
               <w:rPr>
-                <w:rFonts w:ascii="Times New Roman" w:hAnsi="Times New Roman" w:eastAsia="Times New Roman"/>
+                <w:rFonts w:ascii="Times New Roman" w:hAnsi="Times New Roman" w:eastAsia="Times New Roman" w:cs="Times New Roman"/>
                 <w:b w:val="0"/>
-                <w:sz w:val="22"/>
+                <w:i w:val="0"/>
+                <w:color w:val="000000"/>
+                <w:sz w:val="24"/>
               </w:rPr>
               <w:t>Публикация</w:t>
             </w:r>
@@ -5075,8 +5330,7 @@
         </w:tc>
         <w:tc>
           <w:tcPr>
-            <w:tcW w:type="dxa" w:w="1928"/>
-            <w:shd w:val="nil"/>
+            <w:tcW w:type="dxa" w:w="1984"/>
             <w:vAlign w:val="center"/>
             <w:tcMar>
               <w:top w:w="80" w:type="dxa"/>
@@ -5088,16 +5342,18 @@
           <w:p>
             <w:pPr>
               <w:keepNext w:val="0"/>
-              <w:keepLines w:val="0"/>
+              <w:keepLines/>
               <w:spacing w:before="0" w:after="0" w:line="240" w:lineRule="auto"/>
               <w:ind w:left="0" w:right="0" w:firstLine="0"/>
               <w:jc w:val="left"/>
             </w:pPr>
             <w:r>
               <w:rPr>
-                <w:rFonts w:ascii="Times New Roman" w:hAnsi="Times New Roman" w:eastAsia="Times New Roman"/>
+                <w:rFonts w:ascii="Times New Roman" w:hAnsi="Times New Roman" w:eastAsia="Times New Roman" w:cs="Times New Roman"/>
                 <w:b w:val="0"/>
-                <w:sz w:val="22"/>
+                <w:i w:val="0"/>
+                <w:color w:val="000000"/>
+                <w:sz w:val="24"/>
               </w:rPr>
               <w:t>Проверить и опубликовать</w:t>
             </w:r>
@@ -5105,8 +5361,7 @@
         </w:tc>
         <w:tc>
           <w:tcPr>
-            <w:tcW w:type="dxa" w:w="1984"/>
-            <w:shd w:val="nil"/>
+            <w:tcW w:type="dxa" w:w="1814"/>
             <w:vAlign w:val="center"/>
             <w:tcMar>
               <w:top w:w="80" w:type="dxa"/>
@@ -5118,16 +5373,18 @@
           <w:p>
             <w:pPr>
               <w:keepNext w:val="0"/>
-              <w:keepLines w:val="0"/>
+              <w:keepLines/>
               <w:spacing w:before="0" w:after="0" w:line="240" w:lineRule="auto"/>
               <w:ind w:left="0" w:right="0" w:firstLine="0"/>
               <w:jc w:val="left"/>
             </w:pPr>
             <w:r>
               <w:rPr>
-                <w:rFonts w:ascii="Times New Roman" w:hAnsi="Times New Roman" w:eastAsia="Times New Roman"/>
+                <w:rFonts w:ascii="Times New Roman" w:hAnsi="Times New Roman" w:eastAsia="Times New Roman" w:cs="Times New Roman"/>
                 <w:b w:val="0"/>
-                <w:sz w:val="22"/>
+                <w:i w:val="0"/>
+                <w:color w:val="000000"/>
+                <w:sz w:val="24"/>
               </w:rPr>
               <w:t>Менеджер маркетплейсов</w:t>
             </w:r>
@@ -5135,8 +5392,7 @@
         </w:tc>
         <w:tc>
           <w:tcPr>
-            <w:tcW w:type="dxa" w:w="1701"/>
-            <w:shd w:val="nil"/>
+            <w:tcW w:type="dxa" w:w="1361"/>
             <w:vAlign w:val="center"/>
             <w:tcMar>
               <w:top w:w="80" w:type="dxa"/>
@@ -5148,16 +5404,18 @@
           <w:p>
             <w:pPr>
               <w:keepNext w:val="0"/>
-              <w:keepLines w:val="0"/>
+              <w:keepLines/>
               <w:spacing w:before="0" w:after="0" w:line="240" w:lineRule="auto"/>
               <w:ind w:left="0" w:right="0" w:firstLine="0"/>
               <w:jc w:val="left"/>
             </w:pPr>
             <w:r>
               <w:rPr>
-                <w:rFonts w:ascii="Times New Roman" w:hAnsi="Times New Roman" w:eastAsia="Times New Roman"/>
+                <w:rFonts w:ascii="Times New Roman" w:hAnsi="Times New Roman" w:eastAsia="Times New Roman" w:cs="Times New Roman"/>
                 <w:b w:val="0"/>
-                <w:sz w:val="22"/>
+                <w:i w:val="0"/>
+                <w:color w:val="000000"/>
+                <w:sz w:val="24"/>
               </w:rPr>
               <w:t>По готовности карточки</w:t>
             </w:r>
@@ -5165,8 +5423,7 @@
         </w:tc>
         <w:tc>
           <w:tcPr>
-            <w:tcW w:type="dxa" w:w="2268"/>
-            <w:shd w:val="nil"/>
+            <w:tcW w:type="dxa" w:w="2154"/>
             <w:vAlign w:val="center"/>
             <w:tcMar>
               <w:top w:w="80" w:type="dxa"/>
@@ -5178,16 +5435,18 @@
           <w:p>
             <w:pPr>
               <w:keepNext w:val="0"/>
-              <w:keepLines w:val="0"/>
+              <w:keepLines/>
               <w:spacing w:before="0" w:after="0" w:line="240" w:lineRule="auto"/>
               <w:ind w:left="0" w:right="0" w:firstLine="0"/>
               <w:jc w:val="left"/>
             </w:pPr>
             <w:r>
               <w:rPr>
-                <w:rFonts w:ascii="Times New Roman" w:hAnsi="Times New Roman" w:eastAsia="Times New Roman"/>
+                <w:rFonts w:ascii="Times New Roman" w:hAnsi="Times New Roman" w:eastAsia="Times New Roman" w:cs="Times New Roman"/>
                 <w:b w:val="0"/>
-                <w:sz w:val="22"/>
+                <w:i w:val="0"/>
+                <w:color w:val="000000"/>
+                <w:sz w:val="24"/>
               </w:rPr>
               <w:t>Предварительная карточка; требования Ozon</w:t>
             </w:r>
@@ -5195,8 +5454,7 @@
         </w:tc>
         <w:tc>
           <w:tcPr>
-            <w:tcW w:type="dxa" w:w="1814"/>
-            <w:shd w:val="nil"/>
+            <w:tcW w:type="dxa" w:w="1701"/>
             <w:vAlign w:val="center"/>
             <w:tcMar>
               <w:top w:w="80" w:type="dxa"/>
@@ -5208,16 +5466,18 @@
           <w:p>
             <w:pPr>
               <w:keepNext w:val="0"/>
-              <w:keepLines w:val="0"/>
+              <w:keepLines/>
               <w:spacing w:before="0" w:after="0" w:line="240" w:lineRule="auto"/>
               <w:ind w:left="0" w:right="0" w:firstLine="0"/>
               <w:jc w:val="left"/>
             </w:pPr>
             <w:r>
               <w:rPr>
-                <w:rFonts w:ascii="Times New Roman" w:hAnsi="Times New Roman" w:eastAsia="Times New Roman"/>
+                <w:rFonts w:ascii="Times New Roman" w:hAnsi="Times New Roman" w:eastAsia="Times New Roman" w:cs="Times New Roman"/>
                 <w:b w:val="0"/>
-                <w:sz w:val="22"/>
+                <w:i w:val="0"/>
+                <w:color w:val="000000"/>
+                <w:sz w:val="24"/>
               </w:rPr>
               <w:t>Журнал публикаций</w:t>
             </w:r>
@@ -5225,8 +5485,7 @@
         </w:tc>
         <w:tc>
           <w:tcPr>
-            <w:tcW w:type="dxa" w:w="1814"/>
-            <w:shd w:val="nil"/>
+            <w:tcW w:type="dxa" w:w="2551"/>
             <w:vAlign w:val="center"/>
             <w:tcMar>
               <w:top w:w="80" w:type="dxa"/>
@@ -5238,18 +5497,20 @@
           <w:p>
             <w:pPr>
               <w:keepNext w:val="0"/>
-              <w:keepLines w:val="0"/>
+              <w:keepLines/>
               <w:spacing w:before="0" w:after="0" w:line="240" w:lineRule="auto"/>
               <w:ind w:left="0" w:right="0" w:firstLine="0"/>
               <w:jc w:val="left"/>
             </w:pPr>
             <w:r>
               <w:rPr>
-                <w:rFonts w:ascii="Times New Roman" w:hAnsi="Times New Roman" w:eastAsia="Times New Roman"/>
+                <w:rFonts w:ascii="Times New Roman" w:hAnsi="Times New Roman" w:eastAsia="Times New Roman" w:cs="Times New Roman"/>
                 <w:b w:val="0"/>
-                <w:sz w:val="22"/>
+                <w:i w:val="0"/>
+                <w:color w:val="000000"/>
+                <w:sz w:val="24"/>
               </w:rPr>
-              <w:t>Ошибка помещается в очередь</w:t>
+              <w:t>Временный подтверждённый отказ — ограниченный повтор; ошибка данных — исправление; неизвестный исход — сверка</w:t>
             </w:r>
           </w:p>
         </w:tc>
@@ -5257,6 +5518,12 @@
     </w:tbl>
     <w:p>
       <w:pPr>
+        <w:keepNext w:val="0"/>
+        <w:keepLines w:val="0"/>
+        <w:widowControl/>
+        <w:spacing w:before="0" w:after="0" w:line="20" w:lineRule="exact"/>
+        <w:ind w:left="0" w:right="0" w:firstLine="0"/>
+        <w:jc w:val="both"/>
         <w:sectPr>
           <w:headerReference w:type="default" r:id="rId26"/>
           <w:footerReference w:type="default" r:id="rId27"/>
@@ -5273,14 +5540,17 @@
         <w:pStyle w:val="1"/>
         <w:keepNext/>
         <w:keepLines/>
+        <w:widowControl/>
         <w:spacing w:before="240" w:after="120" w:line="360" w:lineRule="auto"/>
         <w:ind w:left="0" w:right="0" w:firstLine="0"/>
         <w:jc w:val="center"/>
       </w:pPr>
       <w:r>
         <w:rPr>
-          <w:rFonts w:ascii="Times New Roman" w:hAnsi="Times New Roman" w:eastAsia="Times New Roman"/>
+          <w:rFonts w:ascii="Times New Roman" w:hAnsi="Times New Roman" w:eastAsia="Times New Roman" w:cs="Times New Roman"/>
           <w:b/>
+          <w:i w:val="0"/>
+          <w:color w:val="000000"/>
           <w:sz w:val="28"/>
         </w:rPr>
         <w:t>3 Вывод</w:t>
@@ -5288,6 +5558,8 @@
     </w:p>
     <w:p>
       <w:pPr>
+        <w:keepNext w:val="0"/>
+        <w:keepLines w:val="0"/>
         <w:widowControl/>
         <w:spacing w:before="0" w:after="0" w:line="360" w:lineRule="auto"/>
         <w:ind w:left="0" w:right="0" w:firstLine="709"/>
@@ -5295,7 +5567,10 @@
       </w:pPr>
       <w:r>
         <w:rPr>
-          <w:rFonts w:ascii="Times New Roman" w:hAnsi="Times New Roman" w:eastAsia="Times New Roman"/>
+          <w:rFonts w:ascii="Times New Roman" w:hAnsi="Times New Roman" w:eastAsia="Times New Roman" w:cs="Times New Roman"/>
+          <w:b w:val="0"/>
+          <w:i w:val="0"/>
+          <w:color w:val="000000"/>
           <w:sz w:val="28"/>
         </w:rPr>
         <w:t>В ходе практической работы выделены основные бизнес-процессы ИС формирования и актуализации карточек товаров. Построены контекстная диаграмма A-0, декомпозиция A0 и детализация A2. Модель показывает последовательное преобразование запроса в согласованную версию BOM, проверенную карточку и результат публикации в Ozon.</w:t>
@@ -5303,6 +5578,8 @@
     </w:p>
     <w:p>
       <w:pPr>
+        <w:keepNext w:val="0"/>
+        <w:keepLines w:val="0"/>
         <w:widowControl/>
         <w:spacing w:before="0" w:after="0" w:line="360" w:lineRule="auto"/>
         <w:ind w:left="0" w:right="0" w:firstLine="709"/>
@@ -5310,7 +5587,10 @@
       </w:pPr>
       <w:r>
         <w:rPr>
-          <w:rFonts w:ascii="Times New Roman" w:hAnsi="Times New Roman" w:eastAsia="Times New Roman"/>
+          <w:rFonts w:ascii="Times New Roman" w:hAnsi="Times New Roman" w:eastAsia="Times New Roman" w:cs="Times New Roman"/>
+          <w:b w:val="0"/>
+          <w:i w:val="0"/>
+          <w:color w:val="000000"/>
           <w:sz w:val="28"/>
         </w:rPr>
         <w:t>Формализация операций позволила уточнить границы ответственности: менеджер маркетплейсов управляет жизненным циклом карточки, технический специалист отвечает за BOM и совместимость, дизайнер – за шаблоны и качество изображений, а администратор – за доступ и интеграции. Полученная модель может использоваться как основа для уточнения функциональных требований и проектирования предметно-ориентированной ИС.</w:t>
@@ -5321,14 +5601,17 @@
         <w:pStyle w:val="1"/>
         <w:keepNext/>
         <w:keepLines/>
+        <w:widowControl/>
         <w:spacing w:before="240" w:after="120" w:line="360" w:lineRule="auto"/>
         <w:ind w:left="0" w:right="0" w:firstLine="0"/>
         <w:jc w:val="center"/>
       </w:pPr>
       <w:r>
         <w:rPr>
-          <w:rFonts w:ascii="Times New Roman" w:hAnsi="Times New Roman" w:eastAsia="Times New Roman"/>
+          <w:rFonts w:ascii="Times New Roman" w:hAnsi="Times New Roman" w:eastAsia="Times New Roman" w:cs="Times New Roman"/>
           <w:b/>
+          <w:i w:val="0"/>
+          <w:color w:val="000000"/>
           <w:sz w:val="28"/>
         </w:rPr>
         <w:t>СПИСОК ИСПОЛЬЗОВАННЫХ ИСТОЧНИКОВ</w:t>
@@ -5336,6 +5619,8 @@
     </w:p>
     <w:p>
       <w:pPr>
+        <w:keepNext w:val="0"/>
+        <w:keepLines w:val="0"/>
         <w:widowControl/>
         <w:spacing w:before="0" w:after="0" w:line="360" w:lineRule="auto"/>
         <w:ind w:left="0" w:right="0" w:firstLine="709"/>
@@ -5343,7 +5628,10 @@
       </w:pPr>
       <w:r>
         <w:rPr>
-          <w:rFonts w:ascii="Times New Roman" w:hAnsi="Times New Roman" w:eastAsia="Times New Roman"/>
+          <w:rFonts w:ascii="Times New Roman" w:hAnsi="Times New Roman" w:eastAsia="Times New Roman" w:cs="Times New Roman"/>
+          <w:b w:val="0"/>
+          <w:i w:val="0"/>
+          <w:color w:val="000000"/>
           <w:sz w:val="28"/>
         </w:rPr>
         <w:t>1. Проектирование предметно-ориентированных информационных систем. Практическая работа № 2.</w:t>
@@ -5351,6 +5639,8 @@
     </w:p>
     <w:p>
       <w:pPr>
+        <w:keepNext w:val="0"/>
+        <w:keepLines w:val="0"/>
         <w:widowControl/>
         <w:spacing w:before="0" w:after="0" w:line="360" w:lineRule="auto"/>
         <w:ind w:left="0" w:right="0" w:firstLine="709"/>
@@ -5358,7 +5648,10 @@
       </w:pPr>
       <w:r>
         <w:rPr>
-          <w:rFonts w:ascii="Times New Roman" w:hAnsi="Times New Roman" w:eastAsia="Times New Roman"/>
+          <w:rFonts w:ascii="Times New Roman" w:hAnsi="Times New Roman" w:eastAsia="Times New Roman" w:cs="Times New Roman"/>
+          <w:b w:val="0"/>
+          <w:i w:val="0"/>
+          <w:color w:val="000000"/>
           <w:sz w:val="28"/>
         </w:rPr>
         <w:t>2. Албахтин И.В. Реинжиниринг бизнес-процесса «Сопровождение заказов на поставку компьютерных систем» в ООО «Юкомс». Курсовая работа. Москва, 2026.</w:t>
@@ -5366,6 +5659,8 @@
     </w:p>
     <w:p>
       <w:pPr>
+        <w:keepNext w:val="0"/>
+        <w:keepLines w:val="0"/>
         <w:widowControl/>
         <w:spacing w:before="0" w:after="0" w:line="360" w:lineRule="auto"/>
         <w:ind w:left="0" w:right="0" w:firstLine="709"/>
@@ -5373,7 +5668,10 @@
       </w:pPr>
       <w:r>
         <w:rPr>
-          <w:rFonts w:ascii="Times New Roman" w:hAnsi="Times New Roman" w:eastAsia="Times New Roman"/>
+          <w:rFonts w:ascii="Times New Roman" w:hAnsi="Times New Roman" w:eastAsia="Times New Roman" w:cs="Times New Roman"/>
+          <w:b w:val="0"/>
+          <w:i w:val="0"/>
+          <w:color w:val="000000"/>
           <w:sz w:val="28"/>
         </w:rPr>
         <w:t>3. Отчёт по практической работе № 1 по дисциплине «Проектирование предметно-ориентированных информационных систем».</w:t>

</xml_diff>